<commit_message>
Math T5 itération 6 : pédagogie facilitatrice visuelle + MÉTHODES D'OR (9 fiches) + corrigés enrichis
- S1 Nombres : mots-nombres T3 (pièges 70/80/90), tableau CDU 4 classes, cache, écrire droite→gauche / lire gauche→droite
- Preuve par 9 en croix (× et ÷) : fig + leçon S4 + exemples corrigés
- Division posée en potence verticale pas à pas (127÷5) + règle d'or du reste
- Nouvelle partie MÉTHODES D'OR avant les examens : 9 fiches illustrées (résoudre un problème, lire les grands nombres, bien poser, croix par 9, division, fractions, durées, intervalles, checklist CEPE)
- Corrigés des 20 sujets Problèmes : question cachée + mots-indices + opérations choisies ; preuve par 9 dans les corrigés Opérations
- Fmg→Ariary (savais-tu masse) ; docx final 18,5 Mo

Co-authored-by: arena-agent <297053741+arena-agent@users.noreply.github.com>
</commit_message>
<xml_diff>
--- a/manuel-math-t5/Manuel_Mathematiques_T5_EXAMENS.docx
+++ b/manuel-math-t5/Manuel_Mathematiques_T5_EXAMENS.docx
@@ -582,6 +582,26 @@
     </w:p>
     <w:p>
       <w:pPr>
+        <w:spacing w:after="60" w:line="300"/>
+        <w:ind w:left="360"/>
+        <w:jc w:val="left"/>
+      </w:pPr>
+      <w:r>
+        <w:rPr>
+          <w:rFonts w:ascii="Times New Roman" w:cs="Times New Roman" w:eastAsia="Times New Roman" w:hAnsi="Times New Roman"/>
+          <w:b w:val="false"/>
+          <w:bCs w:val="false"/>
+          <w:i w:val="false"/>
+          <w:iCs w:val="false"/>
+          <w:color w:val="000000"/>
+          <w:sz w:val="24"/>
+          <w:szCs w:val="24"/>
+        </w:rPr>
+        <w:t xml:space="preserve">Preuve par 9 (croix) : 335 → 2 ; 26 → 8 ; 2 × 8 = 7, et 8 710 → 7 ✓</w:t>
+      </w:r>
+    </w:p>
+    <w:p>
+      <w:pPr>
         <w:spacing w:after="40" w:line="300"/>
         <w:jc w:val="left"/>
       </w:pPr>
@@ -657,6 +677,26 @@
           <w:szCs w:val="24"/>
         </w:rPr>
         <w:t xml:space="preserve">Vérification : 12 × 66 + 1 = 792 + 1 = 793 ✓ (le reste 1 est bien plus petit que 12).</w:t>
+      </w:r>
+    </w:p>
+    <w:p>
+      <w:pPr>
+        <w:spacing w:after="60" w:line="300"/>
+        <w:ind w:left="360"/>
+        <w:jc w:val="left"/>
+      </w:pPr>
+      <w:r>
+        <w:rPr>
+          <w:rFonts w:ascii="Times New Roman" w:cs="Times New Roman" w:eastAsia="Times New Roman" w:hAnsi="Times New Roman"/>
+          <w:b w:val="false"/>
+          <w:bCs w:val="false"/>
+          <w:i w:val="false"/>
+          <w:iCs w:val="false"/>
+          <w:color w:val="000000"/>
+          <w:sz w:val="24"/>
+          <w:szCs w:val="24"/>
+        </w:rPr>
+        <w:t xml:space="preserve">Croix de la preuve par 9 : H 3 × B 3 + reste 1 → 1, comme 793 → 1 ✓</w:t>
       </w:r>
     </w:p>
     <w:p>
@@ -1350,6 +1390,26 @@
     </w:p>
     <w:p>
       <w:pPr>
+        <w:spacing w:after="60" w:line="300"/>
+        <w:ind w:left="360"/>
+        <w:jc w:val="left"/>
+      </w:pPr>
+      <w:r>
+        <w:rPr>
+          <w:rFonts w:ascii="Times New Roman" w:cs="Times New Roman" w:eastAsia="Times New Roman" w:hAnsi="Times New Roman"/>
+          <w:b w:val="false"/>
+          <w:bCs w:val="false"/>
+          <w:i w:val="false"/>
+          <w:iCs w:val="false"/>
+          <w:color w:val="000000"/>
+          <w:sz w:val="24"/>
+          <w:szCs w:val="24"/>
+        </w:rPr>
+        <w:t xml:space="preserve">Preuve par 9 (croix) : 693 → 9 ; 94 → 4 ; 9 × 4 = 9, et 65 142 → 9 ✓</w:t>
+      </w:r>
+    </w:p>
+    <w:p>
+      <w:pPr>
         <w:spacing w:after="40" w:line="300"/>
         <w:jc w:val="left"/>
       </w:pPr>
@@ -1425,6 +1485,26 @@
           <w:szCs w:val="24"/>
         </w:rPr>
         <w:t xml:space="preserve">Vérification : 24 × 64 + 15 = 1 536 + 15 = 1 551 ✓ (le reste 15 est bien plus petit que 24).</w:t>
+      </w:r>
+    </w:p>
+    <w:p>
+      <w:pPr>
+        <w:spacing w:after="60" w:line="300"/>
+        <w:ind w:left="360"/>
+        <w:jc w:val="left"/>
+      </w:pPr>
+      <w:r>
+        <w:rPr>
+          <w:rFonts w:ascii="Times New Roman" w:cs="Times New Roman" w:eastAsia="Times New Roman" w:hAnsi="Times New Roman"/>
+          <w:b w:val="false"/>
+          <w:bCs w:val="false"/>
+          <w:i w:val="false"/>
+          <w:iCs w:val="false"/>
+          <w:color w:val="000000"/>
+          <w:sz w:val="24"/>
+          <w:szCs w:val="24"/>
+        </w:rPr>
+        <w:t xml:space="preserve">Croix de la preuve par 9 : H 6 × B 1 + reste 15 → 3, comme 1 551 → 3 ✓</w:t>
       </w:r>
     </w:p>
     <w:p>
@@ -2172,6 +2252,26 @@
     </w:p>
     <w:p>
       <w:pPr>
+        <w:spacing w:after="60" w:line="300"/>
+        <w:ind w:left="360"/>
+        <w:jc w:val="left"/>
+      </w:pPr>
+      <w:r>
+        <w:rPr>
+          <w:rFonts w:ascii="Times New Roman" w:cs="Times New Roman" w:eastAsia="Times New Roman" w:hAnsi="Times New Roman"/>
+          <w:b w:val="false"/>
+          <w:bCs w:val="false"/>
+          <w:i w:val="false"/>
+          <w:iCs w:val="false"/>
+          <w:color w:val="000000"/>
+          <w:sz w:val="24"/>
+          <w:szCs w:val="24"/>
+        </w:rPr>
+        <w:t xml:space="preserve">Preuve par 9 (croix) : 881 → 8 ; 73 → 1 ; 8 × 1 = 8, et 64 313 → 8 ✓</w:t>
+      </w:r>
+    </w:p>
+    <w:p>
+      <w:pPr>
         <w:spacing w:after="40" w:line="300"/>
         <w:jc w:val="left"/>
       </w:pPr>
@@ -2247,6 +2347,26 @@
           <w:szCs w:val="24"/>
         </w:rPr>
         <w:t xml:space="preserve">Vérification : 35 × 59 + 33 = 2 065 + 33 = 2 098 ✓ (le reste 33 est bien plus petit que 35).</w:t>
+      </w:r>
+    </w:p>
+    <w:p>
+      <w:pPr>
+        <w:spacing w:after="60" w:line="300"/>
+        <w:ind w:left="360"/>
+        <w:jc w:val="left"/>
+      </w:pPr>
+      <w:r>
+        <w:rPr>
+          <w:rFonts w:ascii="Times New Roman" w:cs="Times New Roman" w:eastAsia="Times New Roman" w:hAnsi="Times New Roman"/>
+          <w:b w:val="false"/>
+          <w:bCs w:val="false"/>
+          <w:i w:val="false"/>
+          <w:iCs w:val="false"/>
+          <w:color w:val="000000"/>
+          <w:sz w:val="24"/>
+          <w:szCs w:val="24"/>
+        </w:rPr>
+        <w:t xml:space="preserve">Croix de la preuve par 9 : H 8 × B 5 + reste 33 → 1, comme 2 098 → 1 ✓</w:t>
       </w:r>
     </w:p>
     <w:p>
@@ -2960,6 +3080,26 @@
     </w:p>
     <w:p>
       <w:pPr>
+        <w:spacing w:after="60" w:line="300"/>
+        <w:ind w:left="360"/>
+        <w:jc w:val="left"/>
+      </w:pPr>
+      <w:r>
+        <w:rPr>
+          <w:rFonts w:ascii="Times New Roman" w:cs="Times New Roman" w:eastAsia="Times New Roman" w:hAnsi="Times New Roman"/>
+          <w:b w:val="false"/>
+          <w:bCs w:val="false"/>
+          <w:i w:val="false"/>
+          <w:iCs w:val="false"/>
+          <w:color w:val="000000"/>
+          <w:sz w:val="24"/>
+          <w:szCs w:val="24"/>
+        </w:rPr>
+        <w:t xml:space="preserve">Preuve par 9 (croix) : 382 → 4 ; 72 → 9 ; 4 × 9 = 9, et 27 504 → 9 ✓</w:t>
+      </w:r>
+    </w:p>
+    <w:p>
+      <w:pPr>
         <w:spacing w:after="40" w:line="300"/>
         <w:jc w:val="left"/>
       </w:pPr>
@@ -3035,6 +3175,26 @@
           <w:szCs w:val="24"/>
         </w:rPr>
         <w:t xml:space="preserve">Vérification : 42 × 31 + 41 = 1 302 + 41 = 1 343 ✓ (le reste 41 est bien plus petit que 42).</w:t>
+      </w:r>
+    </w:p>
+    <w:p>
+      <w:pPr>
+        <w:spacing w:after="60" w:line="300"/>
+        <w:ind w:left="360"/>
+        <w:jc w:val="left"/>
+      </w:pPr>
+      <w:r>
+        <w:rPr>
+          <w:rFonts w:ascii="Times New Roman" w:cs="Times New Roman" w:eastAsia="Times New Roman" w:hAnsi="Times New Roman"/>
+          <w:b w:val="false"/>
+          <w:bCs w:val="false"/>
+          <w:i w:val="false"/>
+          <w:iCs w:val="false"/>
+          <w:color w:val="000000"/>
+          <w:sz w:val="24"/>
+          <w:szCs w:val="24"/>
+        </w:rPr>
+        <w:t xml:space="preserve">Croix de la preuve par 9 : H 6 × B 4 + reste 41 → 2, comme 1 343 → 2 ✓</w:t>
       </w:r>
     </w:p>
     <w:p>
@@ -3755,6 +3915,26 @@
     </w:p>
     <w:p>
       <w:pPr>
+        <w:spacing w:after="60" w:line="300"/>
+        <w:ind w:left="360"/>
+        <w:jc w:val="left"/>
+      </w:pPr>
+      <w:r>
+        <w:rPr>
+          <w:rFonts w:ascii="Times New Roman" w:cs="Times New Roman" w:eastAsia="Times New Roman" w:hAnsi="Times New Roman"/>
+          <w:b w:val="false"/>
+          <w:bCs w:val="false"/>
+          <w:i w:val="false"/>
+          <w:iCs w:val="false"/>
+          <w:color w:val="000000"/>
+          <w:sz w:val="24"/>
+          <w:szCs w:val="24"/>
+        </w:rPr>
+        <w:t xml:space="preserve">Preuve par 9 (croix) : 648 → 9 ; 77 → 5 ; 9 × 5 = 9, et 49 896 → 9 ✓</w:t>
+      </w:r>
+    </w:p>
+    <w:p>
+      <w:pPr>
         <w:spacing w:after="40" w:line="300"/>
         <w:jc w:val="left"/>
       </w:pPr>
@@ -3830,6 +4010,26 @@
           <w:szCs w:val="24"/>
         </w:rPr>
         <w:t xml:space="preserve">Vérification : 22 × 42 + 10 = 924 + 10 = 934 ✓ (le reste 10 est bien plus petit que 22).</w:t>
+      </w:r>
+    </w:p>
+    <w:p>
+      <w:pPr>
+        <w:spacing w:after="60" w:line="300"/>
+        <w:ind w:left="360"/>
+        <w:jc w:val="left"/>
+      </w:pPr>
+      <w:r>
+        <w:rPr>
+          <w:rFonts w:ascii="Times New Roman" w:cs="Times New Roman" w:eastAsia="Times New Roman" w:hAnsi="Times New Roman"/>
+          <w:b w:val="false"/>
+          <w:bCs w:val="false"/>
+          <w:i w:val="false"/>
+          <w:iCs w:val="false"/>
+          <w:color w:val="000000"/>
+          <w:sz w:val="24"/>
+          <w:szCs w:val="24"/>
+        </w:rPr>
+        <w:t xml:space="preserve">Croix de la preuve par 9 : H 4 × B 6 + reste 10 → 7, comme 934 → 7 ✓</w:t>
       </w:r>
     </w:p>
     <w:p>
@@ -4523,6 +4723,26 @@
     </w:p>
     <w:p>
       <w:pPr>
+        <w:spacing w:after="60" w:line="300"/>
+        <w:ind w:left="360"/>
+        <w:jc w:val="left"/>
+      </w:pPr>
+      <w:r>
+        <w:rPr>
+          <w:rFonts w:ascii="Times New Roman" w:cs="Times New Roman" w:eastAsia="Times New Roman" w:hAnsi="Times New Roman"/>
+          <w:b w:val="false"/>
+          <w:bCs w:val="false"/>
+          <w:i w:val="false"/>
+          <w:iCs w:val="false"/>
+          <w:color w:val="000000"/>
+          <w:sz w:val="24"/>
+          <w:szCs w:val="24"/>
+        </w:rPr>
+        <w:t xml:space="preserve">Preuve par 9 (croix) : 899 → 8 ; 85 → 4 ; 8 × 4 = 5, et 76 415 → 5 ✓</w:t>
+      </w:r>
+    </w:p>
+    <w:p>
+      <w:pPr>
         <w:spacing w:after="40" w:line="300"/>
         <w:jc w:val="left"/>
       </w:pPr>
@@ -4598,6 +4818,26 @@
           <w:szCs w:val="24"/>
         </w:rPr>
         <w:t xml:space="preserve">Vérification : 39 × 78 + 37 = 3 042 + 37 = 3 079 ✓ (le reste 37 est bien plus petit que 39).</w:t>
+      </w:r>
+    </w:p>
+    <w:p>
+      <w:pPr>
+        <w:spacing w:after="60" w:line="300"/>
+        <w:ind w:left="360"/>
+        <w:jc w:val="left"/>
+      </w:pPr>
+      <w:r>
+        <w:rPr>
+          <w:rFonts w:ascii="Times New Roman" w:cs="Times New Roman" w:eastAsia="Times New Roman" w:hAnsi="Times New Roman"/>
+          <w:b w:val="false"/>
+          <w:bCs w:val="false"/>
+          <w:i w:val="false"/>
+          <w:iCs w:val="false"/>
+          <w:color w:val="000000"/>
+          <w:sz w:val="24"/>
+          <w:szCs w:val="24"/>
+        </w:rPr>
+        <w:t xml:space="preserve">Croix de la preuve par 9 : H 3 × B 6 + reste 37 → 1, comme 3 079 → 1 ✓</w:t>
       </w:r>
     </w:p>
     <w:p>
@@ -5345,6 +5585,26 @@
     </w:p>
     <w:p>
       <w:pPr>
+        <w:spacing w:after="60" w:line="300"/>
+        <w:ind w:left="360"/>
+        <w:jc w:val="left"/>
+      </w:pPr>
+      <w:r>
+        <w:rPr>
+          <w:rFonts w:ascii="Times New Roman" w:cs="Times New Roman" w:eastAsia="Times New Roman" w:hAnsi="Times New Roman"/>
+          <w:b w:val="false"/>
+          <w:bCs w:val="false"/>
+          <w:i w:val="false"/>
+          <w:iCs w:val="false"/>
+          <w:color w:val="000000"/>
+          <w:sz w:val="24"/>
+          <w:szCs w:val="24"/>
+        </w:rPr>
+        <w:t xml:space="preserve">Preuve par 9 (croix) : 283 → 4 ; 32 → 5 ; 4 × 5 = 2, et 9 056 → 2 ✓</w:t>
+      </w:r>
+    </w:p>
+    <w:p>
+      <w:pPr>
         <w:spacing w:after="40" w:line="300"/>
         <w:jc w:val="left"/>
       </w:pPr>
@@ -5420,6 +5680,26 @@
           <w:szCs w:val="24"/>
         </w:rPr>
         <w:t xml:space="preserve">Vérification : 20 × 43 + 11 = 860 + 11 = 871 ✓ (le reste 11 est bien plus petit que 20).</w:t>
+      </w:r>
+    </w:p>
+    <w:p>
+      <w:pPr>
+        <w:spacing w:after="60" w:line="300"/>
+        <w:ind w:left="360"/>
+        <w:jc w:val="left"/>
+      </w:pPr>
+      <w:r>
+        <w:rPr>
+          <w:rFonts w:ascii="Times New Roman" w:cs="Times New Roman" w:eastAsia="Times New Roman" w:hAnsi="Times New Roman"/>
+          <w:b w:val="false"/>
+          <w:bCs w:val="false"/>
+          <w:i w:val="false"/>
+          <w:iCs w:val="false"/>
+          <w:color w:val="000000"/>
+          <w:sz w:val="24"/>
+          <w:szCs w:val="24"/>
+        </w:rPr>
+        <w:t xml:space="preserve">Croix de la preuve par 9 : H 2 × B 7 + reste 11 → 7, comme 871 → 7 ✓</w:t>
       </w:r>
     </w:p>
     <w:p>
@@ -6133,6 +6413,26 @@
     </w:p>
     <w:p>
       <w:pPr>
+        <w:spacing w:after="60" w:line="300"/>
+        <w:ind w:left="360"/>
+        <w:jc w:val="left"/>
+      </w:pPr>
+      <w:r>
+        <w:rPr>
+          <w:rFonts w:ascii="Times New Roman" w:cs="Times New Roman" w:eastAsia="Times New Roman" w:hAnsi="Times New Roman"/>
+          <w:b w:val="false"/>
+          <w:bCs w:val="false"/>
+          <w:i w:val="false"/>
+          <w:iCs w:val="false"/>
+          <w:color w:val="000000"/>
+          <w:sz w:val="24"/>
+          <w:szCs w:val="24"/>
+        </w:rPr>
+        <w:t xml:space="preserve">Preuve par 9 (croix) : 807 → 6 ; 41 → 5 ; 6 × 5 = 3, et 33 087 → 3 ✓</w:t>
+      </w:r>
+    </w:p>
+    <w:p>
+      <w:pPr>
         <w:spacing w:after="40" w:line="300"/>
         <w:jc w:val="left"/>
       </w:pPr>
@@ -6208,6 +6508,26 @@
           <w:szCs w:val="24"/>
         </w:rPr>
         <w:t xml:space="preserve">Vérification : 42 × 77 + 2 = 3 234 + 2 = 3 236 ✓ (le reste 2 est bien plus petit que 42).</w:t>
+      </w:r>
+    </w:p>
+    <w:p>
+      <w:pPr>
+        <w:spacing w:after="60" w:line="300"/>
+        <w:ind w:left="360"/>
+        <w:jc w:val="left"/>
+      </w:pPr>
+      <w:r>
+        <w:rPr>
+          <w:rFonts w:ascii="Times New Roman" w:cs="Times New Roman" w:eastAsia="Times New Roman" w:hAnsi="Times New Roman"/>
+          <w:b w:val="false"/>
+          <w:bCs w:val="false"/>
+          <w:i w:val="false"/>
+          <w:iCs w:val="false"/>
+          <w:color w:val="000000"/>
+          <w:sz w:val="24"/>
+          <w:szCs w:val="24"/>
+        </w:rPr>
+        <w:t xml:space="preserve">Croix de la preuve par 9 : H 6 × B 5 + reste 2 → 5, comme 3 236 → 5 ✓</w:t>
       </w:r>
     </w:p>
     <w:p>
@@ -6928,6 +7248,26 @@
     </w:p>
     <w:p>
       <w:pPr>
+        <w:spacing w:after="60" w:line="300"/>
+        <w:ind w:left="360"/>
+        <w:jc w:val="left"/>
+      </w:pPr>
+      <w:r>
+        <w:rPr>
+          <w:rFonts w:ascii="Times New Roman" w:cs="Times New Roman" w:eastAsia="Times New Roman" w:hAnsi="Times New Roman"/>
+          <w:b w:val="false"/>
+          <w:bCs w:val="false"/>
+          <w:i w:val="false"/>
+          <w:iCs w:val="false"/>
+          <w:color w:val="000000"/>
+          <w:sz w:val="24"/>
+          <w:szCs w:val="24"/>
+        </w:rPr>
+        <w:t xml:space="preserve">Preuve par 9 (croix) : 428 → 5 ; 51 → 6 ; 5 × 6 = 3, et 21 828 → 3 ✓</w:t>
+      </w:r>
+    </w:p>
+    <w:p>
+      <w:pPr>
         <w:spacing w:after="40" w:line="300"/>
         <w:jc w:val="left"/>
       </w:pPr>
@@ -7003,6 +7343,26 @@
           <w:szCs w:val="24"/>
         </w:rPr>
         <w:t xml:space="preserve">Vérification : 38 × 32 + 30 = 1 216 + 30 = 1 246 ✓ (le reste 30 est bien plus petit que 38).</w:t>
+      </w:r>
+    </w:p>
+    <w:p>
+      <w:pPr>
+        <w:spacing w:after="60" w:line="300"/>
+        <w:ind w:left="360"/>
+        <w:jc w:val="left"/>
+      </w:pPr>
+      <w:r>
+        <w:rPr>
+          <w:rFonts w:ascii="Times New Roman" w:cs="Times New Roman" w:eastAsia="Times New Roman" w:hAnsi="Times New Roman"/>
+          <w:b w:val="false"/>
+          <w:bCs w:val="false"/>
+          <w:i w:val="false"/>
+          <w:iCs w:val="false"/>
+          <w:color w:val="000000"/>
+          <w:sz w:val="24"/>
+          <w:szCs w:val="24"/>
+        </w:rPr>
+        <w:t xml:space="preserve">Croix de la preuve par 9 : H 2 × B 5 + reste 30 → 4, comme 1 246 → 4 ✓</w:t>
       </w:r>
     </w:p>
     <w:p>
@@ -7696,6 +8056,26 @@
     </w:p>
     <w:p>
       <w:pPr>
+        <w:spacing w:after="60" w:line="300"/>
+        <w:ind w:left="360"/>
+        <w:jc w:val="left"/>
+      </w:pPr>
+      <w:r>
+        <w:rPr>
+          <w:rFonts w:ascii="Times New Roman" w:cs="Times New Roman" w:eastAsia="Times New Roman" w:hAnsi="Times New Roman"/>
+          <w:b w:val="false"/>
+          <w:bCs w:val="false"/>
+          <w:i w:val="false"/>
+          <w:iCs w:val="false"/>
+          <w:color w:val="000000"/>
+          <w:sz w:val="24"/>
+          <w:szCs w:val="24"/>
+        </w:rPr>
+        <w:t xml:space="preserve">Preuve par 9 (croix) : 733 → 4 ; 90 → 9 ; 4 × 9 = 9, et 65 970 → 9 ✓</w:t>
+      </w:r>
+    </w:p>
+    <w:p>
+      <w:pPr>
         <w:spacing w:after="40" w:line="300"/>
         <w:jc w:val="left"/>
       </w:pPr>
@@ -7771,6 +8151,26 @@
           <w:szCs w:val="24"/>
         </w:rPr>
         <w:t xml:space="preserve">Vérification : 16 × 47 + 8 = 752 + 8 = 760 ✓ (le reste 8 est bien plus petit que 16).</w:t>
+      </w:r>
+    </w:p>
+    <w:p>
+      <w:pPr>
+        <w:spacing w:after="60" w:line="300"/>
+        <w:ind w:left="360"/>
+        <w:jc w:val="left"/>
+      </w:pPr>
+      <w:r>
+        <w:rPr>
+          <w:rFonts w:ascii="Times New Roman" w:cs="Times New Roman" w:eastAsia="Times New Roman" w:hAnsi="Times New Roman"/>
+          <w:b w:val="false"/>
+          <w:bCs w:val="false"/>
+          <w:i w:val="false"/>
+          <w:iCs w:val="false"/>
+          <w:color w:val="000000"/>
+          <w:sz w:val="24"/>
+          <w:szCs w:val="24"/>
+        </w:rPr>
+        <w:t xml:space="preserve">Croix de la preuve par 9 : H 7 × B 2 + reste 8 → 4, comme 760 → 4 ✓</w:t>
       </w:r>
     </w:p>
     <w:p>
@@ -8518,6 +8918,26 @@
     </w:p>
     <w:p>
       <w:pPr>
+        <w:spacing w:after="60" w:line="300"/>
+        <w:ind w:left="360"/>
+        <w:jc w:val="left"/>
+      </w:pPr>
+      <w:r>
+        <w:rPr>
+          <w:rFonts w:ascii="Times New Roman" w:cs="Times New Roman" w:eastAsia="Times New Roman" w:hAnsi="Times New Roman"/>
+          <w:b w:val="false"/>
+          <w:bCs w:val="false"/>
+          <w:i w:val="false"/>
+          <w:iCs w:val="false"/>
+          <w:color w:val="000000"/>
+          <w:sz w:val="24"/>
+          <w:szCs w:val="24"/>
+        </w:rPr>
+        <w:t xml:space="preserve">Preuve par 9 (croix) : 902 → 2 ; 54 → 9 ; 2 × 9 = 9, et 48 708 → 9 ✓</w:t>
+      </w:r>
+    </w:p>
+    <w:p>
+      <w:pPr>
         <w:spacing w:after="40" w:line="300"/>
         <w:jc w:val="left"/>
       </w:pPr>
@@ -8593,6 +9013,26 @@
           <w:szCs w:val="24"/>
         </w:rPr>
         <w:t xml:space="preserve">Vérification : 24 × 88 + 19 = 2 112 + 19 = 2 131 ✓ (le reste 19 est bien plus petit que 24).</w:t>
+      </w:r>
+    </w:p>
+    <w:p>
+      <w:pPr>
+        <w:spacing w:after="60" w:line="300"/>
+        <w:ind w:left="360"/>
+        <w:jc w:val="left"/>
+      </w:pPr>
+      <w:r>
+        <w:rPr>
+          <w:rFonts w:ascii="Times New Roman" w:cs="Times New Roman" w:eastAsia="Times New Roman" w:hAnsi="Times New Roman"/>
+          <w:b w:val="false"/>
+          <w:bCs w:val="false"/>
+          <w:i w:val="false"/>
+          <w:iCs w:val="false"/>
+          <w:color w:val="000000"/>
+          <w:sz w:val="24"/>
+          <w:szCs w:val="24"/>
+        </w:rPr>
+        <w:t xml:space="preserve">Croix de la preuve par 9 : H 6 × B 7 + reste 19 → 7, comme 2 131 → 7 ✓</w:t>
       </w:r>
     </w:p>
     <w:p>
@@ -9306,6 +9746,26 @@
     </w:p>
     <w:p>
       <w:pPr>
+        <w:spacing w:after="60" w:line="300"/>
+        <w:ind w:left="360"/>
+        <w:jc w:val="left"/>
+      </w:pPr>
+      <w:r>
+        <w:rPr>
+          <w:rFonts w:ascii="Times New Roman" w:cs="Times New Roman" w:eastAsia="Times New Roman" w:hAnsi="Times New Roman"/>
+          <w:b w:val="false"/>
+          <w:bCs w:val="false"/>
+          <w:i w:val="false"/>
+          <w:iCs w:val="false"/>
+          <w:color w:val="000000"/>
+          <w:sz w:val="24"/>
+          <w:szCs w:val="24"/>
+        </w:rPr>
+        <w:t xml:space="preserve">Preuve par 9 (croix) : 957 → 3 ; 87 → 6 ; 3 × 6 = 9, et 83 259 → 9 ✓</w:t>
+      </w:r>
+    </w:p>
+    <w:p>
+      <w:pPr>
         <w:spacing w:after="40" w:line="300"/>
         <w:jc w:val="left"/>
       </w:pPr>
@@ -9381,6 +9841,26 @@
           <w:szCs w:val="24"/>
         </w:rPr>
         <w:t xml:space="preserve">Vérification : 20 × 38 + 14 = 760 + 14 = 774 ✓ (le reste 14 est bien plus petit que 20).</w:t>
+      </w:r>
+    </w:p>
+    <w:p>
+      <w:pPr>
+        <w:spacing w:after="60" w:line="300"/>
+        <w:ind w:left="360"/>
+        <w:jc w:val="left"/>
+      </w:pPr>
+      <w:r>
+        <w:rPr>
+          <w:rFonts w:ascii="Times New Roman" w:cs="Times New Roman" w:eastAsia="Times New Roman" w:hAnsi="Times New Roman"/>
+          <w:b w:val="false"/>
+          <w:bCs w:val="false"/>
+          <w:i w:val="false"/>
+          <w:iCs w:val="false"/>
+          <w:color w:val="000000"/>
+          <w:sz w:val="24"/>
+          <w:szCs w:val="24"/>
+        </w:rPr>
+        <w:t xml:space="preserve">Croix de la preuve par 9 : H 2 × B 2 + reste 14 → 9, comme 774 → 9 ✓</w:t>
       </w:r>
     </w:p>
     <w:p>
@@ -10101,6 +10581,26 @@
     </w:p>
     <w:p>
       <w:pPr>
+        <w:spacing w:after="60" w:line="300"/>
+        <w:ind w:left="360"/>
+        <w:jc w:val="left"/>
+      </w:pPr>
+      <w:r>
+        <w:rPr>
+          <w:rFonts w:ascii="Times New Roman" w:cs="Times New Roman" w:eastAsia="Times New Roman" w:hAnsi="Times New Roman"/>
+          <w:b w:val="false"/>
+          <w:bCs w:val="false"/>
+          <w:i w:val="false"/>
+          <w:iCs w:val="false"/>
+          <w:color w:val="000000"/>
+          <w:sz w:val="24"/>
+          <w:szCs w:val="24"/>
+        </w:rPr>
+        <w:t xml:space="preserve">Preuve par 9 (croix) : 381 → 3 ; 96 → 6 ; 3 × 6 = 9, et 36 576 → 9 ✓</w:t>
+      </w:r>
+    </w:p>
+    <w:p>
+      <w:pPr>
         <w:spacing w:after="40" w:line="300"/>
         <w:jc w:val="left"/>
       </w:pPr>
@@ -10176,6 +10676,26 @@
           <w:szCs w:val="24"/>
         </w:rPr>
         <w:t xml:space="preserve">Vérification : 15 × 60 + 14 = 900 + 14 = 914 ✓ (le reste 14 est bien plus petit que 15).</w:t>
+      </w:r>
+    </w:p>
+    <w:p>
+      <w:pPr>
+        <w:spacing w:after="60" w:line="300"/>
+        <w:ind w:left="360"/>
+        <w:jc w:val="left"/>
+      </w:pPr>
+      <w:r>
+        <w:rPr>
+          <w:rFonts w:ascii="Times New Roman" w:cs="Times New Roman" w:eastAsia="Times New Roman" w:hAnsi="Times New Roman"/>
+          <w:b w:val="false"/>
+          <w:bCs w:val="false"/>
+          <w:i w:val="false"/>
+          <w:iCs w:val="false"/>
+          <w:color w:val="000000"/>
+          <w:sz w:val="24"/>
+          <w:szCs w:val="24"/>
+        </w:rPr>
+        <w:t xml:space="preserve">Croix de la preuve par 9 : H 6 × B 6 + reste 14 → 5, comme 914 → 5 ✓</w:t>
       </w:r>
     </w:p>
     <w:p>
@@ -10869,6 +11389,26 @@
     </w:p>
     <w:p>
       <w:pPr>
+        <w:spacing w:after="60" w:line="300"/>
+        <w:ind w:left="360"/>
+        <w:jc w:val="left"/>
+      </w:pPr>
+      <w:r>
+        <w:rPr>
+          <w:rFonts w:ascii="Times New Roman" w:cs="Times New Roman" w:eastAsia="Times New Roman" w:hAnsi="Times New Roman"/>
+          <w:b w:val="false"/>
+          <w:bCs w:val="false"/>
+          <w:i w:val="false"/>
+          <w:iCs w:val="false"/>
+          <w:color w:val="000000"/>
+          <w:sz w:val="24"/>
+          <w:szCs w:val="24"/>
+        </w:rPr>
+        <w:t xml:space="preserve">Preuve par 9 (croix) : 262 → 1 ; 80 → 8 ; 1 × 8 = 8, et 20 960 → 8 ✓</w:t>
+      </w:r>
+    </w:p>
+    <w:p>
+      <w:pPr>
         <w:spacing w:after="40" w:line="300"/>
         <w:jc w:val="left"/>
       </w:pPr>
@@ -10944,6 +11484,26 @@
           <w:szCs w:val="24"/>
         </w:rPr>
         <w:t xml:space="preserve">Vérification : 20 × 94 + 11 = 1 880 + 11 = 1 891 ✓ (le reste 11 est bien plus petit que 20).</w:t>
+      </w:r>
+    </w:p>
+    <w:p>
+      <w:pPr>
+        <w:spacing w:after="60" w:line="300"/>
+        <w:ind w:left="360"/>
+        <w:jc w:val="left"/>
+      </w:pPr>
+      <w:r>
+        <w:rPr>
+          <w:rFonts w:ascii="Times New Roman" w:cs="Times New Roman" w:eastAsia="Times New Roman" w:hAnsi="Times New Roman"/>
+          <w:b w:val="false"/>
+          <w:bCs w:val="false"/>
+          <w:i w:val="false"/>
+          <w:iCs w:val="false"/>
+          <w:color w:val="000000"/>
+          <w:sz w:val="24"/>
+          <w:szCs w:val="24"/>
+        </w:rPr>
+        <w:t xml:space="preserve">Croix de la preuve par 9 : H 2 × B 4 + reste 11 → 1, comme 1 891 → 1 ✓</w:t>
       </w:r>
     </w:p>
     <w:p>
@@ -11691,6 +12251,26 @@
     </w:p>
     <w:p>
       <w:pPr>
+        <w:spacing w:after="60" w:line="300"/>
+        <w:ind w:left="360"/>
+        <w:jc w:val="left"/>
+      </w:pPr>
+      <w:r>
+        <w:rPr>
+          <w:rFonts w:ascii="Times New Roman" w:cs="Times New Roman" w:eastAsia="Times New Roman" w:hAnsi="Times New Roman"/>
+          <w:b w:val="false"/>
+          <w:bCs w:val="false"/>
+          <w:i w:val="false"/>
+          <w:iCs w:val="false"/>
+          <w:color w:val="000000"/>
+          <w:sz w:val="24"/>
+          <w:szCs w:val="24"/>
+        </w:rPr>
+        <w:t xml:space="preserve">Preuve par 9 (croix) : 889 → 7 ; 94 → 4 ; 7 × 4 = 1, et 83 566 → 1 ✓</w:t>
+      </w:r>
+    </w:p>
+    <w:p>
+      <w:pPr>
         <w:spacing w:after="40" w:line="300"/>
         <w:jc w:val="left"/>
       </w:pPr>
@@ -11766,6 +12346,26 @@
           <w:szCs w:val="24"/>
         </w:rPr>
         <w:t xml:space="preserve">Vérification : 18 × 75 + 7 = 1 350 + 7 = 1 357 ✓ (le reste 7 est bien plus petit que 18).</w:t>
+      </w:r>
+    </w:p>
+    <w:p>
+      <w:pPr>
+        <w:spacing w:after="60" w:line="300"/>
+        <w:ind w:left="360"/>
+        <w:jc w:val="left"/>
+      </w:pPr>
+      <w:r>
+        <w:rPr>
+          <w:rFonts w:ascii="Times New Roman" w:cs="Times New Roman" w:eastAsia="Times New Roman" w:hAnsi="Times New Roman"/>
+          <w:b w:val="false"/>
+          <w:bCs w:val="false"/>
+          <w:i w:val="false"/>
+          <w:iCs w:val="false"/>
+          <w:color w:val="000000"/>
+          <w:sz w:val="24"/>
+          <w:szCs w:val="24"/>
+        </w:rPr>
+        <w:t xml:space="preserve">Croix de la preuve par 9 : H 9 × B 3 + reste 7 → 7, comme 1 357 → 7 ✓</w:t>
       </w:r>
     </w:p>
     <w:p>
@@ -12479,6 +13079,26 @@
     </w:p>
     <w:p>
       <w:pPr>
+        <w:spacing w:after="60" w:line="300"/>
+        <w:ind w:left="360"/>
+        <w:jc w:val="left"/>
+      </w:pPr>
+      <w:r>
+        <w:rPr>
+          <w:rFonts w:ascii="Times New Roman" w:cs="Times New Roman" w:eastAsia="Times New Roman" w:hAnsi="Times New Roman"/>
+          <w:b w:val="false"/>
+          <w:bCs w:val="false"/>
+          <w:i w:val="false"/>
+          <w:iCs w:val="false"/>
+          <w:color w:val="000000"/>
+          <w:sz w:val="24"/>
+          <w:szCs w:val="24"/>
+        </w:rPr>
+        <w:t xml:space="preserve">Preuve par 9 (croix) : 448 → 7 ; 89 → 8 ; 7 × 8 = 2, et 39 872 → 2 ✓</w:t>
+      </w:r>
+    </w:p>
+    <w:p>
+      <w:pPr>
         <w:spacing w:after="40" w:line="300"/>
         <w:jc w:val="left"/>
       </w:pPr>
@@ -12554,6 +13174,26 @@
           <w:szCs w:val="24"/>
         </w:rPr>
         <w:t xml:space="preserve">Vérification : 15 × 37 + 11 = 555 + 11 = 566 ✓ (le reste 11 est bien plus petit que 15).</w:t>
+      </w:r>
+    </w:p>
+    <w:p>
+      <w:pPr>
+        <w:spacing w:after="60" w:line="300"/>
+        <w:ind w:left="360"/>
+        <w:jc w:val="left"/>
+      </w:pPr>
+      <w:r>
+        <w:rPr>
+          <w:rFonts w:ascii="Times New Roman" w:cs="Times New Roman" w:eastAsia="Times New Roman" w:hAnsi="Times New Roman"/>
+          <w:b w:val="false"/>
+          <w:bCs w:val="false"/>
+          <w:i w:val="false"/>
+          <w:iCs w:val="false"/>
+          <w:color w:val="000000"/>
+          <w:sz w:val="24"/>
+          <w:szCs w:val="24"/>
+        </w:rPr>
+        <w:t xml:space="preserve">Croix de la preuve par 9 : H 6 × B 1 + reste 11 → 8, comme 566 → 8 ✓</w:t>
       </w:r>
     </w:p>
     <w:p>
@@ -13200,6 +13840,26 @@
     </w:p>
     <w:p>
       <w:pPr>
+        <w:spacing w:after="60" w:line="300"/>
+        <w:ind w:left="360"/>
+        <w:jc w:val="left"/>
+      </w:pPr>
+      <w:r>
+        <w:rPr>
+          <w:rFonts w:ascii="Times New Roman" w:cs="Times New Roman" w:eastAsia="Times New Roman" w:hAnsi="Times New Roman"/>
+          <w:b w:val="false"/>
+          <w:bCs w:val="false"/>
+          <w:i w:val="false"/>
+          <w:iCs w:val="false"/>
+          <w:color w:val="000000"/>
+          <w:sz w:val="24"/>
+          <w:szCs w:val="24"/>
+        </w:rPr>
+        <w:t xml:space="preserve">Preuve par 9 (croix) : 334 → 1 ; 65 → 2 ; 1 × 2 = 2, et 21 710 → 2 ✓</w:t>
+      </w:r>
+    </w:p>
+    <w:p>
+      <w:pPr>
         <w:spacing w:after="40" w:line="300"/>
         <w:jc w:val="left"/>
       </w:pPr>
@@ -13275,6 +13935,26 @@
           <w:szCs w:val="24"/>
         </w:rPr>
         <w:t xml:space="preserve">Vérification : 45 × 23 + 18 = 1 035 + 18 = 1 053 ✓ (le reste 18 est bien plus petit que 45).</w:t>
+      </w:r>
+    </w:p>
+    <w:p>
+      <w:pPr>
+        <w:spacing w:after="60" w:line="300"/>
+        <w:ind w:left="360"/>
+        <w:jc w:val="left"/>
+      </w:pPr>
+      <w:r>
+        <w:rPr>
+          <w:rFonts w:ascii="Times New Roman" w:cs="Times New Roman" w:eastAsia="Times New Roman" w:hAnsi="Times New Roman"/>
+          <w:b w:val="false"/>
+          <w:bCs w:val="false"/>
+          <w:i w:val="false"/>
+          <w:iCs w:val="false"/>
+          <w:color w:val="000000"/>
+          <w:sz w:val="24"/>
+          <w:szCs w:val="24"/>
+        </w:rPr>
+        <w:t xml:space="preserve">Croix de la preuve par 9 : H 9 × B 5 + reste 18 → 9, comme 1 053 → 9 ✓</w:t>
       </w:r>
     </w:p>
     <w:p>
@@ -13968,6 +14648,26 @@
     </w:p>
     <w:p>
       <w:pPr>
+        <w:spacing w:after="60" w:line="300"/>
+        <w:ind w:left="360"/>
+        <w:jc w:val="left"/>
+      </w:pPr>
+      <w:r>
+        <w:rPr>
+          <w:rFonts w:ascii="Times New Roman" w:cs="Times New Roman" w:eastAsia="Times New Roman" w:hAnsi="Times New Roman"/>
+          <w:b w:val="false"/>
+          <w:bCs w:val="false"/>
+          <w:i w:val="false"/>
+          <w:iCs w:val="false"/>
+          <w:color w:val="000000"/>
+          <w:sz w:val="24"/>
+          <w:szCs w:val="24"/>
+        </w:rPr>
+        <w:t xml:space="preserve">Preuve par 9 (croix) : 628 → 7 ; 79 → 7 ; 7 × 7 = 4, et 49 612 → 4 ✓</w:t>
+      </w:r>
+    </w:p>
+    <w:p>
+      <w:pPr>
         <w:spacing w:after="40" w:line="300"/>
         <w:jc w:val="left"/>
       </w:pPr>
@@ -14043,6 +14743,26 @@
           <w:szCs w:val="24"/>
         </w:rPr>
         <w:t xml:space="preserve">Vérification : 35 × 41 + 7 = 1 435 + 7 = 1 442 ✓ (le reste 7 est bien plus petit que 35).</w:t>
+      </w:r>
+    </w:p>
+    <w:p>
+      <w:pPr>
+        <w:spacing w:after="60" w:line="300"/>
+        <w:ind w:left="360"/>
+        <w:jc w:val="left"/>
+      </w:pPr>
+      <w:r>
+        <w:rPr>
+          <w:rFonts w:ascii="Times New Roman" w:cs="Times New Roman" w:eastAsia="Times New Roman" w:hAnsi="Times New Roman"/>
+          <w:b w:val="false"/>
+          <w:bCs w:val="false"/>
+          <w:i w:val="false"/>
+          <w:iCs w:val="false"/>
+          <w:color w:val="000000"/>
+          <w:sz w:val="24"/>
+          <w:szCs w:val="24"/>
+        </w:rPr>
+        <w:t xml:space="preserve">Croix de la preuve par 9 : H 8 × B 5 + reste 7 → 2, comme 1 442 → 2 ✓</w:t>
       </w:r>
     </w:p>
     <w:p>
@@ -14790,6 +15510,26 @@
     </w:p>
     <w:p>
       <w:pPr>
+        <w:spacing w:after="60" w:line="300"/>
+        <w:ind w:left="360"/>
+        <w:jc w:val="left"/>
+      </w:pPr>
+      <w:r>
+        <w:rPr>
+          <w:rFonts w:ascii="Times New Roman" w:cs="Times New Roman" w:eastAsia="Times New Roman" w:hAnsi="Times New Roman"/>
+          <w:b w:val="false"/>
+          <w:bCs w:val="false"/>
+          <w:i w:val="false"/>
+          <w:iCs w:val="false"/>
+          <w:color w:val="000000"/>
+          <w:sz w:val="24"/>
+          <w:szCs w:val="24"/>
+        </w:rPr>
+        <w:t xml:space="preserve">Preuve par 9 (croix) : 544 → 4 ; 81 → 9 ; 4 × 9 = 9, et 44 064 → 9 ✓</w:t>
+      </w:r>
+    </w:p>
+    <w:p>
+      <w:pPr>
         <w:spacing w:after="40" w:line="300"/>
         <w:jc w:val="left"/>
       </w:pPr>
@@ -14865,6 +15605,26 @@
           <w:szCs w:val="24"/>
         </w:rPr>
         <w:t xml:space="preserve">Vérification : 40 × 52 + 8 = 2 080 + 8 = 2 088 ✓ (le reste 8 est bien plus petit que 40).</w:t>
+      </w:r>
+    </w:p>
+    <w:p>
+      <w:pPr>
+        <w:spacing w:after="60" w:line="300"/>
+        <w:ind w:left="360"/>
+        <w:jc w:val="left"/>
+      </w:pPr>
+      <w:r>
+        <w:rPr>
+          <w:rFonts w:ascii="Times New Roman" w:cs="Times New Roman" w:eastAsia="Times New Roman" w:hAnsi="Times New Roman"/>
+          <w:b w:val="false"/>
+          <w:bCs w:val="false"/>
+          <w:i w:val="false"/>
+          <w:iCs w:val="false"/>
+          <w:color w:val="000000"/>
+          <w:sz w:val="24"/>
+          <w:szCs w:val="24"/>
+        </w:rPr>
+        <w:t xml:space="preserve">Croix de la preuve par 9 : H 4 × B 7 + reste 8 → 9, comme 2 088 → 9 ✓</w:t>
       </w:r>
     </w:p>
     <w:p>
@@ -15578,6 +16338,26 @@
     </w:p>
     <w:p>
       <w:pPr>
+        <w:spacing w:after="60" w:line="300"/>
+        <w:ind w:left="360"/>
+        <w:jc w:val="left"/>
+      </w:pPr>
+      <w:r>
+        <w:rPr>
+          <w:rFonts w:ascii="Times New Roman" w:cs="Times New Roman" w:eastAsia="Times New Roman" w:hAnsi="Times New Roman"/>
+          <w:b w:val="false"/>
+          <w:bCs w:val="false"/>
+          <w:i w:val="false"/>
+          <w:iCs w:val="false"/>
+          <w:color w:val="000000"/>
+          <w:sz w:val="24"/>
+          <w:szCs w:val="24"/>
+        </w:rPr>
+        <w:t xml:space="preserve">Preuve par 9 (croix) : 936 → 9 ; 73 → 1 ; 9 × 1 = 9, et 68 328 → 9 ✓</w:t>
+      </w:r>
+    </w:p>
+    <w:p>
+      <w:pPr>
         <w:spacing w:after="40" w:line="300"/>
         <w:jc w:val="left"/>
       </w:pPr>
@@ -15653,6 +16433,26 @@
           <w:szCs w:val="24"/>
         </w:rPr>
         <w:t xml:space="preserve">Vérification : 15 × 71 + 8 = 1 065 + 8 = 1 073 ✓ (le reste 8 est bien plus petit que 15).</w:t>
+      </w:r>
+    </w:p>
+    <w:p>
+      <w:pPr>
+        <w:spacing w:after="60" w:line="300"/>
+        <w:ind w:left="360"/>
+        <w:jc w:val="left"/>
+      </w:pPr>
+      <w:r>
+        <w:rPr>
+          <w:rFonts w:ascii="Times New Roman" w:cs="Times New Roman" w:eastAsia="Times New Roman" w:hAnsi="Times New Roman"/>
+          <w:b w:val="false"/>
+          <w:bCs w:val="false"/>
+          <w:i w:val="false"/>
+          <w:iCs w:val="false"/>
+          <w:color w:val="000000"/>
+          <w:sz w:val="24"/>
+          <w:szCs w:val="24"/>
+        </w:rPr>
+        <w:t xml:space="preserve">Croix de la preuve par 9 : H 6 × B 8 + reste 8 → 2, comme 1 073 → 2 ✓</w:t>
       </w:r>
     </w:p>
     <w:p>
@@ -15941,7 +16741,7 @@
           <w:sz w:val="24"/>
           <w:szCs w:val="24"/>
         </w:rPr>
-        <w:t xml:space="preserve">Pour chaque problème : lis deux fois, repère les données utiles,</w:t>
+        <w:t xml:space="preserve">Pour chaque problème : lis deux fois, repère la question cachée et les mots-indices,</w:t>
       </w:r>
     </w:p>
     <w:p>
@@ -15960,7 +16760,7 @@
           <w:sz w:val="24"/>
           <w:szCs w:val="24"/>
         </w:rPr>
-        <w:t xml:space="preserve">pose les questions intermédiaires, puis rédige ta réponse en phrase complète.</w:t>
+        <w:t xml:space="preserve">choisis l’opération, calcule bien posé, puis rédige ta réponse en phrase complète.</w:t>
       </w:r>
     </w:p>
     <w:p>
@@ -16127,6 +16927,66 @@
     </w:p>
     <w:p>
       <w:pPr>
+        <w:spacing w:after="50" w:line="300"/>
+        <w:ind w:left="360"/>
+        <w:jc w:val="left"/>
+      </w:pPr>
+      <w:r>
+        <w:rPr>
+          <w:rFonts w:ascii="Times New Roman" w:cs="Times New Roman" w:eastAsia="Times New Roman" w:hAnsi="Times New Roman"/>
+          <w:b w:val="false"/>
+          <w:bCs w:val="false"/>
+          <w:i/>
+          <w:iCs/>
+          <w:color w:val="C2185B"/>
+          <w:sz w:val="24"/>
+          <w:szCs w:val="24"/>
+        </w:rPr>
+        <w:t xml:space="preserve">Question cachée : La consommation est donnée pour 100 km, on la cherche pour un autre trajet : c’est un tableau de proportionnalité.</w:t>
+      </w:r>
+    </w:p>
+    <w:p>
+      <w:pPr>
+        <w:spacing w:after="50" w:line="300"/>
+        <w:ind w:left="360"/>
+        <w:jc w:val="left"/>
+      </w:pPr>
+      <w:r>
+        <w:rPr>
+          <w:rFonts w:ascii="Times New Roman" w:cs="Times New Roman" w:eastAsia="Times New Roman" w:hAnsi="Times New Roman"/>
+          <w:b w:val="false"/>
+          <w:bCs w:val="false"/>
+          <w:i/>
+          <w:iCs/>
+          <w:color w:val="1F4E79"/>
+          <w:sz w:val="24"/>
+          <w:szCs w:val="24"/>
+        </w:rPr>
+        <w:t xml:space="preserve">Mots-indices : « … L pour 100 km… pour … km ? » → proportionnalité (produit en croix ou retour à l’unité).</w:t>
+      </w:r>
+    </w:p>
+    <w:p>
+      <w:pPr>
+        <w:spacing w:after="70" w:line="300"/>
+        <w:ind w:left="360"/>
+        <w:jc w:val="left"/>
+      </w:pPr>
+      <w:r>
+        <w:rPr>
+          <w:rFonts w:ascii="Times New Roman" w:cs="Times New Roman" w:eastAsia="Times New Roman" w:hAnsi="Times New Roman"/>
+          <w:b w:val="false"/>
+          <w:bCs w:val="false"/>
+          <w:i/>
+          <w:iCs/>
+          <w:color w:val="B25000"/>
+          <w:sz w:val="24"/>
+          <w:szCs w:val="24"/>
+        </w:rPr>
+        <w:t xml:space="preserve">Opérations choisies : multiplication et division par le coefficient : on raisonne par paquets de 100 km.</w:t>
+      </w:r>
+    </w:p>
+    <w:p>
+      <w:pPr>
         <w:spacing w:after="60" w:line="300"/>
         <w:ind w:left="360"/>
         <w:jc w:val="left"/>
@@ -16222,6 +17082,66 @@
           <w:szCs w:val="24"/>
         </w:rPr>
         <w:t xml:space="preserve">Problème 2 — démarche :</w:t>
+      </w:r>
+    </w:p>
+    <w:p>
+      <w:pPr>
+        <w:spacing w:after="50" w:line="300"/>
+        <w:ind w:left="360"/>
+        <w:jc w:val="left"/>
+      </w:pPr>
+      <w:r>
+        <w:rPr>
+          <w:rFonts w:ascii="Times New Roman" w:cs="Times New Roman" w:eastAsia="Times New Roman" w:hAnsi="Times New Roman"/>
+          <w:b w:val="false"/>
+          <w:bCs w:val="false"/>
+          <w:i/>
+          <w:iCs/>
+          <w:color w:val="C2185B"/>
+          <w:sz w:val="24"/>
+          <w:szCs w:val="24"/>
+        </w:rPr>
+        <w:t xml:space="preserve">Question cachée : Le grillage suit le TOUR du champ : le périmètre est la question cachée — impossible d’acheter des mètres sans connaître le tour !</w:t>
+      </w:r>
+    </w:p>
+    <w:p>
+      <w:pPr>
+        <w:spacing w:after="50" w:line="300"/>
+        <w:ind w:left="360"/>
+        <w:jc w:val="left"/>
+      </w:pPr>
+      <w:r>
+        <w:rPr>
+          <w:rFonts w:ascii="Times New Roman" w:cs="Times New Roman" w:eastAsia="Times New Roman" w:hAnsi="Times New Roman"/>
+          <w:b w:val="false"/>
+          <w:bCs w:val="false"/>
+          <w:i/>
+          <w:iCs/>
+          <w:color w:val="1F4E79"/>
+          <w:sz w:val="24"/>
+          <w:szCs w:val="24"/>
+        </w:rPr>
+        <w:t xml:space="preserve">Mots-indices : « clôturer » → le tour → périmètre ; « … Ar le mètre » → × ensuite.</w:t>
+      </w:r>
+    </w:p>
+    <w:p>
+      <w:pPr>
+        <w:spacing w:after="70" w:line="300"/>
+        <w:ind w:left="360"/>
+        <w:jc w:val="left"/>
+      </w:pPr>
+      <w:r>
+        <w:rPr>
+          <w:rFonts w:ascii="Times New Roman" w:cs="Times New Roman" w:eastAsia="Times New Roman" w:hAnsi="Times New Roman"/>
+          <w:b w:val="false"/>
+          <w:bCs w:val="false"/>
+          <w:i/>
+          <w:iCs/>
+          <w:color w:val="B25000"/>
+          <w:sz w:val="24"/>
+          <w:szCs w:val="24"/>
+        </w:rPr>
+        <w:t xml:space="preserve">Opérations choisies : périmètre (L + l) × 2, puis multiplication par le prix du mètre.</w:t>
       </w:r>
     </w:p>
     <w:p>
@@ -16475,6 +17395,66 @@
     </w:p>
     <w:p>
       <w:pPr>
+        <w:spacing w:after="50" w:line="300"/>
+        <w:ind w:left="360"/>
+        <w:jc w:val="left"/>
+      </w:pPr>
+      <w:r>
+        <w:rPr>
+          <w:rFonts w:ascii="Times New Roman" w:cs="Times New Roman" w:eastAsia="Times New Roman" w:hAnsi="Times New Roman"/>
+          <w:b w:val="false"/>
+          <w:bCs w:val="false"/>
+          <w:i/>
+          <w:iCs/>
+          <w:color w:val="C2185B"/>
+          <w:sz w:val="24"/>
+          <w:szCs w:val="24"/>
+        </w:rPr>
+        <w:t xml:space="preserve">Question cachée : Une dalle couvre exactement 1 m² : le nombre de dalles est donc l’AIRE de la salle.</w:t>
+      </w:r>
+    </w:p>
+    <w:p>
+      <w:pPr>
+        <w:spacing w:after="50" w:line="300"/>
+        <w:ind w:left="360"/>
+        <w:jc w:val="left"/>
+      </w:pPr>
+      <w:r>
+        <w:rPr>
+          <w:rFonts w:ascii="Times New Roman" w:cs="Times New Roman" w:eastAsia="Times New Roman" w:hAnsi="Times New Roman"/>
+          <w:b w:val="false"/>
+          <w:bCs w:val="false"/>
+          <w:i/>
+          <w:iCs/>
+          <w:color w:val="1F4E79"/>
+          <w:sz w:val="24"/>
+          <w:szCs w:val="24"/>
+        </w:rPr>
+        <w:t xml:space="preserve">Mots-indices : « carreler… dalles de 1 m² » → aire ; « pour quel prix total » → ×.</w:t>
+      </w:r>
+    </w:p>
+    <w:p>
+      <w:pPr>
+        <w:spacing w:after="70" w:line="300"/>
+        <w:ind w:left="360"/>
+        <w:jc w:val="left"/>
+      </w:pPr>
+      <w:r>
+        <w:rPr>
+          <w:rFonts w:ascii="Times New Roman" w:cs="Times New Roman" w:eastAsia="Times New Roman" w:hAnsi="Times New Roman"/>
+          <w:b w:val="false"/>
+          <w:bCs w:val="false"/>
+          <w:i/>
+          <w:iCs/>
+          <w:color w:val="B25000"/>
+          <w:sz w:val="24"/>
+          <w:szCs w:val="24"/>
+        </w:rPr>
+        <w:t xml:space="preserve">Opérations choisies : aire L × l, puis multiplication par le prix de la dalle.</w:t>
+      </w:r>
+    </w:p>
+    <w:p>
+      <w:pPr>
         <w:spacing w:after="60" w:line="300"/>
         <w:ind w:left="360"/>
         <w:jc w:val="left"/>
@@ -16574,22 +17554,22 @@
     </w:p>
     <w:p>
       <w:pPr>
-        <w:spacing w:after="60" w:line="300"/>
-        <w:ind w:left="360"/>
-        <w:jc w:val="left"/>
-      </w:pPr>
-      <w:r>
-        <w:rPr>
-          <w:rFonts w:ascii="Times New Roman" w:cs="Times New Roman" w:eastAsia="Times New Roman" w:hAnsi="Times New Roman"/>
-          <w:b w:val="false"/>
-          <w:bCs w:val="false"/>
-          <w:i w:val="false"/>
-          <w:iCs w:val="false"/>
-          <w:color w:val="000000"/>
-          <w:sz w:val="24"/>
-          <w:szCs w:val="24"/>
-        </w:rPr>
-        <w:t xml:space="preserve">Étape 1 — Quantité vendue : </w:t>
+        <w:spacing w:after="50" w:line="300"/>
+        <w:ind w:left="360"/>
+        <w:jc w:val="left"/>
+      </w:pPr>
+      <w:r>
+        <w:rPr>
+          <w:rFonts w:ascii="Times New Roman" w:cs="Times New Roman" w:eastAsia="Times New Roman" w:hAnsi="Times New Roman"/>
+          <w:b w:val="false"/>
+          <w:bCs w:val="false"/>
+          <w:i/>
+          <w:iCs/>
+          <w:color w:val="C2185B"/>
+          <w:sz w:val="24"/>
+          <w:szCs w:val="24"/>
+        </w:rPr>
+        <w:t xml:space="preserve">Question cachée : Vendre les </w:t>
       </w:r>
       <m:oMath>
         <m:f>
@@ -16610,59 +17590,39 @@
           <w:rFonts w:ascii="Times New Roman" w:cs="Times New Roman" w:eastAsia="Times New Roman" w:hAnsi="Times New Roman"/>
           <w:b w:val="false"/>
           <w:bCs w:val="false"/>
-          <w:i w:val="false"/>
-          <w:iCs w:val="false"/>
-          <w:color w:val="000000"/>
-          <w:sz w:val="24"/>
-          <w:szCs w:val="24"/>
-        </w:rPr>
-        <w:t xml:space="preserve">de 200 = (200 ÷ 4) × 3 = 50 × 3 = 150 kg.</w:t>
-      </w:r>
-    </w:p>
-    <w:p>
-      <w:pPr>
-        <w:spacing w:after="60" w:line="300"/>
-        <w:ind w:left="360"/>
-        <w:jc w:val="left"/>
-      </w:pPr>
-      <w:r>
-        <w:rPr>
-          <w:rFonts w:ascii="Times New Roman" w:cs="Times New Roman" w:eastAsia="Times New Roman" w:hAnsi="Times New Roman"/>
-          <w:b w:val="false"/>
-          <w:bCs w:val="false"/>
-          <w:i w:val="false"/>
-          <w:iCs w:val="false"/>
-          <w:color w:val="000000"/>
-          <w:sz w:val="24"/>
-          <w:szCs w:val="24"/>
-        </w:rPr>
-        <w:t xml:space="preserve">Étape 2 — Recette : 150 × 2 500 = 375 000 Ar.</w:t>
-      </w:r>
-    </w:p>
-    <w:p>
-      <w:pPr>
-        <w:spacing w:after="60" w:line="300"/>
-        <w:ind w:left="360"/>
-        <w:jc w:val="left"/>
-      </w:pPr>
-      <w:r>
-        <w:rPr>
-          <w:rFonts w:ascii="Times New Roman" w:cs="Times New Roman" w:eastAsia="Times New Roman" w:hAnsi="Times New Roman"/>
-          <w:b w:val="false"/>
-          <w:bCs w:val="false"/>
-          <w:i w:val="false"/>
-          <w:iCs w:val="false"/>
-          <w:color w:val="000000"/>
-          <w:sz w:val="24"/>
-          <w:szCs w:val="24"/>
-        </w:rPr>
-        <w:t xml:space="preserve">Étape 3 — Part gardée : 200 − 150 = 50 kg (c’est bien </w:t>
+          <w:i/>
+          <w:iCs/>
+          <w:color w:val="C2185B"/>
+          <w:sz w:val="24"/>
+          <w:szCs w:val="24"/>
+        </w:rPr>
+        <w:t xml:space="preserve">oblige à calculer D’ABORD cette quantité en kilos : c’est la question cachée.</w:t>
+      </w:r>
+    </w:p>
+    <w:p>
+      <w:pPr>
+        <w:spacing w:after="50" w:line="300"/>
+        <w:ind w:left="360"/>
+        <w:jc w:val="left"/>
+      </w:pPr>
+      <w:r>
+        <w:rPr>
+          <w:rFonts w:ascii="Times New Roman" w:cs="Times New Roman" w:eastAsia="Times New Roman" w:hAnsi="Times New Roman"/>
+          <w:b w:val="false"/>
+          <w:bCs w:val="false"/>
+          <w:i/>
+          <w:iCs/>
+          <w:color w:val="1F4E79"/>
+          <w:sz w:val="24"/>
+          <w:szCs w:val="24"/>
+        </w:rPr>
+        <w:t xml:space="preserve">Mots-indices : « les </w:t>
       </w:r>
       <m:oMath>
         <m:f>
           <m:num>
             <m:r>
-              <m:t>1</m:t>
+              <m:t>3</m:t>
             </m:r>
           </m:num>
           <m:den>
@@ -16677,6 +17637,140 @@
           <w:rFonts w:ascii="Times New Roman" w:cs="Times New Roman" w:eastAsia="Times New Roman" w:hAnsi="Times New Roman"/>
           <w:b w:val="false"/>
           <w:bCs w:val="false"/>
+          <w:i/>
+          <w:iCs/>
+          <w:color w:val="1F4E79"/>
+          <w:sz w:val="24"/>
+          <w:szCs w:val="24"/>
+        </w:rPr>
+        <w:t xml:space="preserve">de » → fraction de la récolte (÷ 4 puis × 3) ; « au kilo » → × par le prix.</w:t>
+      </w:r>
+    </w:p>
+    <w:p>
+      <w:pPr>
+        <w:spacing w:after="70" w:line="300"/>
+        <w:ind w:left="360"/>
+        <w:jc w:val="left"/>
+      </w:pPr>
+      <w:r>
+        <w:rPr>
+          <w:rFonts w:ascii="Times New Roman" w:cs="Times New Roman" w:eastAsia="Times New Roman" w:hAnsi="Times New Roman"/>
+          <w:b w:val="false"/>
+          <w:bCs w:val="false"/>
+          <w:i/>
+          <w:iCs/>
+          <w:color w:val="B25000"/>
+          <w:sz w:val="24"/>
+          <w:szCs w:val="24"/>
+        </w:rPr>
+        <w:t xml:space="preserve">Opérations choisies : fraction de la récolte, puis multiplication pour la recette, puis soustraction pour la part gardée.</w:t>
+      </w:r>
+    </w:p>
+    <w:p>
+      <w:pPr>
+        <w:spacing w:after="60" w:line="300"/>
+        <w:ind w:left="360"/>
+        <w:jc w:val="left"/>
+      </w:pPr>
+      <w:r>
+        <w:rPr>
+          <w:rFonts w:ascii="Times New Roman" w:cs="Times New Roman" w:eastAsia="Times New Roman" w:hAnsi="Times New Roman"/>
+          <w:b w:val="false"/>
+          <w:bCs w:val="false"/>
+          <w:i w:val="false"/>
+          <w:iCs w:val="false"/>
+          <w:color w:val="000000"/>
+          <w:sz w:val="24"/>
+          <w:szCs w:val="24"/>
+        </w:rPr>
+        <w:t xml:space="preserve">Étape 1 — Quantité vendue : </w:t>
+      </w:r>
+      <m:oMath>
+        <m:f>
+          <m:num>
+            <m:r>
+              <m:t>3</m:t>
+            </m:r>
+          </m:num>
+          <m:den>
+            <m:r>
+              <m:t>4</m:t>
+            </m:r>
+          </m:den>
+        </m:f>
+      </m:oMath>
+      <w:r>
+        <w:rPr>
+          <w:rFonts w:ascii="Times New Roman" w:cs="Times New Roman" w:eastAsia="Times New Roman" w:hAnsi="Times New Roman"/>
+          <w:b w:val="false"/>
+          <w:bCs w:val="false"/>
+          <w:i w:val="false"/>
+          <w:iCs w:val="false"/>
+          <w:color w:val="000000"/>
+          <w:sz w:val="24"/>
+          <w:szCs w:val="24"/>
+        </w:rPr>
+        <w:t xml:space="preserve">de 200 = (200 ÷ 4) × 3 = 50 × 3 = 150 kg.</w:t>
+      </w:r>
+    </w:p>
+    <w:p>
+      <w:pPr>
+        <w:spacing w:after="60" w:line="300"/>
+        <w:ind w:left="360"/>
+        <w:jc w:val="left"/>
+      </w:pPr>
+      <w:r>
+        <w:rPr>
+          <w:rFonts w:ascii="Times New Roman" w:cs="Times New Roman" w:eastAsia="Times New Roman" w:hAnsi="Times New Roman"/>
+          <w:b w:val="false"/>
+          <w:bCs w:val="false"/>
+          <w:i w:val="false"/>
+          <w:iCs w:val="false"/>
+          <w:color w:val="000000"/>
+          <w:sz w:val="24"/>
+          <w:szCs w:val="24"/>
+        </w:rPr>
+        <w:t xml:space="preserve">Étape 2 — Recette : 150 × 2 500 = 375 000 Ar.</w:t>
+      </w:r>
+    </w:p>
+    <w:p>
+      <w:pPr>
+        <w:spacing w:after="60" w:line="300"/>
+        <w:ind w:left="360"/>
+        <w:jc w:val="left"/>
+      </w:pPr>
+      <w:r>
+        <w:rPr>
+          <w:rFonts w:ascii="Times New Roman" w:cs="Times New Roman" w:eastAsia="Times New Roman" w:hAnsi="Times New Roman"/>
+          <w:b w:val="false"/>
+          <w:bCs w:val="false"/>
+          <w:i w:val="false"/>
+          <w:iCs w:val="false"/>
+          <w:color w:val="000000"/>
+          <w:sz w:val="24"/>
+          <w:szCs w:val="24"/>
+        </w:rPr>
+        <w:t xml:space="preserve">Étape 3 — Part gardée : 200 − 150 = 50 kg (c’est bien </w:t>
+      </w:r>
+      <m:oMath>
+        <m:f>
+          <m:num>
+            <m:r>
+              <m:t>1</m:t>
+            </m:r>
+          </m:num>
+          <m:den>
+            <m:r>
+              <m:t>4</m:t>
+            </m:r>
+          </m:den>
+        </m:f>
+      </m:oMath>
+      <w:r>
+        <w:rPr>
+          <w:rFonts w:ascii="Times New Roman" w:cs="Times New Roman" w:eastAsia="Times New Roman" w:hAnsi="Times New Roman"/>
+          <w:b w:val="false"/>
+          <w:bCs w:val="false"/>
           <w:i w:val="false"/>
           <w:iCs w:val="false"/>
           <w:color w:val="000000"/>
@@ -16870,6 +17964,66 @@
     </w:p>
     <w:p>
       <w:pPr>
+        <w:spacing w:after="50" w:line="300"/>
+        <w:ind w:left="360"/>
+        <w:jc w:val="left"/>
+      </w:pPr>
+      <w:r>
+        <w:rPr>
+          <w:rFonts w:ascii="Times New Roman" w:cs="Times New Roman" w:eastAsia="Times New Roman" w:hAnsi="Times New Roman"/>
+          <w:b w:val="false"/>
+          <w:bCs w:val="false"/>
+          <w:i/>
+          <w:iCs/>
+          <w:color w:val="C2185B"/>
+          <w:sz w:val="24"/>
+          <w:szCs w:val="24"/>
+        </w:rPr>
+        <w:t xml:space="preserve">Question cachée : Le prix du tissu d’abord, la monnaie ensuite : on ne rend pas la monnaie sans connaître le total.</w:t>
+      </w:r>
+    </w:p>
+    <w:p>
+      <w:pPr>
+        <w:spacing w:after="50" w:line="300"/>
+        <w:ind w:left="360"/>
+        <w:jc w:val="left"/>
+      </w:pPr>
+      <w:r>
+        <w:rPr>
+          <w:rFonts w:ascii="Times New Roman" w:cs="Times New Roman" w:eastAsia="Times New Roman" w:hAnsi="Times New Roman"/>
+          <w:b w:val="false"/>
+          <w:bCs w:val="false"/>
+          <w:i/>
+          <w:iCs/>
+          <w:color w:val="1F4E79"/>
+          <w:sz w:val="24"/>
+          <w:szCs w:val="24"/>
+        </w:rPr>
+        <w:t xml:space="preserve">Mots-indices : « … m à … Ar le mètre » (prix unitaire → ×) ; « combien lui rend-on » (écart → −).</w:t>
+      </w:r>
+    </w:p>
+    <w:p>
+      <w:pPr>
+        <w:spacing w:after="70" w:line="300"/>
+        <w:ind w:left="360"/>
+        <w:jc w:val="left"/>
+      </w:pPr>
+      <w:r>
+        <w:rPr>
+          <w:rFonts w:ascii="Times New Roman" w:cs="Times New Roman" w:eastAsia="Times New Roman" w:hAnsi="Times New Roman"/>
+          <w:b w:val="false"/>
+          <w:bCs w:val="false"/>
+          <w:i/>
+          <w:iCs/>
+          <w:color w:val="B25000"/>
+          <w:sz w:val="24"/>
+          <w:szCs w:val="24"/>
+        </w:rPr>
+        <w:t xml:space="preserve">Opérations choisies : multiplication à virgules, puis soustraction.</w:t>
+      </w:r>
+    </w:p>
+    <w:p>
+      <w:pPr>
         <w:spacing w:after="60" w:line="300"/>
         <w:ind w:left="360"/>
         <w:jc w:val="left"/>
@@ -16945,6 +18099,66 @@
           <w:szCs w:val="24"/>
         </w:rPr>
         <w:t xml:space="preserve">Problème 2 — démarche :</w:t>
+      </w:r>
+    </w:p>
+    <w:p>
+      <w:pPr>
+        <w:spacing w:after="50" w:line="300"/>
+        <w:ind w:left="360"/>
+        <w:jc w:val="left"/>
+      </w:pPr>
+      <w:r>
+        <w:rPr>
+          <w:rFonts w:ascii="Times New Roman" w:cs="Times New Roman" w:eastAsia="Times New Roman" w:hAnsi="Times New Roman"/>
+          <w:b w:val="false"/>
+          <w:bCs w:val="false"/>
+          <w:i/>
+          <w:iCs/>
+          <w:color w:val="C2185B"/>
+          <w:sz w:val="24"/>
+          <w:szCs w:val="24"/>
+        </w:rPr>
+        <w:t xml:space="preserve">Question cachée : On additionne les heures avec les heures et les minutes avec les minutes — et si les minutes dépassent 60, on échange contre 1 heure.</w:t>
+      </w:r>
+    </w:p>
+    <w:p>
+      <w:pPr>
+        <w:spacing w:after="50" w:line="300"/>
+        <w:ind w:left="360"/>
+        <w:jc w:val="left"/>
+      </w:pPr>
+      <w:r>
+        <w:rPr>
+          <w:rFonts w:ascii="Times New Roman" w:cs="Times New Roman" w:eastAsia="Times New Roman" w:hAnsi="Times New Roman"/>
+          <w:b w:val="false"/>
+          <w:bCs w:val="false"/>
+          <w:i/>
+          <w:iCs/>
+          <w:color w:val="1F4E79"/>
+          <w:sz w:val="24"/>
+          <w:szCs w:val="24"/>
+        </w:rPr>
+        <w:t xml:space="preserve">Mots-indices : « part à… le trajet dure… » → addition de durées (base 60).</w:t>
+      </w:r>
+    </w:p>
+    <w:p>
+      <w:pPr>
+        <w:spacing w:after="70" w:line="300"/>
+        <w:ind w:left="360"/>
+        <w:jc w:val="left"/>
+      </w:pPr>
+      <w:r>
+        <w:rPr>
+          <w:rFonts w:ascii="Times New Roman" w:cs="Times New Roman" w:eastAsia="Times New Roman" w:hAnsi="Times New Roman"/>
+          <w:b w:val="false"/>
+          <w:bCs w:val="false"/>
+          <w:i/>
+          <w:iCs/>
+          <w:color w:val="B25000"/>
+          <w:sz w:val="24"/>
+          <w:szCs w:val="24"/>
+        </w:rPr>
+        <w:t xml:space="preserve">Opérations choisies : addition sexagésimale : colonne des heures, colonne des minutes, échange à 60.</w:t>
       </w:r>
     </w:p>
     <w:p>
@@ -17191,6 +18405,66 @@
     </w:p>
     <w:p>
       <w:pPr>
+        <w:spacing w:after="50" w:line="300"/>
+        <w:ind w:left="360"/>
+        <w:jc w:val="left"/>
+      </w:pPr>
+      <w:r>
+        <w:rPr>
+          <w:rFonts w:ascii="Times New Roman" w:cs="Times New Roman" w:eastAsia="Times New Roman" w:hAnsi="Times New Roman"/>
+          <w:b w:val="false"/>
+          <w:bCs w:val="false"/>
+          <w:i/>
+          <w:iCs/>
+          <w:color w:val="C2185B"/>
+          <w:sz w:val="24"/>
+          <w:szCs w:val="24"/>
+        </w:rPr>
+        <w:t xml:space="preserve">Question cachée : Combien de « paquets » de … Ar tiennent dans le prix du vélo : l’épargne hebdomadaire est comme un paquet qu’on répète.</w:t>
+      </w:r>
+    </w:p>
+    <w:p>
+      <w:pPr>
+        <w:spacing w:after="50" w:line="300"/>
+        <w:ind w:left="360"/>
+        <w:jc w:val="left"/>
+      </w:pPr>
+      <w:r>
+        <w:rPr>
+          <w:rFonts w:ascii="Times New Roman" w:cs="Times New Roman" w:eastAsia="Times New Roman" w:hAnsi="Times New Roman"/>
+          <w:b w:val="false"/>
+          <w:bCs w:val="false"/>
+          <w:i/>
+          <w:iCs/>
+          <w:color w:val="1F4E79"/>
+          <w:sz w:val="24"/>
+          <w:szCs w:val="24"/>
+        </w:rPr>
+        <w:t xml:space="preserve">Mots-indices : « combien de semaines » → combien de fois → division (groupement).</w:t>
+      </w:r>
+    </w:p>
+    <w:p>
+      <w:pPr>
+        <w:spacing w:after="70" w:line="300"/>
+        <w:ind w:left="360"/>
+        <w:jc w:val="left"/>
+      </w:pPr>
+      <w:r>
+        <w:rPr>
+          <w:rFonts w:ascii="Times New Roman" w:cs="Times New Roman" w:eastAsia="Times New Roman" w:hAnsi="Times New Roman"/>
+          <w:b w:val="false"/>
+          <w:bCs w:val="false"/>
+          <w:i/>
+          <w:iCs/>
+          <w:color w:val="B25000"/>
+          <w:sz w:val="24"/>
+          <w:szCs w:val="24"/>
+        </w:rPr>
+        <w:t xml:space="preserve">Opérations choisies : division : on cherche combien de fois l’épargne entre dans le prix total.</w:t>
+      </w:r>
+    </w:p>
+    <w:p>
+      <w:pPr>
         <w:spacing w:after="60" w:line="300"/>
         <w:ind w:left="360"/>
         <w:jc w:val="left"/>
@@ -17286,6 +18560,66 @@
           <w:szCs w:val="24"/>
         </w:rPr>
         <w:t xml:space="preserve">Problème 2 — démarche :</w:t>
+      </w:r>
+    </w:p>
+    <w:p>
+      <w:pPr>
+        <w:spacing w:after="50" w:line="300"/>
+        <w:ind w:left="360"/>
+        <w:jc w:val="left"/>
+      </w:pPr>
+      <w:r>
+        <w:rPr>
+          <w:rFonts w:ascii="Times New Roman" w:cs="Times New Roman" w:eastAsia="Times New Roman" w:hAnsi="Times New Roman"/>
+          <w:b w:val="false"/>
+          <w:bCs w:val="false"/>
+          <w:i/>
+          <w:iCs/>
+          <w:color w:val="C2185B"/>
+          <w:sz w:val="24"/>
+          <w:szCs w:val="24"/>
+        </w:rPr>
+        <w:t xml:space="preserve">Question cachée : Deux questions bien séparées : d’abord les rangées (division), puis les bus (division avec reste — et il faut l’interpréter !).</w:t>
+      </w:r>
+    </w:p>
+    <w:p>
+      <w:pPr>
+        <w:spacing w:after="50" w:line="300"/>
+        <w:ind w:left="360"/>
+        <w:jc w:val="left"/>
+      </w:pPr>
+      <w:r>
+        <w:rPr>
+          <w:rFonts w:ascii="Times New Roman" w:cs="Times New Roman" w:eastAsia="Times New Roman" w:hAnsi="Times New Roman"/>
+          <w:b w:val="false"/>
+          <w:bCs w:val="false"/>
+          <w:i/>
+          <w:iCs/>
+          <w:color w:val="1F4E79"/>
+          <w:sz w:val="24"/>
+          <w:szCs w:val="24"/>
+        </w:rPr>
+        <w:t xml:space="preserve">Mots-indices : « en rangées de » → ÷ ; « et … enseignants » → + ; « bus de 30 places » → ÷ avec reste.</w:t>
+      </w:r>
+    </w:p>
+    <w:p>
+      <w:pPr>
+        <w:spacing w:after="70" w:line="300"/>
+        <w:ind w:left="360"/>
+        <w:jc w:val="left"/>
+      </w:pPr>
+      <w:r>
+        <w:rPr>
+          <w:rFonts w:ascii="Times New Roman" w:cs="Times New Roman" w:eastAsia="Times New Roman" w:hAnsi="Times New Roman"/>
+          <w:b w:val="false"/>
+          <w:bCs w:val="false"/>
+          <w:i/>
+          <w:iCs/>
+          <w:color w:val="B25000"/>
+          <w:sz w:val="24"/>
+          <w:szCs w:val="24"/>
+        </w:rPr>
+        <w:t xml:space="preserve">Opérations choisies : division, addition, puis division avec interprétation du reste : le reste impose un bus DE PLUS.</w:t>
       </w:r>
     </w:p>
     <w:p>
@@ -17532,6 +18866,66 @@
     </w:p>
     <w:p>
       <w:pPr>
+        <w:spacing w:after="50" w:line="300"/>
+        <w:ind w:left="360"/>
+        <w:jc w:val="left"/>
+      </w:pPr>
+      <w:r>
+        <w:rPr>
+          <w:rFonts w:ascii="Times New Roman" w:cs="Times New Roman" w:eastAsia="Times New Roman" w:hAnsi="Times New Roman"/>
+          <w:b w:val="false"/>
+          <w:bCs w:val="false"/>
+          <w:i/>
+          <w:iCs/>
+          <w:color w:val="C2185B"/>
+          <w:sz w:val="24"/>
+          <w:szCs w:val="24"/>
+        </w:rPr>
+        <w:t xml:space="preserve">Question cachée : Pour rendre la monnaie, il faut d’abord connaître le prix TOTAL des achats : le total est la question cachée.</w:t>
+      </w:r>
+    </w:p>
+    <w:p>
+      <w:pPr>
+        <w:spacing w:after="50" w:line="300"/>
+        <w:ind w:left="360"/>
+        <w:jc w:val="left"/>
+      </w:pPr>
+      <w:r>
+        <w:rPr>
+          <w:rFonts w:ascii="Times New Roman" w:cs="Times New Roman" w:eastAsia="Times New Roman" w:hAnsi="Times New Roman"/>
+          <w:b w:val="false"/>
+          <w:bCs w:val="false"/>
+          <w:i/>
+          <w:iCs/>
+          <w:color w:val="1F4E79"/>
+          <w:sz w:val="24"/>
+          <w:szCs w:val="24"/>
+        </w:rPr>
+        <w:t xml:space="preserve">Mots-indices : « à … Ar le kapoaka » (prix unitaire → ×) ; « et un savon » (réunion → +) ; « combien lui rend-on » (écart → −).</w:t>
+      </w:r>
+    </w:p>
+    <w:p>
+      <w:pPr>
+        <w:spacing w:after="70" w:line="300"/>
+        <w:ind w:left="360"/>
+        <w:jc w:val="left"/>
+      </w:pPr>
+      <w:r>
+        <w:rPr>
+          <w:rFonts w:ascii="Times New Roman" w:cs="Times New Roman" w:eastAsia="Times New Roman" w:hAnsi="Times New Roman"/>
+          <w:b w:val="false"/>
+          <w:bCs w:val="false"/>
+          <w:i/>
+          <w:iCs/>
+          <w:color w:val="B25000"/>
+          <w:sz w:val="24"/>
+          <w:szCs w:val="24"/>
+        </w:rPr>
+        <w:t xml:space="preserve">Opérations choisies : multiplication (prix du riz), puis addition (total), puis soustraction (monnaie rendue).</w:t>
+      </w:r>
+    </w:p>
+    <w:p>
+      <w:pPr>
         <w:spacing w:after="60" w:line="300"/>
         <w:ind w:left="360"/>
         <w:jc w:val="left"/>
@@ -17627,6 +19021,66 @@
           <w:szCs w:val="24"/>
         </w:rPr>
         <w:t xml:space="preserve">Problème 2 — démarche :</w:t>
+      </w:r>
+    </w:p>
+    <w:p>
+      <w:pPr>
+        <w:spacing w:after="50" w:line="300"/>
+        <w:ind w:left="360"/>
+        <w:jc w:val="left"/>
+      </w:pPr>
+      <w:r>
+        <w:rPr>
+          <w:rFonts w:ascii="Times New Roman" w:cs="Times New Roman" w:eastAsia="Times New Roman" w:hAnsi="Times New Roman"/>
+          <w:b w:val="false"/>
+          <w:bCs w:val="false"/>
+          <w:i/>
+          <w:iCs/>
+          <w:color w:val="C2185B"/>
+          <w:sz w:val="24"/>
+          <w:szCs w:val="24"/>
+        </w:rPr>
+        <w:t xml:space="preserve">Question cachée : On ne peut diviser que des grammes par des grammes : la conversion kg → g est la question cachée.</w:t>
+      </w:r>
+    </w:p>
+    <w:p>
+      <w:pPr>
+        <w:spacing w:after="50" w:line="300"/>
+        <w:ind w:left="360"/>
+        <w:jc w:val="left"/>
+      </w:pPr>
+      <w:r>
+        <w:rPr>
+          <w:rFonts w:ascii="Times New Roman" w:cs="Times New Roman" w:eastAsia="Times New Roman" w:hAnsi="Times New Roman"/>
+          <w:b w:val="false"/>
+          <w:bCs w:val="false"/>
+          <w:i/>
+          <w:iCs/>
+          <w:color w:val="1F4E79"/>
+          <w:sz w:val="24"/>
+          <w:szCs w:val="24"/>
+        </w:rPr>
+        <w:t xml:space="preserve">Mots-indices : « partage… en sachets de » → division ; « kg » et « g » dans le même énoncé → conversion d’abord.</w:t>
+      </w:r>
+    </w:p>
+    <w:p>
+      <w:pPr>
+        <w:spacing w:after="70" w:line="300"/>
+        <w:ind w:left="360"/>
+        <w:jc w:val="left"/>
+      </w:pPr>
+      <w:r>
+        <w:rPr>
+          <w:rFonts w:ascii="Times New Roman" w:cs="Times New Roman" w:eastAsia="Times New Roman" w:hAnsi="Times New Roman"/>
+          <w:b w:val="false"/>
+          <w:bCs w:val="false"/>
+          <w:i/>
+          <w:iCs/>
+          <w:color w:val="B25000"/>
+          <w:sz w:val="24"/>
+          <w:szCs w:val="24"/>
+        </w:rPr>
+        <w:t xml:space="preserve">Opérations choisies : conversion, puis division euclidienne : combien de paquets de … g dans … g, et que reste-t-il ?</w:t>
       </w:r>
     </w:p>
     <w:p>
@@ -17873,6 +19327,66 @@
     </w:p>
     <w:p>
       <w:pPr>
+        <w:spacing w:after="50" w:line="300"/>
+        <w:ind w:left="360"/>
+        <w:jc w:val="left"/>
+      </w:pPr>
+      <w:r>
+        <w:rPr>
+          <w:rFonts w:ascii="Times New Roman" w:cs="Times New Roman" w:eastAsia="Times New Roman" w:hAnsi="Times New Roman"/>
+          <w:b w:val="false"/>
+          <w:bCs w:val="false"/>
+          <w:i/>
+          <w:iCs/>
+          <w:color w:val="C2185B"/>
+          <w:sz w:val="24"/>
+          <w:szCs w:val="24"/>
+        </w:rPr>
+        <w:t xml:space="preserve">Question cachée : La consommation est donnée pour 100 km, on la cherche pour un autre trajet : c’est un tableau de proportionnalité.</w:t>
+      </w:r>
+    </w:p>
+    <w:p>
+      <w:pPr>
+        <w:spacing w:after="50" w:line="300"/>
+        <w:ind w:left="360"/>
+        <w:jc w:val="left"/>
+      </w:pPr>
+      <w:r>
+        <w:rPr>
+          <w:rFonts w:ascii="Times New Roman" w:cs="Times New Roman" w:eastAsia="Times New Roman" w:hAnsi="Times New Roman"/>
+          <w:b w:val="false"/>
+          <w:bCs w:val="false"/>
+          <w:i/>
+          <w:iCs/>
+          <w:color w:val="1F4E79"/>
+          <w:sz w:val="24"/>
+          <w:szCs w:val="24"/>
+        </w:rPr>
+        <w:t xml:space="preserve">Mots-indices : « … L pour 100 km… pour … km ? » → proportionnalité (produit en croix ou retour à l’unité).</w:t>
+      </w:r>
+    </w:p>
+    <w:p>
+      <w:pPr>
+        <w:spacing w:after="70" w:line="300"/>
+        <w:ind w:left="360"/>
+        <w:jc w:val="left"/>
+      </w:pPr>
+      <w:r>
+        <w:rPr>
+          <w:rFonts w:ascii="Times New Roman" w:cs="Times New Roman" w:eastAsia="Times New Roman" w:hAnsi="Times New Roman"/>
+          <w:b w:val="false"/>
+          <w:bCs w:val="false"/>
+          <w:i/>
+          <w:iCs/>
+          <w:color w:val="B25000"/>
+          <w:sz w:val="24"/>
+          <w:szCs w:val="24"/>
+        </w:rPr>
+        <w:t xml:space="preserve">Opérations choisies : multiplication et division par le coefficient : on raisonne par paquets de 100 km.</w:t>
+      </w:r>
+    </w:p>
+    <w:p>
+      <w:pPr>
         <w:spacing w:after="60" w:line="300"/>
         <w:ind w:left="360"/>
         <w:jc w:val="left"/>
@@ -17968,6 +19482,66 @@
           <w:szCs w:val="24"/>
         </w:rPr>
         <w:t xml:space="preserve">Problème 2 — démarche :</w:t>
+      </w:r>
+    </w:p>
+    <w:p>
+      <w:pPr>
+        <w:spacing w:after="50" w:line="300"/>
+        <w:ind w:left="360"/>
+        <w:jc w:val="left"/>
+      </w:pPr>
+      <w:r>
+        <w:rPr>
+          <w:rFonts w:ascii="Times New Roman" w:cs="Times New Roman" w:eastAsia="Times New Roman" w:hAnsi="Times New Roman"/>
+          <w:b w:val="false"/>
+          <w:bCs w:val="false"/>
+          <w:i/>
+          <w:iCs/>
+          <w:color w:val="C2185B"/>
+          <w:sz w:val="24"/>
+          <w:szCs w:val="24"/>
+        </w:rPr>
+        <w:t xml:space="preserve">Question cachée : Le grillage suit le TOUR du champ : le périmètre est la question cachée — impossible d’acheter des mètres sans connaître le tour !</w:t>
+      </w:r>
+    </w:p>
+    <w:p>
+      <w:pPr>
+        <w:spacing w:after="50" w:line="300"/>
+        <w:ind w:left="360"/>
+        <w:jc w:val="left"/>
+      </w:pPr>
+      <w:r>
+        <w:rPr>
+          <w:rFonts w:ascii="Times New Roman" w:cs="Times New Roman" w:eastAsia="Times New Roman" w:hAnsi="Times New Roman"/>
+          <w:b w:val="false"/>
+          <w:bCs w:val="false"/>
+          <w:i/>
+          <w:iCs/>
+          <w:color w:val="1F4E79"/>
+          <w:sz w:val="24"/>
+          <w:szCs w:val="24"/>
+        </w:rPr>
+        <w:t xml:space="preserve">Mots-indices : « clôturer » → le tour → périmètre ; « … Ar le mètre » → × ensuite.</w:t>
+      </w:r>
+    </w:p>
+    <w:p>
+      <w:pPr>
+        <w:spacing w:after="70" w:line="300"/>
+        <w:ind w:left="360"/>
+        <w:jc w:val="left"/>
+      </w:pPr>
+      <w:r>
+        <w:rPr>
+          <w:rFonts w:ascii="Times New Roman" w:cs="Times New Roman" w:eastAsia="Times New Roman" w:hAnsi="Times New Roman"/>
+          <w:b w:val="false"/>
+          <w:bCs w:val="false"/>
+          <w:i/>
+          <w:iCs/>
+          <w:color w:val="B25000"/>
+          <w:sz w:val="24"/>
+          <w:szCs w:val="24"/>
+        </w:rPr>
+        <w:t xml:space="preserve">Opérations choisies : périmètre (L + l) × 2, puis multiplication par le prix du mètre.</w:t>
       </w:r>
     </w:p>
     <w:p>
@@ -18221,6 +19795,66 @@
     </w:p>
     <w:p>
       <w:pPr>
+        <w:spacing w:after="50" w:line="300"/>
+        <w:ind w:left="360"/>
+        <w:jc w:val="left"/>
+      </w:pPr>
+      <w:r>
+        <w:rPr>
+          <w:rFonts w:ascii="Times New Roman" w:cs="Times New Roman" w:eastAsia="Times New Roman" w:hAnsi="Times New Roman"/>
+          <w:b w:val="false"/>
+          <w:bCs w:val="false"/>
+          <w:i/>
+          <w:iCs/>
+          <w:color w:val="C2185B"/>
+          <w:sz w:val="24"/>
+          <w:szCs w:val="24"/>
+        </w:rPr>
+        <w:t xml:space="preserve">Question cachée : Une dalle couvre exactement 1 m² : le nombre de dalles est donc l’AIRE de la salle.</w:t>
+      </w:r>
+    </w:p>
+    <w:p>
+      <w:pPr>
+        <w:spacing w:after="50" w:line="300"/>
+        <w:ind w:left="360"/>
+        <w:jc w:val="left"/>
+      </w:pPr>
+      <w:r>
+        <w:rPr>
+          <w:rFonts w:ascii="Times New Roman" w:cs="Times New Roman" w:eastAsia="Times New Roman" w:hAnsi="Times New Roman"/>
+          <w:b w:val="false"/>
+          <w:bCs w:val="false"/>
+          <w:i/>
+          <w:iCs/>
+          <w:color w:val="1F4E79"/>
+          <w:sz w:val="24"/>
+          <w:szCs w:val="24"/>
+        </w:rPr>
+        <w:t xml:space="preserve">Mots-indices : « carreler… dalles de 1 m² » → aire ; « pour quel prix total » → ×.</w:t>
+      </w:r>
+    </w:p>
+    <w:p>
+      <w:pPr>
+        <w:spacing w:after="70" w:line="300"/>
+        <w:ind w:left="360"/>
+        <w:jc w:val="left"/>
+      </w:pPr>
+      <w:r>
+        <w:rPr>
+          <w:rFonts w:ascii="Times New Roman" w:cs="Times New Roman" w:eastAsia="Times New Roman" w:hAnsi="Times New Roman"/>
+          <w:b w:val="false"/>
+          <w:bCs w:val="false"/>
+          <w:i/>
+          <w:iCs/>
+          <w:color w:val="B25000"/>
+          <w:sz w:val="24"/>
+          <w:szCs w:val="24"/>
+        </w:rPr>
+        <w:t xml:space="preserve">Opérations choisies : aire L × l, puis multiplication par le prix de la dalle.</w:t>
+      </w:r>
+    </w:p>
+    <w:p>
+      <w:pPr>
         <w:spacing w:after="60" w:line="300"/>
         <w:ind w:left="360"/>
         <w:jc w:val="left"/>
@@ -18320,22 +19954,22 @@
     </w:p>
     <w:p>
       <w:pPr>
-        <w:spacing w:after="60" w:line="300"/>
-        <w:ind w:left="360"/>
-        <w:jc w:val="left"/>
-      </w:pPr>
-      <w:r>
-        <w:rPr>
-          <w:rFonts w:ascii="Times New Roman" w:cs="Times New Roman" w:eastAsia="Times New Roman" w:hAnsi="Times New Roman"/>
-          <w:b w:val="false"/>
-          <w:bCs w:val="false"/>
-          <w:i w:val="false"/>
-          <w:iCs w:val="false"/>
-          <w:color w:val="000000"/>
-          <w:sz w:val="24"/>
-          <w:szCs w:val="24"/>
-        </w:rPr>
-        <w:t xml:space="preserve">Étape 1 — Quantité vendue : </w:t>
+        <w:spacing w:after="50" w:line="300"/>
+        <w:ind w:left="360"/>
+        <w:jc w:val="left"/>
+      </w:pPr>
+      <w:r>
+        <w:rPr>
+          <w:rFonts w:ascii="Times New Roman" w:cs="Times New Roman" w:eastAsia="Times New Roman" w:hAnsi="Times New Roman"/>
+          <w:b w:val="false"/>
+          <w:bCs w:val="false"/>
+          <w:i/>
+          <w:iCs/>
+          <w:color w:val="C2185B"/>
+          <w:sz w:val="24"/>
+          <w:szCs w:val="24"/>
+        </w:rPr>
+        <w:t xml:space="preserve">Question cachée : Vendre les </w:t>
       </w:r>
       <m:oMath>
         <m:f>
@@ -18356,59 +19990,39 @@
           <w:rFonts w:ascii="Times New Roman" w:cs="Times New Roman" w:eastAsia="Times New Roman" w:hAnsi="Times New Roman"/>
           <w:b w:val="false"/>
           <w:bCs w:val="false"/>
-          <w:i w:val="false"/>
-          <w:iCs w:val="false"/>
-          <w:color w:val="000000"/>
-          <w:sz w:val="24"/>
-          <w:szCs w:val="24"/>
-        </w:rPr>
-        <w:t xml:space="preserve">de 120 = (120 ÷ 4) × 3 = 30 × 3 = 90 kg.</w:t>
-      </w:r>
-    </w:p>
-    <w:p>
-      <w:pPr>
-        <w:spacing w:after="60" w:line="300"/>
-        <w:ind w:left="360"/>
-        <w:jc w:val="left"/>
-      </w:pPr>
-      <w:r>
-        <w:rPr>
-          <w:rFonts w:ascii="Times New Roman" w:cs="Times New Roman" w:eastAsia="Times New Roman" w:hAnsi="Times New Roman"/>
-          <w:b w:val="false"/>
-          <w:bCs w:val="false"/>
-          <w:i w:val="false"/>
-          <w:iCs w:val="false"/>
-          <w:color w:val="000000"/>
-          <w:sz w:val="24"/>
-          <w:szCs w:val="24"/>
-        </w:rPr>
-        <w:t xml:space="preserve">Étape 2 — Recette : 90 × 2 000 = 180 000 Ar.</w:t>
-      </w:r>
-    </w:p>
-    <w:p>
-      <w:pPr>
-        <w:spacing w:after="60" w:line="300"/>
-        <w:ind w:left="360"/>
-        <w:jc w:val="left"/>
-      </w:pPr>
-      <w:r>
-        <w:rPr>
-          <w:rFonts w:ascii="Times New Roman" w:cs="Times New Roman" w:eastAsia="Times New Roman" w:hAnsi="Times New Roman"/>
-          <w:b w:val="false"/>
-          <w:bCs w:val="false"/>
-          <w:i w:val="false"/>
-          <w:iCs w:val="false"/>
-          <w:color w:val="000000"/>
-          <w:sz w:val="24"/>
-          <w:szCs w:val="24"/>
-        </w:rPr>
-        <w:t xml:space="preserve">Étape 3 — Part gardée : 120 − 90 = 30 kg (c’est bien </w:t>
+          <w:i/>
+          <w:iCs/>
+          <w:color w:val="C2185B"/>
+          <w:sz w:val="24"/>
+          <w:szCs w:val="24"/>
+        </w:rPr>
+        <w:t xml:space="preserve">oblige à calculer D’ABORD cette quantité en kilos : c’est la question cachée.</w:t>
+      </w:r>
+    </w:p>
+    <w:p>
+      <w:pPr>
+        <w:spacing w:after="50" w:line="300"/>
+        <w:ind w:left="360"/>
+        <w:jc w:val="left"/>
+      </w:pPr>
+      <w:r>
+        <w:rPr>
+          <w:rFonts w:ascii="Times New Roman" w:cs="Times New Roman" w:eastAsia="Times New Roman" w:hAnsi="Times New Roman"/>
+          <w:b w:val="false"/>
+          <w:bCs w:val="false"/>
+          <w:i/>
+          <w:iCs/>
+          <w:color w:val="1F4E79"/>
+          <w:sz w:val="24"/>
+          <w:szCs w:val="24"/>
+        </w:rPr>
+        <w:t xml:space="preserve">Mots-indices : « les </w:t>
       </w:r>
       <m:oMath>
         <m:f>
           <m:num>
             <m:r>
-              <m:t>1</m:t>
+              <m:t>3</m:t>
             </m:r>
           </m:num>
           <m:den>
@@ -18423,6 +20037,140 @@
           <w:rFonts w:ascii="Times New Roman" w:cs="Times New Roman" w:eastAsia="Times New Roman" w:hAnsi="Times New Roman"/>
           <w:b w:val="false"/>
           <w:bCs w:val="false"/>
+          <w:i/>
+          <w:iCs/>
+          <w:color w:val="1F4E79"/>
+          <w:sz w:val="24"/>
+          <w:szCs w:val="24"/>
+        </w:rPr>
+        <w:t xml:space="preserve">de » → fraction de la récolte (÷ 4 puis × 3) ; « au kilo » → × par le prix.</w:t>
+      </w:r>
+    </w:p>
+    <w:p>
+      <w:pPr>
+        <w:spacing w:after="70" w:line="300"/>
+        <w:ind w:left="360"/>
+        <w:jc w:val="left"/>
+      </w:pPr>
+      <w:r>
+        <w:rPr>
+          <w:rFonts w:ascii="Times New Roman" w:cs="Times New Roman" w:eastAsia="Times New Roman" w:hAnsi="Times New Roman"/>
+          <w:b w:val="false"/>
+          <w:bCs w:val="false"/>
+          <w:i/>
+          <w:iCs/>
+          <w:color w:val="B25000"/>
+          <w:sz w:val="24"/>
+          <w:szCs w:val="24"/>
+        </w:rPr>
+        <w:t xml:space="preserve">Opérations choisies : fraction de la récolte, puis multiplication pour la recette, puis soustraction pour la part gardée.</w:t>
+      </w:r>
+    </w:p>
+    <w:p>
+      <w:pPr>
+        <w:spacing w:after="60" w:line="300"/>
+        <w:ind w:left="360"/>
+        <w:jc w:val="left"/>
+      </w:pPr>
+      <w:r>
+        <w:rPr>
+          <w:rFonts w:ascii="Times New Roman" w:cs="Times New Roman" w:eastAsia="Times New Roman" w:hAnsi="Times New Roman"/>
+          <w:b w:val="false"/>
+          <w:bCs w:val="false"/>
+          <w:i w:val="false"/>
+          <w:iCs w:val="false"/>
+          <w:color w:val="000000"/>
+          <w:sz w:val="24"/>
+          <w:szCs w:val="24"/>
+        </w:rPr>
+        <w:t xml:space="preserve">Étape 1 — Quantité vendue : </w:t>
+      </w:r>
+      <m:oMath>
+        <m:f>
+          <m:num>
+            <m:r>
+              <m:t>3</m:t>
+            </m:r>
+          </m:num>
+          <m:den>
+            <m:r>
+              <m:t>4</m:t>
+            </m:r>
+          </m:den>
+        </m:f>
+      </m:oMath>
+      <w:r>
+        <w:rPr>
+          <w:rFonts w:ascii="Times New Roman" w:cs="Times New Roman" w:eastAsia="Times New Roman" w:hAnsi="Times New Roman"/>
+          <w:b w:val="false"/>
+          <w:bCs w:val="false"/>
+          <w:i w:val="false"/>
+          <w:iCs w:val="false"/>
+          <w:color w:val="000000"/>
+          <w:sz w:val="24"/>
+          <w:szCs w:val="24"/>
+        </w:rPr>
+        <w:t xml:space="preserve">de 120 = (120 ÷ 4) × 3 = 30 × 3 = 90 kg.</w:t>
+      </w:r>
+    </w:p>
+    <w:p>
+      <w:pPr>
+        <w:spacing w:after="60" w:line="300"/>
+        <w:ind w:left="360"/>
+        <w:jc w:val="left"/>
+      </w:pPr>
+      <w:r>
+        <w:rPr>
+          <w:rFonts w:ascii="Times New Roman" w:cs="Times New Roman" w:eastAsia="Times New Roman" w:hAnsi="Times New Roman"/>
+          <w:b w:val="false"/>
+          <w:bCs w:val="false"/>
+          <w:i w:val="false"/>
+          <w:iCs w:val="false"/>
+          <w:color w:val="000000"/>
+          <w:sz w:val="24"/>
+          <w:szCs w:val="24"/>
+        </w:rPr>
+        <w:t xml:space="preserve">Étape 2 — Recette : 90 × 2 000 = 180 000 Ar.</w:t>
+      </w:r>
+    </w:p>
+    <w:p>
+      <w:pPr>
+        <w:spacing w:after="60" w:line="300"/>
+        <w:ind w:left="360"/>
+        <w:jc w:val="left"/>
+      </w:pPr>
+      <w:r>
+        <w:rPr>
+          <w:rFonts w:ascii="Times New Roman" w:cs="Times New Roman" w:eastAsia="Times New Roman" w:hAnsi="Times New Roman"/>
+          <w:b w:val="false"/>
+          <w:bCs w:val="false"/>
+          <w:i w:val="false"/>
+          <w:iCs w:val="false"/>
+          <w:color w:val="000000"/>
+          <w:sz w:val="24"/>
+          <w:szCs w:val="24"/>
+        </w:rPr>
+        <w:t xml:space="preserve">Étape 3 — Part gardée : 120 − 90 = 30 kg (c’est bien </w:t>
+      </w:r>
+      <m:oMath>
+        <m:f>
+          <m:num>
+            <m:r>
+              <m:t>1</m:t>
+            </m:r>
+          </m:num>
+          <m:den>
+            <m:r>
+              <m:t>4</m:t>
+            </m:r>
+          </m:den>
+        </m:f>
+      </m:oMath>
+      <w:r>
+        <w:rPr>
+          <w:rFonts w:ascii="Times New Roman" w:cs="Times New Roman" w:eastAsia="Times New Roman" w:hAnsi="Times New Roman"/>
+          <w:b w:val="false"/>
+          <w:bCs w:val="false"/>
           <w:i w:val="false"/>
           <w:iCs w:val="false"/>
           <w:color w:val="000000"/>
@@ -18616,6 +20364,66 @@
     </w:p>
     <w:p>
       <w:pPr>
+        <w:spacing w:after="50" w:line="300"/>
+        <w:ind w:left="360"/>
+        <w:jc w:val="left"/>
+      </w:pPr>
+      <w:r>
+        <w:rPr>
+          <w:rFonts w:ascii="Times New Roman" w:cs="Times New Roman" w:eastAsia="Times New Roman" w:hAnsi="Times New Roman"/>
+          <w:b w:val="false"/>
+          <w:bCs w:val="false"/>
+          <w:i/>
+          <w:iCs/>
+          <w:color w:val="C2185B"/>
+          <w:sz w:val="24"/>
+          <w:szCs w:val="24"/>
+        </w:rPr>
+        <w:t xml:space="preserve">Question cachée : Le prix du tissu d’abord, la monnaie ensuite : on ne rend pas la monnaie sans connaître le total.</w:t>
+      </w:r>
+    </w:p>
+    <w:p>
+      <w:pPr>
+        <w:spacing w:after="50" w:line="300"/>
+        <w:ind w:left="360"/>
+        <w:jc w:val="left"/>
+      </w:pPr>
+      <w:r>
+        <w:rPr>
+          <w:rFonts w:ascii="Times New Roman" w:cs="Times New Roman" w:eastAsia="Times New Roman" w:hAnsi="Times New Roman"/>
+          <w:b w:val="false"/>
+          <w:bCs w:val="false"/>
+          <w:i/>
+          <w:iCs/>
+          <w:color w:val="1F4E79"/>
+          <w:sz w:val="24"/>
+          <w:szCs w:val="24"/>
+        </w:rPr>
+        <w:t xml:space="preserve">Mots-indices : « … m à … Ar le mètre » (prix unitaire → ×) ; « combien lui rend-on » (écart → −).</w:t>
+      </w:r>
+    </w:p>
+    <w:p>
+      <w:pPr>
+        <w:spacing w:after="70" w:line="300"/>
+        <w:ind w:left="360"/>
+        <w:jc w:val="left"/>
+      </w:pPr>
+      <w:r>
+        <w:rPr>
+          <w:rFonts w:ascii="Times New Roman" w:cs="Times New Roman" w:eastAsia="Times New Roman" w:hAnsi="Times New Roman"/>
+          <w:b w:val="false"/>
+          <w:bCs w:val="false"/>
+          <w:i/>
+          <w:iCs/>
+          <w:color w:val="B25000"/>
+          <w:sz w:val="24"/>
+          <w:szCs w:val="24"/>
+        </w:rPr>
+        <w:t xml:space="preserve">Opérations choisies : multiplication à virgules, puis soustraction.</w:t>
+      </w:r>
+    </w:p>
+    <w:p>
+      <w:pPr>
         <w:spacing w:after="60" w:line="300"/>
         <w:ind w:left="360"/>
         <w:jc w:val="left"/>
@@ -18691,6 +20499,66 @@
           <w:szCs w:val="24"/>
         </w:rPr>
         <w:t xml:space="preserve">Problème 2 — démarche :</w:t>
+      </w:r>
+    </w:p>
+    <w:p>
+      <w:pPr>
+        <w:spacing w:after="50" w:line="300"/>
+        <w:ind w:left="360"/>
+        <w:jc w:val="left"/>
+      </w:pPr>
+      <w:r>
+        <w:rPr>
+          <w:rFonts w:ascii="Times New Roman" w:cs="Times New Roman" w:eastAsia="Times New Roman" w:hAnsi="Times New Roman"/>
+          <w:b w:val="false"/>
+          <w:bCs w:val="false"/>
+          <w:i/>
+          <w:iCs/>
+          <w:color w:val="C2185B"/>
+          <w:sz w:val="24"/>
+          <w:szCs w:val="24"/>
+        </w:rPr>
+        <w:t xml:space="preserve">Question cachée : On additionne les heures avec les heures et les minutes avec les minutes — et si les minutes dépassent 60, on échange contre 1 heure.</w:t>
+      </w:r>
+    </w:p>
+    <w:p>
+      <w:pPr>
+        <w:spacing w:after="50" w:line="300"/>
+        <w:ind w:left="360"/>
+        <w:jc w:val="left"/>
+      </w:pPr>
+      <w:r>
+        <w:rPr>
+          <w:rFonts w:ascii="Times New Roman" w:cs="Times New Roman" w:eastAsia="Times New Roman" w:hAnsi="Times New Roman"/>
+          <w:b w:val="false"/>
+          <w:bCs w:val="false"/>
+          <w:i/>
+          <w:iCs/>
+          <w:color w:val="1F4E79"/>
+          <w:sz w:val="24"/>
+          <w:szCs w:val="24"/>
+        </w:rPr>
+        <w:t xml:space="preserve">Mots-indices : « part à… le trajet dure… » → addition de durées (base 60).</w:t>
+      </w:r>
+    </w:p>
+    <w:p>
+      <w:pPr>
+        <w:spacing w:after="70" w:line="300"/>
+        <w:ind w:left="360"/>
+        <w:jc w:val="left"/>
+      </w:pPr>
+      <w:r>
+        <w:rPr>
+          <w:rFonts w:ascii="Times New Roman" w:cs="Times New Roman" w:eastAsia="Times New Roman" w:hAnsi="Times New Roman"/>
+          <w:b w:val="false"/>
+          <w:bCs w:val="false"/>
+          <w:i/>
+          <w:iCs/>
+          <w:color w:val="B25000"/>
+          <w:sz w:val="24"/>
+          <w:szCs w:val="24"/>
+        </w:rPr>
+        <w:t xml:space="preserve">Opérations choisies : addition sexagésimale : colonne des heures, colonne des minutes, échange à 60.</w:t>
       </w:r>
     </w:p>
     <w:p>
@@ -18937,6 +20805,66 @@
     </w:p>
     <w:p>
       <w:pPr>
+        <w:spacing w:after="50" w:line="300"/>
+        <w:ind w:left="360"/>
+        <w:jc w:val="left"/>
+      </w:pPr>
+      <w:r>
+        <w:rPr>
+          <w:rFonts w:ascii="Times New Roman" w:cs="Times New Roman" w:eastAsia="Times New Roman" w:hAnsi="Times New Roman"/>
+          <w:b w:val="false"/>
+          <w:bCs w:val="false"/>
+          <w:i/>
+          <w:iCs/>
+          <w:color w:val="C2185B"/>
+          <w:sz w:val="24"/>
+          <w:szCs w:val="24"/>
+        </w:rPr>
+        <w:t xml:space="preserve">Question cachée : Combien de « paquets » de … Ar tiennent dans le prix du vélo : l’épargne hebdomadaire est comme un paquet qu’on répète.</w:t>
+      </w:r>
+    </w:p>
+    <w:p>
+      <w:pPr>
+        <w:spacing w:after="50" w:line="300"/>
+        <w:ind w:left="360"/>
+        <w:jc w:val="left"/>
+      </w:pPr>
+      <w:r>
+        <w:rPr>
+          <w:rFonts w:ascii="Times New Roman" w:cs="Times New Roman" w:eastAsia="Times New Roman" w:hAnsi="Times New Roman"/>
+          <w:b w:val="false"/>
+          <w:bCs w:val="false"/>
+          <w:i/>
+          <w:iCs/>
+          <w:color w:val="1F4E79"/>
+          <w:sz w:val="24"/>
+          <w:szCs w:val="24"/>
+        </w:rPr>
+        <w:t xml:space="preserve">Mots-indices : « combien de semaines » → combien de fois → division (groupement).</w:t>
+      </w:r>
+    </w:p>
+    <w:p>
+      <w:pPr>
+        <w:spacing w:after="70" w:line="300"/>
+        <w:ind w:left="360"/>
+        <w:jc w:val="left"/>
+      </w:pPr>
+      <w:r>
+        <w:rPr>
+          <w:rFonts w:ascii="Times New Roman" w:cs="Times New Roman" w:eastAsia="Times New Roman" w:hAnsi="Times New Roman"/>
+          <w:b w:val="false"/>
+          <w:bCs w:val="false"/>
+          <w:i/>
+          <w:iCs/>
+          <w:color w:val="B25000"/>
+          <w:sz w:val="24"/>
+          <w:szCs w:val="24"/>
+        </w:rPr>
+        <w:t xml:space="preserve">Opérations choisies : division : on cherche combien de fois l’épargne entre dans le prix total.</w:t>
+      </w:r>
+    </w:p>
+    <w:p>
+      <w:pPr>
         <w:spacing w:after="60" w:line="300"/>
         <w:ind w:left="360"/>
         <w:jc w:val="left"/>
@@ -19032,6 +20960,66 @@
           <w:szCs w:val="24"/>
         </w:rPr>
         <w:t xml:space="preserve">Problème 2 — démarche :</w:t>
+      </w:r>
+    </w:p>
+    <w:p>
+      <w:pPr>
+        <w:spacing w:after="50" w:line="300"/>
+        <w:ind w:left="360"/>
+        <w:jc w:val="left"/>
+      </w:pPr>
+      <w:r>
+        <w:rPr>
+          <w:rFonts w:ascii="Times New Roman" w:cs="Times New Roman" w:eastAsia="Times New Roman" w:hAnsi="Times New Roman"/>
+          <w:b w:val="false"/>
+          <w:bCs w:val="false"/>
+          <w:i/>
+          <w:iCs/>
+          <w:color w:val="C2185B"/>
+          <w:sz w:val="24"/>
+          <w:szCs w:val="24"/>
+        </w:rPr>
+        <w:t xml:space="preserve">Question cachée : Deux questions bien séparées : d’abord les rangées (division), puis les bus (division avec reste — et il faut l’interpréter !).</w:t>
+      </w:r>
+    </w:p>
+    <w:p>
+      <w:pPr>
+        <w:spacing w:after="50" w:line="300"/>
+        <w:ind w:left="360"/>
+        <w:jc w:val="left"/>
+      </w:pPr>
+      <w:r>
+        <w:rPr>
+          <w:rFonts w:ascii="Times New Roman" w:cs="Times New Roman" w:eastAsia="Times New Roman" w:hAnsi="Times New Roman"/>
+          <w:b w:val="false"/>
+          <w:bCs w:val="false"/>
+          <w:i/>
+          <w:iCs/>
+          <w:color w:val="1F4E79"/>
+          <w:sz w:val="24"/>
+          <w:szCs w:val="24"/>
+        </w:rPr>
+        <w:t xml:space="preserve">Mots-indices : « en rangées de » → ÷ ; « et … enseignants » → + ; « bus de 30 places » → ÷ avec reste.</w:t>
+      </w:r>
+    </w:p>
+    <w:p>
+      <w:pPr>
+        <w:spacing w:after="70" w:line="300"/>
+        <w:ind w:left="360"/>
+        <w:jc w:val="left"/>
+      </w:pPr>
+      <w:r>
+        <w:rPr>
+          <w:rFonts w:ascii="Times New Roman" w:cs="Times New Roman" w:eastAsia="Times New Roman" w:hAnsi="Times New Roman"/>
+          <w:b w:val="false"/>
+          <w:bCs w:val="false"/>
+          <w:i/>
+          <w:iCs/>
+          <w:color w:val="B25000"/>
+          <w:sz w:val="24"/>
+          <w:szCs w:val="24"/>
+        </w:rPr>
+        <w:t xml:space="preserve">Opérations choisies : division, addition, puis division avec interprétation du reste : le reste impose un bus DE PLUS.</w:t>
       </w:r>
     </w:p>
     <w:p>
@@ -19278,6 +21266,66 @@
     </w:p>
     <w:p>
       <w:pPr>
+        <w:spacing w:after="50" w:line="300"/>
+        <w:ind w:left="360"/>
+        <w:jc w:val="left"/>
+      </w:pPr>
+      <w:r>
+        <w:rPr>
+          <w:rFonts w:ascii="Times New Roman" w:cs="Times New Roman" w:eastAsia="Times New Roman" w:hAnsi="Times New Roman"/>
+          <w:b w:val="false"/>
+          <w:bCs w:val="false"/>
+          <w:i/>
+          <w:iCs/>
+          <w:color w:val="C2185B"/>
+          <w:sz w:val="24"/>
+          <w:szCs w:val="24"/>
+        </w:rPr>
+        <w:t xml:space="preserve">Question cachée : Pour rendre la monnaie, il faut d’abord connaître le prix TOTAL des achats : le total est la question cachée.</w:t>
+      </w:r>
+    </w:p>
+    <w:p>
+      <w:pPr>
+        <w:spacing w:after="50" w:line="300"/>
+        <w:ind w:left="360"/>
+        <w:jc w:val="left"/>
+      </w:pPr>
+      <w:r>
+        <w:rPr>
+          <w:rFonts w:ascii="Times New Roman" w:cs="Times New Roman" w:eastAsia="Times New Roman" w:hAnsi="Times New Roman"/>
+          <w:b w:val="false"/>
+          <w:bCs w:val="false"/>
+          <w:i/>
+          <w:iCs/>
+          <w:color w:val="1F4E79"/>
+          <w:sz w:val="24"/>
+          <w:szCs w:val="24"/>
+        </w:rPr>
+        <w:t xml:space="preserve">Mots-indices : « à … Ar le kapoaka » (prix unitaire → ×) ; « et un savon » (réunion → +) ; « combien lui rend-on » (écart → −).</w:t>
+      </w:r>
+    </w:p>
+    <w:p>
+      <w:pPr>
+        <w:spacing w:after="70" w:line="300"/>
+        <w:ind w:left="360"/>
+        <w:jc w:val="left"/>
+      </w:pPr>
+      <w:r>
+        <w:rPr>
+          <w:rFonts w:ascii="Times New Roman" w:cs="Times New Roman" w:eastAsia="Times New Roman" w:hAnsi="Times New Roman"/>
+          <w:b w:val="false"/>
+          <w:bCs w:val="false"/>
+          <w:i/>
+          <w:iCs/>
+          <w:color w:val="B25000"/>
+          <w:sz w:val="24"/>
+          <w:szCs w:val="24"/>
+        </w:rPr>
+        <w:t xml:space="preserve">Opérations choisies : multiplication (prix du riz), puis addition (total), puis soustraction (monnaie rendue).</w:t>
+      </w:r>
+    </w:p>
+    <w:p>
+      <w:pPr>
         <w:spacing w:after="60" w:line="300"/>
         <w:ind w:left="360"/>
         <w:jc w:val="left"/>
@@ -19373,6 +21421,66 @@
           <w:szCs w:val="24"/>
         </w:rPr>
         <w:t xml:space="preserve">Problème 2 — démarche :</w:t>
+      </w:r>
+    </w:p>
+    <w:p>
+      <w:pPr>
+        <w:spacing w:after="50" w:line="300"/>
+        <w:ind w:left="360"/>
+        <w:jc w:val="left"/>
+      </w:pPr>
+      <w:r>
+        <w:rPr>
+          <w:rFonts w:ascii="Times New Roman" w:cs="Times New Roman" w:eastAsia="Times New Roman" w:hAnsi="Times New Roman"/>
+          <w:b w:val="false"/>
+          <w:bCs w:val="false"/>
+          <w:i/>
+          <w:iCs/>
+          <w:color w:val="C2185B"/>
+          <w:sz w:val="24"/>
+          <w:szCs w:val="24"/>
+        </w:rPr>
+        <w:t xml:space="preserve">Question cachée : On ne peut diviser que des grammes par des grammes : la conversion kg → g est la question cachée.</w:t>
+      </w:r>
+    </w:p>
+    <w:p>
+      <w:pPr>
+        <w:spacing w:after="50" w:line="300"/>
+        <w:ind w:left="360"/>
+        <w:jc w:val="left"/>
+      </w:pPr>
+      <w:r>
+        <w:rPr>
+          <w:rFonts w:ascii="Times New Roman" w:cs="Times New Roman" w:eastAsia="Times New Roman" w:hAnsi="Times New Roman"/>
+          <w:b w:val="false"/>
+          <w:bCs w:val="false"/>
+          <w:i/>
+          <w:iCs/>
+          <w:color w:val="1F4E79"/>
+          <w:sz w:val="24"/>
+          <w:szCs w:val="24"/>
+        </w:rPr>
+        <w:t xml:space="preserve">Mots-indices : « partage… en sachets de » → division ; « kg » et « g » dans le même énoncé → conversion d’abord.</w:t>
+      </w:r>
+    </w:p>
+    <w:p>
+      <w:pPr>
+        <w:spacing w:after="70" w:line="300"/>
+        <w:ind w:left="360"/>
+        <w:jc w:val="left"/>
+      </w:pPr>
+      <w:r>
+        <w:rPr>
+          <w:rFonts w:ascii="Times New Roman" w:cs="Times New Roman" w:eastAsia="Times New Roman" w:hAnsi="Times New Roman"/>
+          <w:b w:val="false"/>
+          <w:bCs w:val="false"/>
+          <w:i/>
+          <w:iCs/>
+          <w:color w:val="B25000"/>
+          <w:sz w:val="24"/>
+          <w:szCs w:val="24"/>
+        </w:rPr>
+        <w:t xml:space="preserve">Opérations choisies : conversion, puis division euclidienne : combien de paquets de … g dans … g, et que reste-t-il ?</w:t>
       </w:r>
     </w:p>
     <w:p>
@@ -19619,6 +21727,66 @@
     </w:p>
     <w:p>
       <w:pPr>
+        <w:spacing w:after="50" w:line="300"/>
+        <w:ind w:left="360"/>
+        <w:jc w:val="left"/>
+      </w:pPr>
+      <w:r>
+        <w:rPr>
+          <w:rFonts w:ascii="Times New Roman" w:cs="Times New Roman" w:eastAsia="Times New Roman" w:hAnsi="Times New Roman"/>
+          <w:b w:val="false"/>
+          <w:bCs w:val="false"/>
+          <w:i/>
+          <w:iCs/>
+          <w:color w:val="C2185B"/>
+          <w:sz w:val="24"/>
+          <w:szCs w:val="24"/>
+        </w:rPr>
+        <w:t xml:space="preserve">Question cachée : La consommation est donnée pour 100 km, on la cherche pour un autre trajet : c’est un tableau de proportionnalité.</w:t>
+      </w:r>
+    </w:p>
+    <w:p>
+      <w:pPr>
+        <w:spacing w:after="50" w:line="300"/>
+        <w:ind w:left="360"/>
+        <w:jc w:val="left"/>
+      </w:pPr>
+      <w:r>
+        <w:rPr>
+          <w:rFonts w:ascii="Times New Roman" w:cs="Times New Roman" w:eastAsia="Times New Roman" w:hAnsi="Times New Roman"/>
+          <w:b w:val="false"/>
+          <w:bCs w:val="false"/>
+          <w:i/>
+          <w:iCs/>
+          <w:color w:val="1F4E79"/>
+          <w:sz w:val="24"/>
+          <w:szCs w:val="24"/>
+        </w:rPr>
+        <w:t xml:space="preserve">Mots-indices : « … L pour 100 km… pour … km ? » → proportionnalité (produit en croix ou retour à l’unité).</w:t>
+      </w:r>
+    </w:p>
+    <w:p>
+      <w:pPr>
+        <w:spacing w:after="70" w:line="300"/>
+        <w:ind w:left="360"/>
+        <w:jc w:val="left"/>
+      </w:pPr>
+      <w:r>
+        <w:rPr>
+          <w:rFonts w:ascii="Times New Roman" w:cs="Times New Roman" w:eastAsia="Times New Roman" w:hAnsi="Times New Roman"/>
+          <w:b w:val="false"/>
+          <w:bCs w:val="false"/>
+          <w:i/>
+          <w:iCs/>
+          <w:color w:val="B25000"/>
+          <w:sz w:val="24"/>
+          <w:szCs w:val="24"/>
+        </w:rPr>
+        <w:t xml:space="preserve">Opérations choisies : multiplication et division par le coefficient : on raisonne par paquets de 100 km.</w:t>
+      </w:r>
+    </w:p>
+    <w:p>
+      <w:pPr>
         <w:spacing w:after="60" w:line="300"/>
         <w:ind w:left="360"/>
         <w:jc w:val="left"/>
@@ -19714,6 +21882,66 @@
           <w:szCs w:val="24"/>
         </w:rPr>
         <w:t xml:space="preserve">Problème 2 — démarche :</w:t>
+      </w:r>
+    </w:p>
+    <w:p>
+      <w:pPr>
+        <w:spacing w:after="50" w:line="300"/>
+        <w:ind w:left="360"/>
+        <w:jc w:val="left"/>
+      </w:pPr>
+      <w:r>
+        <w:rPr>
+          <w:rFonts w:ascii="Times New Roman" w:cs="Times New Roman" w:eastAsia="Times New Roman" w:hAnsi="Times New Roman"/>
+          <w:b w:val="false"/>
+          <w:bCs w:val="false"/>
+          <w:i/>
+          <w:iCs/>
+          <w:color w:val="C2185B"/>
+          <w:sz w:val="24"/>
+          <w:szCs w:val="24"/>
+        </w:rPr>
+        <w:t xml:space="preserve">Question cachée : Le grillage suit le TOUR du champ : le périmètre est la question cachée — impossible d’acheter des mètres sans connaître le tour !</w:t>
+      </w:r>
+    </w:p>
+    <w:p>
+      <w:pPr>
+        <w:spacing w:after="50" w:line="300"/>
+        <w:ind w:left="360"/>
+        <w:jc w:val="left"/>
+      </w:pPr>
+      <w:r>
+        <w:rPr>
+          <w:rFonts w:ascii="Times New Roman" w:cs="Times New Roman" w:eastAsia="Times New Roman" w:hAnsi="Times New Roman"/>
+          <w:b w:val="false"/>
+          <w:bCs w:val="false"/>
+          <w:i/>
+          <w:iCs/>
+          <w:color w:val="1F4E79"/>
+          <w:sz w:val="24"/>
+          <w:szCs w:val="24"/>
+        </w:rPr>
+        <w:t xml:space="preserve">Mots-indices : « clôturer » → le tour → périmètre ; « … Ar le mètre » → × ensuite.</w:t>
+      </w:r>
+    </w:p>
+    <w:p>
+      <w:pPr>
+        <w:spacing w:after="70" w:line="300"/>
+        <w:ind w:left="360"/>
+        <w:jc w:val="left"/>
+      </w:pPr>
+      <w:r>
+        <w:rPr>
+          <w:rFonts w:ascii="Times New Roman" w:cs="Times New Roman" w:eastAsia="Times New Roman" w:hAnsi="Times New Roman"/>
+          <w:b w:val="false"/>
+          <w:bCs w:val="false"/>
+          <w:i/>
+          <w:iCs/>
+          <w:color w:val="B25000"/>
+          <w:sz w:val="24"/>
+          <w:szCs w:val="24"/>
+        </w:rPr>
+        <w:t xml:space="preserve">Opérations choisies : périmètre (L + l) × 2, puis multiplication par le prix du mètre.</w:t>
       </w:r>
     </w:p>
     <w:p>
@@ -19967,6 +22195,66 @@
     </w:p>
     <w:p>
       <w:pPr>
+        <w:spacing w:after="50" w:line="300"/>
+        <w:ind w:left="360"/>
+        <w:jc w:val="left"/>
+      </w:pPr>
+      <w:r>
+        <w:rPr>
+          <w:rFonts w:ascii="Times New Roman" w:cs="Times New Roman" w:eastAsia="Times New Roman" w:hAnsi="Times New Roman"/>
+          <w:b w:val="false"/>
+          <w:bCs w:val="false"/>
+          <w:i/>
+          <w:iCs/>
+          <w:color w:val="C2185B"/>
+          <w:sz w:val="24"/>
+          <w:szCs w:val="24"/>
+        </w:rPr>
+        <w:t xml:space="preserve">Question cachée : Une dalle couvre exactement 1 m² : le nombre de dalles est donc l’AIRE de la salle.</w:t>
+      </w:r>
+    </w:p>
+    <w:p>
+      <w:pPr>
+        <w:spacing w:after="50" w:line="300"/>
+        <w:ind w:left="360"/>
+        <w:jc w:val="left"/>
+      </w:pPr>
+      <w:r>
+        <w:rPr>
+          <w:rFonts w:ascii="Times New Roman" w:cs="Times New Roman" w:eastAsia="Times New Roman" w:hAnsi="Times New Roman"/>
+          <w:b w:val="false"/>
+          <w:bCs w:val="false"/>
+          <w:i/>
+          <w:iCs/>
+          <w:color w:val="1F4E79"/>
+          <w:sz w:val="24"/>
+          <w:szCs w:val="24"/>
+        </w:rPr>
+        <w:t xml:space="preserve">Mots-indices : « carreler… dalles de 1 m² » → aire ; « pour quel prix total » → ×.</w:t>
+      </w:r>
+    </w:p>
+    <w:p>
+      <w:pPr>
+        <w:spacing w:after="70" w:line="300"/>
+        <w:ind w:left="360"/>
+        <w:jc w:val="left"/>
+      </w:pPr>
+      <w:r>
+        <w:rPr>
+          <w:rFonts w:ascii="Times New Roman" w:cs="Times New Roman" w:eastAsia="Times New Roman" w:hAnsi="Times New Roman"/>
+          <w:b w:val="false"/>
+          <w:bCs w:val="false"/>
+          <w:i/>
+          <w:iCs/>
+          <w:color w:val="B25000"/>
+          <w:sz w:val="24"/>
+          <w:szCs w:val="24"/>
+        </w:rPr>
+        <w:t xml:space="preserve">Opérations choisies : aire L × l, puis multiplication par le prix de la dalle.</w:t>
+      </w:r>
+    </w:p>
+    <w:p>
+      <w:pPr>
         <w:spacing w:after="60" w:line="300"/>
         <w:ind w:left="360"/>
         <w:jc w:val="left"/>
@@ -20066,22 +22354,22 @@
     </w:p>
     <w:p>
       <w:pPr>
-        <w:spacing w:after="60" w:line="300"/>
-        <w:ind w:left="360"/>
-        <w:jc w:val="left"/>
-      </w:pPr>
-      <w:r>
-        <w:rPr>
-          <w:rFonts w:ascii="Times New Roman" w:cs="Times New Roman" w:eastAsia="Times New Roman" w:hAnsi="Times New Roman"/>
-          <w:b w:val="false"/>
-          <w:bCs w:val="false"/>
-          <w:i w:val="false"/>
-          <w:iCs w:val="false"/>
-          <w:color w:val="000000"/>
-          <w:sz w:val="24"/>
-          <w:szCs w:val="24"/>
-        </w:rPr>
-        <w:t xml:space="preserve">Étape 1 — Quantité vendue : </w:t>
+        <w:spacing w:after="50" w:line="300"/>
+        <w:ind w:left="360"/>
+        <w:jc w:val="left"/>
+      </w:pPr>
+      <w:r>
+        <w:rPr>
+          <w:rFonts w:ascii="Times New Roman" w:cs="Times New Roman" w:eastAsia="Times New Roman" w:hAnsi="Times New Roman"/>
+          <w:b w:val="false"/>
+          <w:bCs w:val="false"/>
+          <w:i/>
+          <w:iCs/>
+          <w:color w:val="C2185B"/>
+          <w:sz w:val="24"/>
+          <w:szCs w:val="24"/>
+        </w:rPr>
+        <w:t xml:space="preserve">Question cachée : Vendre les </w:t>
       </w:r>
       <m:oMath>
         <m:f>
@@ -20102,59 +22390,39 @@
           <w:rFonts w:ascii="Times New Roman" w:cs="Times New Roman" w:eastAsia="Times New Roman" w:hAnsi="Times New Roman"/>
           <w:b w:val="false"/>
           <w:bCs w:val="false"/>
-          <w:i w:val="false"/>
-          <w:iCs w:val="false"/>
-          <w:color w:val="000000"/>
-          <w:sz w:val="24"/>
-          <w:szCs w:val="24"/>
-        </w:rPr>
-        <w:t xml:space="preserve">de 120 = (120 ÷ 4) × 3 = 30 × 3 = 90 kg.</w:t>
-      </w:r>
-    </w:p>
-    <w:p>
-      <w:pPr>
-        <w:spacing w:after="60" w:line="300"/>
-        <w:ind w:left="360"/>
-        <w:jc w:val="left"/>
-      </w:pPr>
-      <w:r>
-        <w:rPr>
-          <w:rFonts w:ascii="Times New Roman" w:cs="Times New Roman" w:eastAsia="Times New Roman" w:hAnsi="Times New Roman"/>
-          <w:b w:val="false"/>
-          <w:bCs w:val="false"/>
-          <w:i w:val="false"/>
-          <w:iCs w:val="false"/>
-          <w:color w:val="000000"/>
-          <w:sz w:val="24"/>
-          <w:szCs w:val="24"/>
-        </w:rPr>
-        <w:t xml:space="preserve">Étape 2 — Recette : 90 × 2 000 = 180 000 Ar.</w:t>
-      </w:r>
-    </w:p>
-    <w:p>
-      <w:pPr>
-        <w:spacing w:after="60" w:line="300"/>
-        <w:ind w:left="360"/>
-        <w:jc w:val="left"/>
-      </w:pPr>
-      <w:r>
-        <w:rPr>
-          <w:rFonts w:ascii="Times New Roman" w:cs="Times New Roman" w:eastAsia="Times New Roman" w:hAnsi="Times New Roman"/>
-          <w:b w:val="false"/>
-          <w:bCs w:val="false"/>
-          <w:i w:val="false"/>
-          <w:iCs w:val="false"/>
-          <w:color w:val="000000"/>
-          <w:sz w:val="24"/>
-          <w:szCs w:val="24"/>
-        </w:rPr>
-        <w:t xml:space="preserve">Étape 3 — Part gardée : 120 − 90 = 30 kg (c’est bien </w:t>
+          <w:i/>
+          <w:iCs/>
+          <w:color w:val="C2185B"/>
+          <w:sz w:val="24"/>
+          <w:szCs w:val="24"/>
+        </w:rPr>
+        <w:t xml:space="preserve">oblige à calculer D’ABORD cette quantité en kilos : c’est la question cachée.</w:t>
+      </w:r>
+    </w:p>
+    <w:p>
+      <w:pPr>
+        <w:spacing w:after="50" w:line="300"/>
+        <w:ind w:left="360"/>
+        <w:jc w:val="left"/>
+      </w:pPr>
+      <w:r>
+        <w:rPr>
+          <w:rFonts w:ascii="Times New Roman" w:cs="Times New Roman" w:eastAsia="Times New Roman" w:hAnsi="Times New Roman"/>
+          <w:b w:val="false"/>
+          <w:bCs w:val="false"/>
+          <w:i/>
+          <w:iCs/>
+          <w:color w:val="1F4E79"/>
+          <w:sz w:val="24"/>
+          <w:szCs w:val="24"/>
+        </w:rPr>
+        <w:t xml:space="preserve">Mots-indices : « les </w:t>
       </w:r>
       <m:oMath>
         <m:f>
           <m:num>
             <m:r>
-              <m:t>1</m:t>
+              <m:t>3</m:t>
             </m:r>
           </m:num>
           <m:den>
@@ -20169,6 +22437,140 @@
           <w:rFonts w:ascii="Times New Roman" w:cs="Times New Roman" w:eastAsia="Times New Roman" w:hAnsi="Times New Roman"/>
           <w:b w:val="false"/>
           <w:bCs w:val="false"/>
+          <w:i/>
+          <w:iCs/>
+          <w:color w:val="1F4E79"/>
+          <w:sz w:val="24"/>
+          <w:szCs w:val="24"/>
+        </w:rPr>
+        <w:t xml:space="preserve">de » → fraction de la récolte (÷ 4 puis × 3) ; « au kilo » → × par le prix.</w:t>
+      </w:r>
+    </w:p>
+    <w:p>
+      <w:pPr>
+        <w:spacing w:after="70" w:line="300"/>
+        <w:ind w:left="360"/>
+        <w:jc w:val="left"/>
+      </w:pPr>
+      <w:r>
+        <w:rPr>
+          <w:rFonts w:ascii="Times New Roman" w:cs="Times New Roman" w:eastAsia="Times New Roman" w:hAnsi="Times New Roman"/>
+          <w:b w:val="false"/>
+          <w:bCs w:val="false"/>
+          <w:i/>
+          <w:iCs/>
+          <w:color w:val="B25000"/>
+          <w:sz w:val="24"/>
+          <w:szCs w:val="24"/>
+        </w:rPr>
+        <w:t xml:space="preserve">Opérations choisies : fraction de la récolte, puis multiplication pour la recette, puis soustraction pour la part gardée.</w:t>
+      </w:r>
+    </w:p>
+    <w:p>
+      <w:pPr>
+        <w:spacing w:after="60" w:line="300"/>
+        <w:ind w:left="360"/>
+        <w:jc w:val="left"/>
+      </w:pPr>
+      <w:r>
+        <w:rPr>
+          <w:rFonts w:ascii="Times New Roman" w:cs="Times New Roman" w:eastAsia="Times New Roman" w:hAnsi="Times New Roman"/>
+          <w:b w:val="false"/>
+          <w:bCs w:val="false"/>
+          <w:i w:val="false"/>
+          <w:iCs w:val="false"/>
+          <w:color w:val="000000"/>
+          <w:sz w:val="24"/>
+          <w:szCs w:val="24"/>
+        </w:rPr>
+        <w:t xml:space="preserve">Étape 1 — Quantité vendue : </w:t>
+      </w:r>
+      <m:oMath>
+        <m:f>
+          <m:num>
+            <m:r>
+              <m:t>3</m:t>
+            </m:r>
+          </m:num>
+          <m:den>
+            <m:r>
+              <m:t>4</m:t>
+            </m:r>
+          </m:den>
+        </m:f>
+      </m:oMath>
+      <w:r>
+        <w:rPr>
+          <w:rFonts w:ascii="Times New Roman" w:cs="Times New Roman" w:eastAsia="Times New Roman" w:hAnsi="Times New Roman"/>
+          <w:b w:val="false"/>
+          <w:bCs w:val="false"/>
+          <w:i w:val="false"/>
+          <w:iCs w:val="false"/>
+          <w:color w:val="000000"/>
+          <w:sz w:val="24"/>
+          <w:szCs w:val="24"/>
+        </w:rPr>
+        <w:t xml:space="preserve">de 120 = (120 ÷ 4) × 3 = 30 × 3 = 90 kg.</w:t>
+      </w:r>
+    </w:p>
+    <w:p>
+      <w:pPr>
+        <w:spacing w:after="60" w:line="300"/>
+        <w:ind w:left="360"/>
+        <w:jc w:val="left"/>
+      </w:pPr>
+      <w:r>
+        <w:rPr>
+          <w:rFonts w:ascii="Times New Roman" w:cs="Times New Roman" w:eastAsia="Times New Roman" w:hAnsi="Times New Roman"/>
+          <w:b w:val="false"/>
+          <w:bCs w:val="false"/>
+          <w:i w:val="false"/>
+          <w:iCs w:val="false"/>
+          <w:color w:val="000000"/>
+          <w:sz w:val="24"/>
+          <w:szCs w:val="24"/>
+        </w:rPr>
+        <w:t xml:space="preserve">Étape 2 — Recette : 90 × 2 000 = 180 000 Ar.</w:t>
+      </w:r>
+    </w:p>
+    <w:p>
+      <w:pPr>
+        <w:spacing w:after="60" w:line="300"/>
+        <w:ind w:left="360"/>
+        <w:jc w:val="left"/>
+      </w:pPr>
+      <w:r>
+        <w:rPr>
+          <w:rFonts w:ascii="Times New Roman" w:cs="Times New Roman" w:eastAsia="Times New Roman" w:hAnsi="Times New Roman"/>
+          <w:b w:val="false"/>
+          <w:bCs w:val="false"/>
+          <w:i w:val="false"/>
+          <w:iCs w:val="false"/>
+          <w:color w:val="000000"/>
+          <w:sz w:val="24"/>
+          <w:szCs w:val="24"/>
+        </w:rPr>
+        <w:t xml:space="preserve">Étape 3 — Part gardée : 120 − 90 = 30 kg (c’est bien </w:t>
+      </w:r>
+      <m:oMath>
+        <m:f>
+          <m:num>
+            <m:r>
+              <m:t>1</m:t>
+            </m:r>
+          </m:num>
+          <m:den>
+            <m:r>
+              <m:t>4</m:t>
+            </m:r>
+          </m:den>
+        </m:f>
+      </m:oMath>
+      <w:r>
+        <w:rPr>
+          <w:rFonts w:ascii="Times New Roman" w:cs="Times New Roman" w:eastAsia="Times New Roman" w:hAnsi="Times New Roman"/>
+          <w:b w:val="false"/>
+          <w:bCs w:val="false"/>
           <w:i w:val="false"/>
           <w:iCs w:val="false"/>
           <w:color w:val="000000"/>
@@ -20362,6 +22764,66 @@
     </w:p>
     <w:p>
       <w:pPr>
+        <w:spacing w:after="50" w:line="300"/>
+        <w:ind w:left="360"/>
+        <w:jc w:val="left"/>
+      </w:pPr>
+      <w:r>
+        <w:rPr>
+          <w:rFonts w:ascii="Times New Roman" w:cs="Times New Roman" w:eastAsia="Times New Roman" w:hAnsi="Times New Roman"/>
+          <w:b w:val="false"/>
+          <w:bCs w:val="false"/>
+          <w:i/>
+          <w:iCs/>
+          <w:color w:val="C2185B"/>
+          <w:sz w:val="24"/>
+          <w:szCs w:val="24"/>
+        </w:rPr>
+        <w:t xml:space="preserve">Question cachée : Le prix du tissu d’abord, la monnaie ensuite : on ne rend pas la monnaie sans connaître le total.</w:t>
+      </w:r>
+    </w:p>
+    <w:p>
+      <w:pPr>
+        <w:spacing w:after="50" w:line="300"/>
+        <w:ind w:left="360"/>
+        <w:jc w:val="left"/>
+      </w:pPr>
+      <w:r>
+        <w:rPr>
+          <w:rFonts w:ascii="Times New Roman" w:cs="Times New Roman" w:eastAsia="Times New Roman" w:hAnsi="Times New Roman"/>
+          <w:b w:val="false"/>
+          <w:bCs w:val="false"/>
+          <w:i/>
+          <w:iCs/>
+          <w:color w:val="1F4E79"/>
+          <w:sz w:val="24"/>
+          <w:szCs w:val="24"/>
+        </w:rPr>
+        <w:t xml:space="preserve">Mots-indices : « … m à … Ar le mètre » (prix unitaire → ×) ; « combien lui rend-on » (écart → −).</w:t>
+      </w:r>
+    </w:p>
+    <w:p>
+      <w:pPr>
+        <w:spacing w:after="70" w:line="300"/>
+        <w:ind w:left="360"/>
+        <w:jc w:val="left"/>
+      </w:pPr>
+      <w:r>
+        <w:rPr>
+          <w:rFonts w:ascii="Times New Roman" w:cs="Times New Roman" w:eastAsia="Times New Roman" w:hAnsi="Times New Roman"/>
+          <w:b w:val="false"/>
+          <w:bCs w:val="false"/>
+          <w:i/>
+          <w:iCs/>
+          <w:color w:val="B25000"/>
+          <w:sz w:val="24"/>
+          <w:szCs w:val="24"/>
+        </w:rPr>
+        <w:t xml:space="preserve">Opérations choisies : multiplication à virgules, puis soustraction.</w:t>
+      </w:r>
+    </w:p>
+    <w:p>
+      <w:pPr>
         <w:spacing w:after="60" w:line="300"/>
         <w:ind w:left="360"/>
         <w:jc w:val="left"/>
@@ -20437,6 +22899,66 @@
           <w:szCs w:val="24"/>
         </w:rPr>
         <w:t xml:space="preserve">Problème 2 — démarche :</w:t>
+      </w:r>
+    </w:p>
+    <w:p>
+      <w:pPr>
+        <w:spacing w:after="50" w:line="300"/>
+        <w:ind w:left="360"/>
+        <w:jc w:val="left"/>
+      </w:pPr>
+      <w:r>
+        <w:rPr>
+          <w:rFonts w:ascii="Times New Roman" w:cs="Times New Roman" w:eastAsia="Times New Roman" w:hAnsi="Times New Roman"/>
+          <w:b w:val="false"/>
+          <w:bCs w:val="false"/>
+          <w:i/>
+          <w:iCs/>
+          <w:color w:val="C2185B"/>
+          <w:sz w:val="24"/>
+          <w:szCs w:val="24"/>
+        </w:rPr>
+        <w:t xml:space="preserve">Question cachée : On additionne les heures avec les heures et les minutes avec les minutes — et si les minutes dépassent 60, on échange contre 1 heure.</w:t>
+      </w:r>
+    </w:p>
+    <w:p>
+      <w:pPr>
+        <w:spacing w:after="50" w:line="300"/>
+        <w:ind w:left="360"/>
+        <w:jc w:val="left"/>
+      </w:pPr>
+      <w:r>
+        <w:rPr>
+          <w:rFonts w:ascii="Times New Roman" w:cs="Times New Roman" w:eastAsia="Times New Roman" w:hAnsi="Times New Roman"/>
+          <w:b w:val="false"/>
+          <w:bCs w:val="false"/>
+          <w:i/>
+          <w:iCs/>
+          <w:color w:val="1F4E79"/>
+          <w:sz w:val="24"/>
+          <w:szCs w:val="24"/>
+        </w:rPr>
+        <w:t xml:space="preserve">Mots-indices : « part à… le trajet dure… » → addition de durées (base 60).</w:t>
+      </w:r>
+    </w:p>
+    <w:p>
+      <w:pPr>
+        <w:spacing w:after="70" w:line="300"/>
+        <w:ind w:left="360"/>
+        <w:jc w:val="left"/>
+      </w:pPr>
+      <w:r>
+        <w:rPr>
+          <w:rFonts w:ascii="Times New Roman" w:cs="Times New Roman" w:eastAsia="Times New Roman" w:hAnsi="Times New Roman"/>
+          <w:b w:val="false"/>
+          <w:bCs w:val="false"/>
+          <w:i/>
+          <w:iCs/>
+          <w:color w:val="B25000"/>
+          <w:sz w:val="24"/>
+          <w:szCs w:val="24"/>
+        </w:rPr>
+        <w:t xml:space="preserve">Opérations choisies : addition sexagésimale : colonne des heures, colonne des minutes, échange à 60.</w:t>
       </w:r>
     </w:p>
     <w:p>
@@ -20683,6 +23205,66 @@
     </w:p>
     <w:p>
       <w:pPr>
+        <w:spacing w:after="50" w:line="300"/>
+        <w:ind w:left="360"/>
+        <w:jc w:val="left"/>
+      </w:pPr>
+      <w:r>
+        <w:rPr>
+          <w:rFonts w:ascii="Times New Roman" w:cs="Times New Roman" w:eastAsia="Times New Roman" w:hAnsi="Times New Roman"/>
+          <w:b w:val="false"/>
+          <w:bCs w:val="false"/>
+          <w:i/>
+          <w:iCs/>
+          <w:color w:val="C2185B"/>
+          <w:sz w:val="24"/>
+          <w:szCs w:val="24"/>
+        </w:rPr>
+        <w:t xml:space="preserve">Question cachée : Combien de « paquets » de … Ar tiennent dans le prix du vélo : l’épargne hebdomadaire est comme un paquet qu’on répète.</w:t>
+      </w:r>
+    </w:p>
+    <w:p>
+      <w:pPr>
+        <w:spacing w:after="50" w:line="300"/>
+        <w:ind w:left="360"/>
+        <w:jc w:val="left"/>
+      </w:pPr>
+      <w:r>
+        <w:rPr>
+          <w:rFonts w:ascii="Times New Roman" w:cs="Times New Roman" w:eastAsia="Times New Roman" w:hAnsi="Times New Roman"/>
+          <w:b w:val="false"/>
+          <w:bCs w:val="false"/>
+          <w:i/>
+          <w:iCs/>
+          <w:color w:val="1F4E79"/>
+          <w:sz w:val="24"/>
+          <w:szCs w:val="24"/>
+        </w:rPr>
+        <w:t xml:space="preserve">Mots-indices : « combien de semaines » → combien de fois → division (groupement).</w:t>
+      </w:r>
+    </w:p>
+    <w:p>
+      <w:pPr>
+        <w:spacing w:after="70" w:line="300"/>
+        <w:ind w:left="360"/>
+        <w:jc w:val="left"/>
+      </w:pPr>
+      <w:r>
+        <w:rPr>
+          <w:rFonts w:ascii="Times New Roman" w:cs="Times New Roman" w:eastAsia="Times New Roman" w:hAnsi="Times New Roman"/>
+          <w:b w:val="false"/>
+          <w:bCs w:val="false"/>
+          <w:i/>
+          <w:iCs/>
+          <w:color w:val="B25000"/>
+          <w:sz w:val="24"/>
+          <w:szCs w:val="24"/>
+        </w:rPr>
+        <w:t xml:space="preserve">Opérations choisies : division : on cherche combien de fois l’épargne entre dans le prix total.</w:t>
+      </w:r>
+    </w:p>
+    <w:p>
+      <w:pPr>
         <w:spacing w:after="60" w:line="300"/>
         <w:ind w:left="360"/>
         <w:jc w:val="left"/>
@@ -20778,6 +23360,66 @@
           <w:szCs w:val="24"/>
         </w:rPr>
         <w:t xml:space="preserve">Problème 2 — démarche :</w:t>
+      </w:r>
+    </w:p>
+    <w:p>
+      <w:pPr>
+        <w:spacing w:after="50" w:line="300"/>
+        <w:ind w:left="360"/>
+        <w:jc w:val="left"/>
+      </w:pPr>
+      <w:r>
+        <w:rPr>
+          <w:rFonts w:ascii="Times New Roman" w:cs="Times New Roman" w:eastAsia="Times New Roman" w:hAnsi="Times New Roman"/>
+          <w:b w:val="false"/>
+          <w:bCs w:val="false"/>
+          <w:i/>
+          <w:iCs/>
+          <w:color w:val="C2185B"/>
+          <w:sz w:val="24"/>
+          <w:szCs w:val="24"/>
+        </w:rPr>
+        <w:t xml:space="preserve">Question cachée : Deux questions bien séparées : d’abord les rangées (division), puis les bus (division avec reste — et il faut l’interpréter !).</w:t>
+      </w:r>
+    </w:p>
+    <w:p>
+      <w:pPr>
+        <w:spacing w:after="50" w:line="300"/>
+        <w:ind w:left="360"/>
+        <w:jc w:val="left"/>
+      </w:pPr>
+      <w:r>
+        <w:rPr>
+          <w:rFonts w:ascii="Times New Roman" w:cs="Times New Roman" w:eastAsia="Times New Roman" w:hAnsi="Times New Roman"/>
+          <w:b w:val="false"/>
+          <w:bCs w:val="false"/>
+          <w:i/>
+          <w:iCs/>
+          <w:color w:val="1F4E79"/>
+          <w:sz w:val="24"/>
+          <w:szCs w:val="24"/>
+        </w:rPr>
+        <w:t xml:space="preserve">Mots-indices : « en rangées de » → ÷ ; « et … enseignants » → + ; « bus de 30 places » → ÷ avec reste.</w:t>
+      </w:r>
+    </w:p>
+    <w:p>
+      <w:pPr>
+        <w:spacing w:after="70" w:line="300"/>
+        <w:ind w:left="360"/>
+        <w:jc w:val="left"/>
+      </w:pPr>
+      <w:r>
+        <w:rPr>
+          <w:rFonts w:ascii="Times New Roman" w:cs="Times New Roman" w:eastAsia="Times New Roman" w:hAnsi="Times New Roman"/>
+          <w:b w:val="false"/>
+          <w:bCs w:val="false"/>
+          <w:i/>
+          <w:iCs/>
+          <w:color w:val="B25000"/>
+          <w:sz w:val="24"/>
+          <w:szCs w:val="24"/>
+        </w:rPr>
+        <w:t xml:space="preserve">Opérations choisies : division, addition, puis division avec interprétation du reste : le reste impose un bus DE PLUS.</w:t>
       </w:r>
     </w:p>
     <w:p>
@@ -21024,6 +23666,66 @@
     </w:p>
     <w:p>
       <w:pPr>
+        <w:spacing w:after="50" w:line="300"/>
+        <w:ind w:left="360"/>
+        <w:jc w:val="left"/>
+      </w:pPr>
+      <w:r>
+        <w:rPr>
+          <w:rFonts w:ascii="Times New Roman" w:cs="Times New Roman" w:eastAsia="Times New Roman" w:hAnsi="Times New Roman"/>
+          <w:b w:val="false"/>
+          <w:bCs w:val="false"/>
+          <w:i/>
+          <w:iCs/>
+          <w:color w:val="C2185B"/>
+          <w:sz w:val="24"/>
+          <w:szCs w:val="24"/>
+        </w:rPr>
+        <w:t xml:space="preserve">Question cachée : Pour rendre la monnaie, il faut d’abord connaître le prix TOTAL des achats : le total est la question cachée.</w:t>
+      </w:r>
+    </w:p>
+    <w:p>
+      <w:pPr>
+        <w:spacing w:after="50" w:line="300"/>
+        <w:ind w:left="360"/>
+        <w:jc w:val="left"/>
+      </w:pPr>
+      <w:r>
+        <w:rPr>
+          <w:rFonts w:ascii="Times New Roman" w:cs="Times New Roman" w:eastAsia="Times New Roman" w:hAnsi="Times New Roman"/>
+          <w:b w:val="false"/>
+          <w:bCs w:val="false"/>
+          <w:i/>
+          <w:iCs/>
+          <w:color w:val="1F4E79"/>
+          <w:sz w:val="24"/>
+          <w:szCs w:val="24"/>
+        </w:rPr>
+        <w:t xml:space="preserve">Mots-indices : « à … Ar le kapoaka » (prix unitaire → ×) ; « et un savon » (réunion → +) ; « combien lui rend-on » (écart → −).</w:t>
+      </w:r>
+    </w:p>
+    <w:p>
+      <w:pPr>
+        <w:spacing w:after="70" w:line="300"/>
+        <w:ind w:left="360"/>
+        <w:jc w:val="left"/>
+      </w:pPr>
+      <w:r>
+        <w:rPr>
+          <w:rFonts w:ascii="Times New Roman" w:cs="Times New Roman" w:eastAsia="Times New Roman" w:hAnsi="Times New Roman"/>
+          <w:b w:val="false"/>
+          <w:bCs w:val="false"/>
+          <w:i/>
+          <w:iCs/>
+          <w:color w:val="B25000"/>
+          <w:sz w:val="24"/>
+          <w:szCs w:val="24"/>
+        </w:rPr>
+        <w:t xml:space="preserve">Opérations choisies : multiplication (prix du riz), puis addition (total), puis soustraction (monnaie rendue).</w:t>
+      </w:r>
+    </w:p>
+    <w:p>
+      <w:pPr>
         <w:spacing w:after="60" w:line="300"/>
         <w:ind w:left="360"/>
         <w:jc w:val="left"/>
@@ -21119,6 +23821,66 @@
           <w:szCs w:val="24"/>
         </w:rPr>
         <w:t xml:space="preserve">Problème 2 — démarche :</w:t>
+      </w:r>
+    </w:p>
+    <w:p>
+      <w:pPr>
+        <w:spacing w:after="50" w:line="300"/>
+        <w:ind w:left="360"/>
+        <w:jc w:val="left"/>
+      </w:pPr>
+      <w:r>
+        <w:rPr>
+          <w:rFonts w:ascii="Times New Roman" w:cs="Times New Roman" w:eastAsia="Times New Roman" w:hAnsi="Times New Roman"/>
+          <w:b w:val="false"/>
+          <w:bCs w:val="false"/>
+          <w:i/>
+          <w:iCs/>
+          <w:color w:val="C2185B"/>
+          <w:sz w:val="24"/>
+          <w:szCs w:val="24"/>
+        </w:rPr>
+        <w:t xml:space="preserve">Question cachée : On ne peut diviser que des grammes par des grammes : la conversion kg → g est la question cachée.</w:t>
+      </w:r>
+    </w:p>
+    <w:p>
+      <w:pPr>
+        <w:spacing w:after="50" w:line="300"/>
+        <w:ind w:left="360"/>
+        <w:jc w:val="left"/>
+      </w:pPr>
+      <w:r>
+        <w:rPr>
+          <w:rFonts w:ascii="Times New Roman" w:cs="Times New Roman" w:eastAsia="Times New Roman" w:hAnsi="Times New Roman"/>
+          <w:b w:val="false"/>
+          <w:bCs w:val="false"/>
+          <w:i/>
+          <w:iCs/>
+          <w:color w:val="1F4E79"/>
+          <w:sz w:val="24"/>
+          <w:szCs w:val="24"/>
+        </w:rPr>
+        <w:t xml:space="preserve">Mots-indices : « partage… en sachets de » → division ; « kg » et « g » dans le même énoncé → conversion d’abord.</w:t>
+      </w:r>
+    </w:p>
+    <w:p>
+      <w:pPr>
+        <w:spacing w:after="70" w:line="300"/>
+        <w:ind w:left="360"/>
+        <w:jc w:val="left"/>
+      </w:pPr>
+      <w:r>
+        <w:rPr>
+          <w:rFonts w:ascii="Times New Roman" w:cs="Times New Roman" w:eastAsia="Times New Roman" w:hAnsi="Times New Roman"/>
+          <w:b w:val="false"/>
+          <w:bCs w:val="false"/>
+          <w:i/>
+          <w:iCs/>
+          <w:color w:val="B25000"/>
+          <w:sz w:val="24"/>
+          <w:szCs w:val="24"/>
+        </w:rPr>
+        <w:t xml:space="preserve">Opérations choisies : conversion, puis division euclidienne : combien de paquets de … g dans … g, et que reste-t-il ?</w:t>
       </w:r>
     </w:p>
     <w:p>
@@ -21365,6 +24127,66 @@
     </w:p>
     <w:p>
       <w:pPr>
+        <w:spacing w:after="50" w:line="300"/>
+        <w:ind w:left="360"/>
+        <w:jc w:val="left"/>
+      </w:pPr>
+      <w:r>
+        <w:rPr>
+          <w:rFonts w:ascii="Times New Roman" w:cs="Times New Roman" w:eastAsia="Times New Roman" w:hAnsi="Times New Roman"/>
+          <w:b w:val="false"/>
+          <w:bCs w:val="false"/>
+          <w:i/>
+          <w:iCs/>
+          <w:color w:val="C2185B"/>
+          <w:sz w:val="24"/>
+          <w:szCs w:val="24"/>
+        </w:rPr>
+        <w:t xml:space="preserve">Question cachée : La consommation est donnée pour 100 km, on la cherche pour un autre trajet : c’est un tableau de proportionnalité.</w:t>
+      </w:r>
+    </w:p>
+    <w:p>
+      <w:pPr>
+        <w:spacing w:after="50" w:line="300"/>
+        <w:ind w:left="360"/>
+        <w:jc w:val="left"/>
+      </w:pPr>
+      <w:r>
+        <w:rPr>
+          <w:rFonts w:ascii="Times New Roman" w:cs="Times New Roman" w:eastAsia="Times New Roman" w:hAnsi="Times New Roman"/>
+          <w:b w:val="false"/>
+          <w:bCs w:val="false"/>
+          <w:i/>
+          <w:iCs/>
+          <w:color w:val="1F4E79"/>
+          <w:sz w:val="24"/>
+          <w:szCs w:val="24"/>
+        </w:rPr>
+        <w:t xml:space="preserve">Mots-indices : « … L pour 100 km… pour … km ? » → proportionnalité (produit en croix ou retour à l’unité).</w:t>
+      </w:r>
+    </w:p>
+    <w:p>
+      <w:pPr>
+        <w:spacing w:after="70" w:line="300"/>
+        <w:ind w:left="360"/>
+        <w:jc w:val="left"/>
+      </w:pPr>
+      <w:r>
+        <w:rPr>
+          <w:rFonts w:ascii="Times New Roman" w:cs="Times New Roman" w:eastAsia="Times New Roman" w:hAnsi="Times New Roman"/>
+          <w:b w:val="false"/>
+          <w:bCs w:val="false"/>
+          <w:i/>
+          <w:iCs/>
+          <w:color w:val="B25000"/>
+          <w:sz w:val="24"/>
+          <w:szCs w:val="24"/>
+        </w:rPr>
+        <w:t xml:space="preserve">Opérations choisies : multiplication et division par le coefficient : on raisonne par paquets de 100 km.</w:t>
+      </w:r>
+    </w:p>
+    <w:p>
+      <w:pPr>
         <w:spacing w:after="60" w:line="300"/>
         <w:ind w:left="360"/>
         <w:jc w:val="left"/>
@@ -21460,6 +24282,66 @@
           <w:szCs w:val="24"/>
         </w:rPr>
         <w:t xml:space="preserve">Problème 2 — démarche :</w:t>
+      </w:r>
+    </w:p>
+    <w:p>
+      <w:pPr>
+        <w:spacing w:after="50" w:line="300"/>
+        <w:ind w:left="360"/>
+        <w:jc w:val="left"/>
+      </w:pPr>
+      <w:r>
+        <w:rPr>
+          <w:rFonts w:ascii="Times New Roman" w:cs="Times New Roman" w:eastAsia="Times New Roman" w:hAnsi="Times New Roman"/>
+          <w:b w:val="false"/>
+          <w:bCs w:val="false"/>
+          <w:i/>
+          <w:iCs/>
+          <w:color w:val="C2185B"/>
+          <w:sz w:val="24"/>
+          <w:szCs w:val="24"/>
+        </w:rPr>
+        <w:t xml:space="preserve">Question cachée : Le grillage suit le TOUR du champ : le périmètre est la question cachée — impossible d’acheter des mètres sans connaître le tour !</w:t>
+      </w:r>
+    </w:p>
+    <w:p>
+      <w:pPr>
+        <w:spacing w:after="50" w:line="300"/>
+        <w:ind w:left="360"/>
+        <w:jc w:val="left"/>
+      </w:pPr>
+      <w:r>
+        <w:rPr>
+          <w:rFonts w:ascii="Times New Roman" w:cs="Times New Roman" w:eastAsia="Times New Roman" w:hAnsi="Times New Roman"/>
+          <w:b w:val="false"/>
+          <w:bCs w:val="false"/>
+          <w:i/>
+          <w:iCs/>
+          <w:color w:val="1F4E79"/>
+          <w:sz w:val="24"/>
+          <w:szCs w:val="24"/>
+        </w:rPr>
+        <w:t xml:space="preserve">Mots-indices : « clôturer » → le tour → périmètre ; « … Ar le mètre » → × ensuite.</w:t>
+      </w:r>
+    </w:p>
+    <w:p>
+      <w:pPr>
+        <w:spacing w:after="70" w:line="300"/>
+        <w:ind w:left="360"/>
+        <w:jc w:val="left"/>
+      </w:pPr>
+      <w:r>
+        <w:rPr>
+          <w:rFonts w:ascii="Times New Roman" w:cs="Times New Roman" w:eastAsia="Times New Roman" w:hAnsi="Times New Roman"/>
+          <w:b w:val="false"/>
+          <w:bCs w:val="false"/>
+          <w:i/>
+          <w:iCs/>
+          <w:color w:val="B25000"/>
+          <w:sz w:val="24"/>
+          <w:szCs w:val="24"/>
+        </w:rPr>
+        <w:t xml:space="preserve">Opérations choisies : périmètre (L + l) × 2, puis multiplication par le prix du mètre.</w:t>
       </w:r>
     </w:p>
     <w:p>
@@ -21713,6 +24595,66 @@
     </w:p>
     <w:p>
       <w:pPr>
+        <w:spacing w:after="50" w:line="300"/>
+        <w:ind w:left="360"/>
+        <w:jc w:val="left"/>
+      </w:pPr>
+      <w:r>
+        <w:rPr>
+          <w:rFonts w:ascii="Times New Roman" w:cs="Times New Roman" w:eastAsia="Times New Roman" w:hAnsi="Times New Roman"/>
+          <w:b w:val="false"/>
+          <w:bCs w:val="false"/>
+          <w:i/>
+          <w:iCs/>
+          <w:color w:val="C2185B"/>
+          <w:sz w:val="24"/>
+          <w:szCs w:val="24"/>
+        </w:rPr>
+        <w:t xml:space="preserve">Question cachée : Une dalle couvre exactement 1 m² : le nombre de dalles est donc l’AIRE de la salle.</w:t>
+      </w:r>
+    </w:p>
+    <w:p>
+      <w:pPr>
+        <w:spacing w:after="50" w:line="300"/>
+        <w:ind w:left="360"/>
+        <w:jc w:val="left"/>
+      </w:pPr>
+      <w:r>
+        <w:rPr>
+          <w:rFonts w:ascii="Times New Roman" w:cs="Times New Roman" w:eastAsia="Times New Roman" w:hAnsi="Times New Roman"/>
+          <w:b w:val="false"/>
+          <w:bCs w:val="false"/>
+          <w:i/>
+          <w:iCs/>
+          <w:color w:val="1F4E79"/>
+          <w:sz w:val="24"/>
+          <w:szCs w:val="24"/>
+        </w:rPr>
+        <w:t xml:space="preserve">Mots-indices : « carreler… dalles de 1 m² » → aire ; « pour quel prix total » → ×.</w:t>
+      </w:r>
+    </w:p>
+    <w:p>
+      <w:pPr>
+        <w:spacing w:after="70" w:line="300"/>
+        <w:ind w:left="360"/>
+        <w:jc w:val="left"/>
+      </w:pPr>
+      <w:r>
+        <w:rPr>
+          <w:rFonts w:ascii="Times New Roman" w:cs="Times New Roman" w:eastAsia="Times New Roman" w:hAnsi="Times New Roman"/>
+          <w:b w:val="false"/>
+          <w:bCs w:val="false"/>
+          <w:i/>
+          <w:iCs/>
+          <w:color w:val="B25000"/>
+          <w:sz w:val="24"/>
+          <w:szCs w:val="24"/>
+        </w:rPr>
+        <w:t xml:space="preserve">Opérations choisies : aire L × l, puis multiplication par le prix de la dalle.</w:t>
+      </w:r>
+    </w:p>
+    <w:p>
+      <w:pPr>
         <w:spacing w:after="60" w:line="300"/>
         <w:ind w:left="360"/>
         <w:jc w:val="left"/>
@@ -21812,22 +24754,22 @@
     </w:p>
     <w:p>
       <w:pPr>
-        <w:spacing w:after="60" w:line="300"/>
-        <w:ind w:left="360"/>
-        <w:jc w:val="left"/>
-      </w:pPr>
-      <w:r>
-        <w:rPr>
-          <w:rFonts w:ascii="Times New Roman" w:cs="Times New Roman" w:eastAsia="Times New Roman" w:hAnsi="Times New Roman"/>
-          <w:b w:val="false"/>
-          <w:bCs w:val="false"/>
-          <w:i w:val="false"/>
-          <w:iCs w:val="false"/>
-          <w:color w:val="000000"/>
-          <w:sz w:val="24"/>
-          <w:szCs w:val="24"/>
-        </w:rPr>
-        <w:t xml:space="preserve">Étape 1 — Quantité vendue : </w:t>
+        <w:spacing w:after="50" w:line="300"/>
+        <w:ind w:left="360"/>
+        <w:jc w:val="left"/>
+      </w:pPr>
+      <w:r>
+        <w:rPr>
+          <w:rFonts w:ascii="Times New Roman" w:cs="Times New Roman" w:eastAsia="Times New Roman" w:hAnsi="Times New Roman"/>
+          <w:b w:val="false"/>
+          <w:bCs w:val="false"/>
+          <w:i/>
+          <w:iCs/>
+          <w:color w:val="C2185B"/>
+          <w:sz w:val="24"/>
+          <w:szCs w:val="24"/>
+        </w:rPr>
+        <w:t xml:space="preserve">Question cachée : Vendre les </w:t>
       </w:r>
       <m:oMath>
         <m:f>
@@ -21848,59 +24790,39 @@
           <w:rFonts w:ascii="Times New Roman" w:cs="Times New Roman" w:eastAsia="Times New Roman" w:hAnsi="Times New Roman"/>
           <w:b w:val="false"/>
           <w:bCs w:val="false"/>
-          <w:i w:val="false"/>
-          <w:iCs w:val="false"/>
-          <w:color w:val="000000"/>
-          <w:sz w:val="24"/>
-          <w:szCs w:val="24"/>
-        </w:rPr>
-        <w:t xml:space="preserve">de 160 = (160 ÷ 4) × 3 = 40 × 3 = 120 kg.</w:t>
-      </w:r>
-    </w:p>
-    <w:p>
-      <w:pPr>
-        <w:spacing w:after="60" w:line="300"/>
-        <w:ind w:left="360"/>
-        <w:jc w:val="left"/>
-      </w:pPr>
-      <w:r>
-        <w:rPr>
-          <w:rFonts w:ascii="Times New Roman" w:cs="Times New Roman" w:eastAsia="Times New Roman" w:hAnsi="Times New Roman"/>
-          <w:b w:val="false"/>
-          <w:bCs w:val="false"/>
-          <w:i w:val="false"/>
-          <w:iCs w:val="false"/>
-          <w:color w:val="000000"/>
-          <w:sz w:val="24"/>
-          <w:szCs w:val="24"/>
-        </w:rPr>
-        <w:t xml:space="preserve">Étape 2 — Recette : 120 × 3 000 = 360 000 Ar.</w:t>
-      </w:r>
-    </w:p>
-    <w:p>
-      <w:pPr>
-        <w:spacing w:after="60" w:line="300"/>
-        <w:ind w:left="360"/>
-        <w:jc w:val="left"/>
-      </w:pPr>
-      <w:r>
-        <w:rPr>
-          <w:rFonts w:ascii="Times New Roman" w:cs="Times New Roman" w:eastAsia="Times New Roman" w:hAnsi="Times New Roman"/>
-          <w:b w:val="false"/>
-          <w:bCs w:val="false"/>
-          <w:i w:val="false"/>
-          <w:iCs w:val="false"/>
-          <w:color w:val="000000"/>
-          <w:sz w:val="24"/>
-          <w:szCs w:val="24"/>
-        </w:rPr>
-        <w:t xml:space="preserve">Étape 3 — Part gardée : 160 − 120 = 40 kg (c’est bien </w:t>
+          <w:i/>
+          <w:iCs/>
+          <w:color w:val="C2185B"/>
+          <w:sz w:val="24"/>
+          <w:szCs w:val="24"/>
+        </w:rPr>
+        <w:t xml:space="preserve">oblige à calculer D’ABORD cette quantité en kilos : c’est la question cachée.</w:t>
+      </w:r>
+    </w:p>
+    <w:p>
+      <w:pPr>
+        <w:spacing w:after="50" w:line="300"/>
+        <w:ind w:left="360"/>
+        <w:jc w:val="left"/>
+      </w:pPr>
+      <w:r>
+        <w:rPr>
+          <w:rFonts w:ascii="Times New Roman" w:cs="Times New Roman" w:eastAsia="Times New Roman" w:hAnsi="Times New Roman"/>
+          <w:b w:val="false"/>
+          <w:bCs w:val="false"/>
+          <w:i/>
+          <w:iCs/>
+          <w:color w:val="1F4E79"/>
+          <w:sz w:val="24"/>
+          <w:szCs w:val="24"/>
+        </w:rPr>
+        <w:t xml:space="preserve">Mots-indices : « les </w:t>
       </w:r>
       <m:oMath>
         <m:f>
           <m:num>
             <m:r>
-              <m:t>1</m:t>
+              <m:t>3</m:t>
             </m:r>
           </m:num>
           <m:den>
@@ -21915,6 +24837,140 @@
           <w:rFonts w:ascii="Times New Roman" w:cs="Times New Roman" w:eastAsia="Times New Roman" w:hAnsi="Times New Roman"/>
           <w:b w:val="false"/>
           <w:bCs w:val="false"/>
+          <w:i/>
+          <w:iCs/>
+          <w:color w:val="1F4E79"/>
+          <w:sz w:val="24"/>
+          <w:szCs w:val="24"/>
+        </w:rPr>
+        <w:t xml:space="preserve">de » → fraction de la récolte (÷ 4 puis × 3) ; « au kilo » → × par le prix.</w:t>
+      </w:r>
+    </w:p>
+    <w:p>
+      <w:pPr>
+        <w:spacing w:after="70" w:line="300"/>
+        <w:ind w:left="360"/>
+        <w:jc w:val="left"/>
+      </w:pPr>
+      <w:r>
+        <w:rPr>
+          <w:rFonts w:ascii="Times New Roman" w:cs="Times New Roman" w:eastAsia="Times New Roman" w:hAnsi="Times New Roman"/>
+          <w:b w:val="false"/>
+          <w:bCs w:val="false"/>
+          <w:i/>
+          <w:iCs/>
+          <w:color w:val="B25000"/>
+          <w:sz w:val="24"/>
+          <w:szCs w:val="24"/>
+        </w:rPr>
+        <w:t xml:space="preserve">Opérations choisies : fraction de la récolte, puis multiplication pour la recette, puis soustraction pour la part gardée.</w:t>
+      </w:r>
+    </w:p>
+    <w:p>
+      <w:pPr>
+        <w:spacing w:after="60" w:line="300"/>
+        <w:ind w:left="360"/>
+        <w:jc w:val="left"/>
+      </w:pPr>
+      <w:r>
+        <w:rPr>
+          <w:rFonts w:ascii="Times New Roman" w:cs="Times New Roman" w:eastAsia="Times New Roman" w:hAnsi="Times New Roman"/>
+          <w:b w:val="false"/>
+          <w:bCs w:val="false"/>
+          <w:i w:val="false"/>
+          <w:iCs w:val="false"/>
+          <w:color w:val="000000"/>
+          <w:sz w:val="24"/>
+          <w:szCs w:val="24"/>
+        </w:rPr>
+        <w:t xml:space="preserve">Étape 1 — Quantité vendue : </w:t>
+      </w:r>
+      <m:oMath>
+        <m:f>
+          <m:num>
+            <m:r>
+              <m:t>3</m:t>
+            </m:r>
+          </m:num>
+          <m:den>
+            <m:r>
+              <m:t>4</m:t>
+            </m:r>
+          </m:den>
+        </m:f>
+      </m:oMath>
+      <w:r>
+        <w:rPr>
+          <w:rFonts w:ascii="Times New Roman" w:cs="Times New Roman" w:eastAsia="Times New Roman" w:hAnsi="Times New Roman"/>
+          <w:b w:val="false"/>
+          <w:bCs w:val="false"/>
+          <w:i w:val="false"/>
+          <w:iCs w:val="false"/>
+          <w:color w:val="000000"/>
+          <w:sz w:val="24"/>
+          <w:szCs w:val="24"/>
+        </w:rPr>
+        <w:t xml:space="preserve">de 160 = (160 ÷ 4) × 3 = 40 × 3 = 120 kg.</w:t>
+      </w:r>
+    </w:p>
+    <w:p>
+      <w:pPr>
+        <w:spacing w:after="60" w:line="300"/>
+        <w:ind w:left="360"/>
+        <w:jc w:val="left"/>
+      </w:pPr>
+      <w:r>
+        <w:rPr>
+          <w:rFonts w:ascii="Times New Roman" w:cs="Times New Roman" w:eastAsia="Times New Roman" w:hAnsi="Times New Roman"/>
+          <w:b w:val="false"/>
+          <w:bCs w:val="false"/>
+          <w:i w:val="false"/>
+          <w:iCs w:val="false"/>
+          <w:color w:val="000000"/>
+          <w:sz w:val="24"/>
+          <w:szCs w:val="24"/>
+        </w:rPr>
+        <w:t xml:space="preserve">Étape 2 — Recette : 120 × 3 000 = 360 000 Ar.</w:t>
+      </w:r>
+    </w:p>
+    <w:p>
+      <w:pPr>
+        <w:spacing w:after="60" w:line="300"/>
+        <w:ind w:left="360"/>
+        <w:jc w:val="left"/>
+      </w:pPr>
+      <w:r>
+        <w:rPr>
+          <w:rFonts w:ascii="Times New Roman" w:cs="Times New Roman" w:eastAsia="Times New Roman" w:hAnsi="Times New Roman"/>
+          <w:b w:val="false"/>
+          <w:bCs w:val="false"/>
+          <w:i w:val="false"/>
+          <w:iCs w:val="false"/>
+          <w:color w:val="000000"/>
+          <w:sz w:val="24"/>
+          <w:szCs w:val="24"/>
+        </w:rPr>
+        <w:t xml:space="preserve">Étape 3 — Part gardée : 160 − 120 = 40 kg (c’est bien </w:t>
+      </w:r>
+      <m:oMath>
+        <m:f>
+          <m:num>
+            <m:r>
+              <m:t>1</m:t>
+            </m:r>
+          </m:num>
+          <m:den>
+            <m:r>
+              <m:t>4</m:t>
+            </m:r>
+          </m:den>
+        </m:f>
+      </m:oMath>
+      <w:r>
+        <w:rPr>
+          <w:rFonts w:ascii="Times New Roman" w:cs="Times New Roman" w:eastAsia="Times New Roman" w:hAnsi="Times New Roman"/>
+          <w:b w:val="false"/>
+          <w:bCs w:val="false"/>
           <w:i w:val="false"/>
           <w:iCs w:val="false"/>
           <w:color w:val="000000"/>
@@ -22108,6 +25164,66 @@
     </w:p>
     <w:p>
       <w:pPr>
+        <w:spacing w:after="50" w:line="300"/>
+        <w:ind w:left="360"/>
+        <w:jc w:val="left"/>
+      </w:pPr>
+      <w:r>
+        <w:rPr>
+          <w:rFonts w:ascii="Times New Roman" w:cs="Times New Roman" w:eastAsia="Times New Roman" w:hAnsi="Times New Roman"/>
+          <w:b w:val="false"/>
+          <w:bCs w:val="false"/>
+          <w:i/>
+          <w:iCs/>
+          <w:color w:val="C2185B"/>
+          <w:sz w:val="24"/>
+          <w:szCs w:val="24"/>
+        </w:rPr>
+        <w:t xml:space="preserve">Question cachée : Le prix du tissu d’abord, la monnaie ensuite : on ne rend pas la monnaie sans connaître le total.</w:t>
+      </w:r>
+    </w:p>
+    <w:p>
+      <w:pPr>
+        <w:spacing w:after="50" w:line="300"/>
+        <w:ind w:left="360"/>
+        <w:jc w:val="left"/>
+      </w:pPr>
+      <w:r>
+        <w:rPr>
+          <w:rFonts w:ascii="Times New Roman" w:cs="Times New Roman" w:eastAsia="Times New Roman" w:hAnsi="Times New Roman"/>
+          <w:b w:val="false"/>
+          <w:bCs w:val="false"/>
+          <w:i/>
+          <w:iCs/>
+          <w:color w:val="1F4E79"/>
+          <w:sz w:val="24"/>
+          <w:szCs w:val="24"/>
+        </w:rPr>
+        <w:t xml:space="preserve">Mots-indices : « … m à … Ar le mètre » (prix unitaire → ×) ; « combien lui rend-on » (écart → −).</w:t>
+      </w:r>
+    </w:p>
+    <w:p>
+      <w:pPr>
+        <w:spacing w:after="70" w:line="300"/>
+        <w:ind w:left="360"/>
+        <w:jc w:val="left"/>
+      </w:pPr>
+      <w:r>
+        <w:rPr>
+          <w:rFonts w:ascii="Times New Roman" w:cs="Times New Roman" w:eastAsia="Times New Roman" w:hAnsi="Times New Roman"/>
+          <w:b w:val="false"/>
+          <w:bCs w:val="false"/>
+          <w:i/>
+          <w:iCs/>
+          <w:color w:val="B25000"/>
+          <w:sz w:val="24"/>
+          <w:szCs w:val="24"/>
+        </w:rPr>
+        <w:t xml:space="preserve">Opérations choisies : multiplication à virgules, puis soustraction.</w:t>
+      </w:r>
+    </w:p>
+    <w:p>
+      <w:pPr>
         <w:spacing w:after="60" w:line="300"/>
         <w:ind w:left="360"/>
         <w:jc w:val="left"/>
@@ -22183,6 +25299,66 @@
           <w:szCs w:val="24"/>
         </w:rPr>
         <w:t xml:space="preserve">Problème 2 — démarche :</w:t>
+      </w:r>
+    </w:p>
+    <w:p>
+      <w:pPr>
+        <w:spacing w:after="50" w:line="300"/>
+        <w:ind w:left="360"/>
+        <w:jc w:val="left"/>
+      </w:pPr>
+      <w:r>
+        <w:rPr>
+          <w:rFonts w:ascii="Times New Roman" w:cs="Times New Roman" w:eastAsia="Times New Roman" w:hAnsi="Times New Roman"/>
+          <w:b w:val="false"/>
+          <w:bCs w:val="false"/>
+          <w:i/>
+          <w:iCs/>
+          <w:color w:val="C2185B"/>
+          <w:sz w:val="24"/>
+          <w:szCs w:val="24"/>
+        </w:rPr>
+        <w:t xml:space="preserve">Question cachée : On additionne les heures avec les heures et les minutes avec les minutes — et si les minutes dépassent 60, on échange contre 1 heure.</w:t>
+      </w:r>
+    </w:p>
+    <w:p>
+      <w:pPr>
+        <w:spacing w:after="50" w:line="300"/>
+        <w:ind w:left="360"/>
+        <w:jc w:val="left"/>
+      </w:pPr>
+      <w:r>
+        <w:rPr>
+          <w:rFonts w:ascii="Times New Roman" w:cs="Times New Roman" w:eastAsia="Times New Roman" w:hAnsi="Times New Roman"/>
+          <w:b w:val="false"/>
+          <w:bCs w:val="false"/>
+          <w:i/>
+          <w:iCs/>
+          <w:color w:val="1F4E79"/>
+          <w:sz w:val="24"/>
+          <w:szCs w:val="24"/>
+        </w:rPr>
+        <w:t xml:space="preserve">Mots-indices : « part à… le trajet dure… » → addition de durées (base 60).</w:t>
+      </w:r>
+    </w:p>
+    <w:p>
+      <w:pPr>
+        <w:spacing w:after="70" w:line="300"/>
+        <w:ind w:left="360"/>
+        <w:jc w:val="left"/>
+      </w:pPr>
+      <w:r>
+        <w:rPr>
+          <w:rFonts w:ascii="Times New Roman" w:cs="Times New Roman" w:eastAsia="Times New Roman" w:hAnsi="Times New Roman"/>
+          <w:b w:val="false"/>
+          <w:bCs w:val="false"/>
+          <w:i/>
+          <w:iCs/>
+          <w:color w:val="B25000"/>
+          <w:sz w:val="24"/>
+          <w:szCs w:val="24"/>
+        </w:rPr>
+        <w:t xml:space="preserve">Opérations choisies : addition sexagésimale : colonne des heures, colonne des minutes, échange à 60.</w:t>
       </w:r>
     </w:p>
     <w:p>
@@ -22429,6 +25605,66 @@
     </w:p>
     <w:p>
       <w:pPr>
+        <w:spacing w:after="50" w:line="300"/>
+        <w:ind w:left="360"/>
+        <w:jc w:val="left"/>
+      </w:pPr>
+      <w:r>
+        <w:rPr>
+          <w:rFonts w:ascii="Times New Roman" w:cs="Times New Roman" w:eastAsia="Times New Roman" w:hAnsi="Times New Roman"/>
+          <w:b w:val="false"/>
+          <w:bCs w:val="false"/>
+          <w:i/>
+          <w:iCs/>
+          <w:color w:val="C2185B"/>
+          <w:sz w:val="24"/>
+          <w:szCs w:val="24"/>
+        </w:rPr>
+        <w:t xml:space="preserve">Question cachée : Combien de « paquets » de … Ar tiennent dans le prix du vélo : l’épargne hebdomadaire est comme un paquet qu’on répète.</w:t>
+      </w:r>
+    </w:p>
+    <w:p>
+      <w:pPr>
+        <w:spacing w:after="50" w:line="300"/>
+        <w:ind w:left="360"/>
+        <w:jc w:val="left"/>
+      </w:pPr>
+      <w:r>
+        <w:rPr>
+          <w:rFonts w:ascii="Times New Roman" w:cs="Times New Roman" w:eastAsia="Times New Roman" w:hAnsi="Times New Roman"/>
+          <w:b w:val="false"/>
+          <w:bCs w:val="false"/>
+          <w:i/>
+          <w:iCs/>
+          <w:color w:val="1F4E79"/>
+          <w:sz w:val="24"/>
+          <w:szCs w:val="24"/>
+        </w:rPr>
+        <w:t xml:space="preserve">Mots-indices : « combien de semaines » → combien de fois → division (groupement).</w:t>
+      </w:r>
+    </w:p>
+    <w:p>
+      <w:pPr>
+        <w:spacing w:after="70" w:line="300"/>
+        <w:ind w:left="360"/>
+        <w:jc w:val="left"/>
+      </w:pPr>
+      <w:r>
+        <w:rPr>
+          <w:rFonts w:ascii="Times New Roman" w:cs="Times New Roman" w:eastAsia="Times New Roman" w:hAnsi="Times New Roman"/>
+          <w:b w:val="false"/>
+          <w:bCs w:val="false"/>
+          <w:i/>
+          <w:iCs/>
+          <w:color w:val="B25000"/>
+          <w:sz w:val="24"/>
+          <w:szCs w:val="24"/>
+        </w:rPr>
+        <w:t xml:space="preserve">Opérations choisies : division : on cherche combien de fois l’épargne entre dans le prix total.</w:t>
+      </w:r>
+    </w:p>
+    <w:p>
+      <w:pPr>
         <w:spacing w:after="60" w:line="300"/>
         <w:ind w:left="360"/>
         <w:jc w:val="left"/>
@@ -22524,6 +25760,66 @@
           <w:szCs w:val="24"/>
         </w:rPr>
         <w:t xml:space="preserve">Problème 2 — démarche :</w:t>
+      </w:r>
+    </w:p>
+    <w:p>
+      <w:pPr>
+        <w:spacing w:after="50" w:line="300"/>
+        <w:ind w:left="360"/>
+        <w:jc w:val="left"/>
+      </w:pPr>
+      <w:r>
+        <w:rPr>
+          <w:rFonts w:ascii="Times New Roman" w:cs="Times New Roman" w:eastAsia="Times New Roman" w:hAnsi="Times New Roman"/>
+          <w:b w:val="false"/>
+          <w:bCs w:val="false"/>
+          <w:i/>
+          <w:iCs/>
+          <w:color w:val="C2185B"/>
+          <w:sz w:val="24"/>
+          <w:szCs w:val="24"/>
+        </w:rPr>
+        <w:t xml:space="preserve">Question cachée : Deux questions bien séparées : d’abord les rangées (division), puis les bus (division avec reste — et il faut l’interpréter !).</w:t>
+      </w:r>
+    </w:p>
+    <w:p>
+      <w:pPr>
+        <w:spacing w:after="50" w:line="300"/>
+        <w:ind w:left="360"/>
+        <w:jc w:val="left"/>
+      </w:pPr>
+      <w:r>
+        <w:rPr>
+          <w:rFonts w:ascii="Times New Roman" w:cs="Times New Roman" w:eastAsia="Times New Roman" w:hAnsi="Times New Roman"/>
+          <w:b w:val="false"/>
+          <w:bCs w:val="false"/>
+          <w:i/>
+          <w:iCs/>
+          <w:color w:val="1F4E79"/>
+          <w:sz w:val="24"/>
+          <w:szCs w:val="24"/>
+        </w:rPr>
+        <w:t xml:space="preserve">Mots-indices : « en rangées de » → ÷ ; « et … enseignants » → + ; « bus de 30 places » → ÷ avec reste.</w:t>
+      </w:r>
+    </w:p>
+    <w:p>
+      <w:pPr>
+        <w:spacing w:after="70" w:line="300"/>
+        <w:ind w:left="360"/>
+        <w:jc w:val="left"/>
+      </w:pPr>
+      <w:r>
+        <w:rPr>
+          <w:rFonts w:ascii="Times New Roman" w:cs="Times New Roman" w:eastAsia="Times New Roman" w:hAnsi="Times New Roman"/>
+          <w:b w:val="false"/>
+          <w:bCs w:val="false"/>
+          <w:i/>
+          <w:iCs/>
+          <w:color w:val="B25000"/>
+          <w:sz w:val="24"/>
+          <w:szCs w:val="24"/>
+        </w:rPr>
+        <w:t xml:space="preserve">Opérations choisies : division, addition, puis division avec interprétation du reste : le reste impose un bus DE PLUS.</w:t>
       </w:r>
     </w:p>
     <w:p>
@@ -22770,6 +26066,66 @@
     </w:p>
     <w:p>
       <w:pPr>
+        <w:spacing w:after="50" w:line="300"/>
+        <w:ind w:left="360"/>
+        <w:jc w:val="left"/>
+      </w:pPr>
+      <w:r>
+        <w:rPr>
+          <w:rFonts w:ascii="Times New Roman" w:cs="Times New Roman" w:eastAsia="Times New Roman" w:hAnsi="Times New Roman"/>
+          <w:b w:val="false"/>
+          <w:bCs w:val="false"/>
+          <w:i/>
+          <w:iCs/>
+          <w:color w:val="C2185B"/>
+          <w:sz w:val="24"/>
+          <w:szCs w:val="24"/>
+        </w:rPr>
+        <w:t xml:space="preserve">Question cachée : Pour rendre la monnaie, il faut d’abord connaître le prix TOTAL des achats : le total est la question cachée.</w:t>
+      </w:r>
+    </w:p>
+    <w:p>
+      <w:pPr>
+        <w:spacing w:after="50" w:line="300"/>
+        <w:ind w:left="360"/>
+        <w:jc w:val="left"/>
+      </w:pPr>
+      <w:r>
+        <w:rPr>
+          <w:rFonts w:ascii="Times New Roman" w:cs="Times New Roman" w:eastAsia="Times New Roman" w:hAnsi="Times New Roman"/>
+          <w:b w:val="false"/>
+          <w:bCs w:val="false"/>
+          <w:i/>
+          <w:iCs/>
+          <w:color w:val="1F4E79"/>
+          <w:sz w:val="24"/>
+          <w:szCs w:val="24"/>
+        </w:rPr>
+        <w:t xml:space="preserve">Mots-indices : « à … Ar le kapoaka » (prix unitaire → ×) ; « et un savon » (réunion → +) ; « combien lui rend-on » (écart → −).</w:t>
+      </w:r>
+    </w:p>
+    <w:p>
+      <w:pPr>
+        <w:spacing w:after="70" w:line="300"/>
+        <w:ind w:left="360"/>
+        <w:jc w:val="left"/>
+      </w:pPr>
+      <w:r>
+        <w:rPr>
+          <w:rFonts w:ascii="Times New Roman" w:cs="Times New Roman" w:eastAsia="Times New Roman" w:hAnsi="Times New Roman"/>
+          <w:b w:val="false"/>
+          <w:bCs w:val="false"/>
+          <w:i/>
+          <w:iCs/>
+          <w:color w:val="B25000"/>
+          <w:sz w:val="24"/>
+          <w:szCs w:val="24"/>
+        </w:rPr>
+        <w:t xml:space="preserve">Opérations choisies : multiplication (prix du riz), puis addition (total), puis soustraction (monnaie rendue).</w:t>
+      </w:r>
+    </w:p>
+    <w:p>
+      <w:pPr>
         <w:spacing w:after="60" w:line="300"/>
         <w:ind w:left="360"/>
         <w:jc w:val="left"/>
@@ -22865,6 +26221,66 @@
           <w:szCs w:val="24"/>
         </w:rPr>
         <w:t xml:space="preserve">Problème 2 — démarche :</w:t>
+      </w:r>
+    </w:p>
+    <w:p>
+      <w:pPr>
+        <w:spacing w:after="50" w:line="300"/>
+        <w:ind w:left="360"/>
+        <w:jc w:val="left"/>
+      </w:pPr>
+      <w:r>
+        <w:rPr>
+          <w:rFonts w:ascii="Times New Roman" w:cs="Times New Roman" w:eastAsia="Times New Roman" w:hAnsi="Times New Roman"/>
+          <w:b w:val="false"/>
+          <w:bCs w:val="false"/>
+          <w:i/>
+          <w:iCs/>
+          <w:color w:val="C2185B"/>
+          <w:sz w:val="24"/>
+          <w:szCs w:val="24"/>
+        </w:rPr>
+        <w:t xml:space="preserve">Question cachée : On ne peut diviser que des grammes par des grammes : la conversion kg → g est la question cachée.</w:t>
+      </w:r>
+    </w:p>
+    <w:p>
+      <w:pPr>
+        <w:spacing w:after="50" w:line="300"/>
+        <w:ind w:left="360"/>
+        <w:jc w:val="left"/>
+      </w:pPr>
+      <w:r>
+        <w:rPr>
+          <w:rFonts w:ascii="Times New Roman" w:cs="Times New Roman" w:eastAsia="Times New Roman" w:hAnsi="Times New Roman"/>
+          <w:b w:val="false"/>
+          <w:bCs w:val="false"/>
+          <w:i/>
+          <w:iCs/>
+          <w:color w:val="1F4E79"/>
+          <w:sz w:val="24"/>
+          <w:szCs w:val="24"/>
+        </w:rPr>
+        <w:t xml:space="preserve">Mots-indices : « partage… en sachets de » → division ; « kg » et « g » dans le même énoncé → conversion d’abord.</w:t>
+      </w:r>
+    </w:p>
+    <w:p>
+      <w:pPr>
+        <w:spacing w:after="70" w:line="300"/>
+        <w:ind w:left="360"/>
+        <w:jc w:val="left"/>
+      </w:pPr>
+      <w:r>
+        <w:rPr>
+          <w:rFonts w:ascii="Times New Roman" w:cs="Times New Roman" w:eastAsia="Times New Roman" w:hAnsi="Times New Roman"/>
+          <w:b w:val="false"/>
+          <w:bCs w:val="false"/>
+          <w:i/>
+          <w:iCs/>
+          <w:color w:val="B25000"/>
+          <w:sz w:val="24"/>
+          <w:szCs w:val="24"/>
+        </w:rPr>
+        <w:t xml:space="preserve">Opérations choisies : conversion, puis division euclidienne : combien de paquets de … g dans … g, et que reste-t-il ?</w:t>
       </w:r>
     </w:p>
     <w:p>

</xml_diff>

<commit_message>
Math T5 : privilégier le schéma aux explications de la preuve par 9
- Renomme et raccourcit les explications textuelles de la preuve par 9\n- Le contrôle est montré par le dessin et les flèches\n- Reconstruit les unités, méthodes, examens et livrable complet

Co-authored-by: arena-agent <297053741+arena-agent@users.noreply.github.com>
</commit_message>
<xml_diff>
--- a/manuel-math-t5/Manuel_Mathematiques_T5_EXAMENS.docx
+++ b/manuel-math-t5/Manuel_Mathematiques_T5_EXAMENS.docx
@@ -675,7 +675,7 @@
           <w:sz w:val="24"/>
           <w:szCs w:val="24"/>
         </w:rPr>
-        <w:t xml:space="preserve">Preuve par 9 (croix) : 335 → 2 ; 26 → 8 ; 2 × 8 = 7, et 8 710 → 7 ✓</w:t>
+        <w:t xml:space="preserve">Contrôle visuel par 9 : 335 → 2 ; 26 → 8 ; 2 × 8 = 7, et 8 710 → 7 ✓</w:t>
       </w:r>
     </w:p>
     <w:p>
@@ -800,7 +800,7 @@
           <w:sz w:val="24"/>
           <w:szCs w:val="24"/>
         </w:rPr>
-        <w:t xml:space="preserve">Croix de la preuve par 9 : H 3 × B 3 + reste 1 → 1, comme 793 → 1 ✓</w:t>
+        <w:t xml:space="preserve">Contrôle visuel par 9 : H 3 × B 3 + reste 1 → 1, comme 793 → 1 ✓</w:t>
       </w:r>
     </w:p>
     <w:p>
@@ -1679,7 +1679,7 @@
           <w:sz w:val="24"/>
           <w:szCs w:val="24"/>
         </w:rPr>
-        <w:t xml:space="preserve">Preuve par 9 (croix) : 693 → 9 ; 94 → 4 ; 9 × 4 = 9, et 65 142 → 9 ✓</w:t>
+        <w:t xml:space="preserve">Contrôle visuel par 9 : 693 → 9 ; 94 → 4 ; 9 × 4 = 9, et 65 142 → 9 ✓</w:t>
       </w:r>
     </w:p>
     <w:p>
@@ -1804,7 +1804,7 @@
           <w:sz w:val="24"/>
           <w:szCs w:val="24"/>
         </w:rPr>
-        <w:t xml:space="preserve">Croix de la preuve par 9 : H 6 × B 1 + reste 15 → 3, comme 1 551 → 3 ✓</w:t>
+        <w:t xml:space="preserve">Contrôle visuel par 9 : H 6 × B 1 + reste 15 → 3, comme 1 551 → 3 ✓</w:t>
       </w:r>
     </w:p>
     <w:p>
@@ -2737,7 +2737,7 @@
           <w:sz w:val="24"/>
           <w:szCs w:val="24"/>
         </w:rPr>
-        <w:t xml:space="preserve">Preuve par 9 (croix) : 881 → 8 ; 73 → 1 ; 8 × 1 = 8, et 64 313 → 8 ✓</w:t>
+        <w:t xml:space="preserve">Contrôle visuel par 9 : 881 → 8 ; 73 → 1 ; 8 × 1 = 8, et 64 313 → 8 ✓</w:t>
       </w:r>
     </w:p>
     <w:p>
@@ -2862,7 +2862,7 @@
           <w:sz w:val="24"/>
           <w:szCs w:val="24"/>
         </w:rPr>
-        <w:t xml:space="preserve">Croix de la preuve par 9 : H 8 × B 5 + reste 33 → 1, comme 2 098 → 1 ✓</w:t>
+        <w:t xml:space="preserve">Contrôle visuel par 9 : H 8 × B 5 + reste 33 → 1, comme 2 098 → 1 ✓</w:t>
       </w:r>
     </w:p>
     <w:p>
@@ -3761,7 +3761,7 @@
           <w:sz w:val="24"/>
           <w:szCs w:val="24"/>
         </w:rPr>
-        <w:t xml:space="preserve">Preuve par 9 (croix) : 382 → 4 ; 72 → 9 ; 4 × 9 = 9, et 27 504 → 9 ✓</w:t>
+        <w:t xml:space="preserve">Contrôle visuel par 9 : 382 → 4 ; 72 → 9 ; 4 × 9 = 9, et 27 504 → 9 ✓</w:t>
       </w:r>
     </w:p>
     <w:p>
@@ -3886,7 +3886,7 @@
           <w:sz w:val="24"/>
           <w:szCs w:val="24"/>
         </w:rPr>
-        <w:t xml:space="preserve">Croix de la preuve par 9 : H 6 × B 4 + reste 41 → 2, comme 1 343 → 2 ✓</w:t>
+        <w:t xml:space="preserve">Contrôle visuel par 9 : H 6 × B 4 + reste 41 → 2, comme 1 343 → 2 ✓</w:t>
       </w:r>
     </w:p>
     <w:p>
@@ -4792,7 +4792,7 @@
           <w:sz w:val="24"/>
           <w:szCs w:val="24"/>
         </w:rPr>
-        <w:t xml:space="preserve">Preuve par 9 (croix) : 648 → 9 ; 77 → 5 ; 9 × 5 = 9, et 49 896 → 9 ✓</w:t>
+        <w:t xml:space="preserve">Contrôle visuel par 9 : 648 → 9 ; 77 → 5 ; 9 × 5 = 9, et 49 896 → 9 ✓</w:t>
       </w:r>
     </w:p>
     <w:p>
@@ -4917,7 +4917,7 @@
           <w:sz w:val="24"/>
           <w:szCs w:val="24"/>
         </w:rPr>
-        <w:t xml:space="preserve">Croix de la preuve par 9 : H 4 × B 6 + reste 10 → 7, comme 934 → 7 ✓</w:t>
+        <w:t xml:space="preserve">Contrôle visuel par 9 : H 4 × B 6 + reste 10 → 7, comme 934 → 7 ✓</w:t>
       </w:r>
     </w:p>
     <w:p>
@@ -5796,7 +5796,7 @@
           <w:sz w:val="24"/>
           <w:szCs w:val="24"/>
         </w:rPr>
-        <w:t xml:space="preserve">Preuve par 9 (croix) : 899 → 8 ; 85 → 4 ; 8 × 4 = 5, et 76 415 → 5 ✓</w:t>
+        <w:t xml:space="preserve">Contrôle visuel par 9 : 899 → 8 ; 85 → 4 ; 8 × 4 = 5, et 76 415 → 5 ✓</w:t>
       </w:r>
     </w:p>
     <w:p>
@@ -5921,7 +5921,7 @@
           <w:sz w:val="24"/>
           <w:szCs w:val="24"/>
         </w:rPr>
-        <w:t xml:space="preserve">Croix de la preuve par 9 : H 3 × B 6 + reste 37 → 1, comme 3 079 → 1 ✓</w:t>
+        <w:t xml:space="preserve">Contrôle visuel par 9 : H 3 × B 6 + reste 37 → 1, comme 3 079 → 1 ✓</w:t>
       </w:r>
     </w:p>
     <w:p>
@@ -6854,7 +6854,7 @@
           <w:sz w:val="24"/>
           <w:szCs w:val="24"/>
         </w:rPr>
-        <w:t xml:space="preserve">Preuve par 9 (croix) : 283 → 4 ; 32 → 5 ; 4 × 5 = 2, et 9 056 → 2 ✓</w:t>
+        <w:t xml:space="preserve">Contrôle visuel par 9 : 283 → 4 ; 32 → 5 ; 4 × 5 = 2, et 9 056 → 2 ✓</w:t>
       </w:r>
     </w:p>
     <w:p>
@@ -6979,7 +6979,7 @@
           <w:sz w:val="24"/>
           <w:szCs w:val="24"/>
         </w:rPr>
-        <w:t xml:space="preserve">Croix de la preuve par 9 : H 2 × B 7 + reste 11 → 7, comme 871 → 7 ✓</w:t>
+        <w:t xml:space="preserve">Contrôle visuel par 9 : H 2 × B 7 + reste 11 → 7, comme 871 → 7 ✓</w:t>
       </w:r>
     </w:p>
     <w:p>
@@ -7878,7 +7878,7 @@
           <w:sz w:val="24"/>
           <w:szCs w:val="24"/>
         </w:rPr>
-        <w:t xml:space="preserve">Preuve par 9 (croix) : 807 → 6 ; 41 → 5 ; 6 × 5 = 3, et 33 087 → 3 ✓</w:t>
+        <w:t xml:space="preserve">Contrôle visuel par 9 : 807 → 6 ; 41 → 5 ; 6 × 5 = 3, et 33 087 → 3 ✓</w:t>
       </w:r>
     </w:p>
     <w:p>
@@ -8003,7 +8003,7 @@
           <w:sz w:val="24"/>
           <w:szCs w:val="24"/>
         </w:rPr>
-        <w:t xml:space="preserve">Croix de la preuve par 9 : H 6 × B 5 + reste 2 → 5, comme 3 236 → 5 ✓</w:t>
+        <w:t xml:space="preserve">Contrôle visuel par 9 : H 6 × B 5 + reste 2 → 5, comme 3 236 → 5 ✓</w:t>
       </w:r>
     </w:p>
     <w:p>
@@ -8909,7 +8909,7 @@
           <w:sz w:val="24"/>
           <w:szCs w:val="24"/>
         </w:rPr>
-        <w:t xml:space="preserve">Preuve par 9 (croix) : 428 → 5 ; 51 → 6 ; 5 × 6 = 3, et 21 828 → 3 ✓</w:t>
+        <w:t xml:space="preserve">Contrôle visuel par 9 : 428 → 5 ; 51 → 6 ; 5 × 6 = 3, et 21 828 → 3 ✓</w:t>
       </w:r>
     </w:p>
     <w:p>
@@ -9034,7 +9034,7 @@
           <w:sz w:val="24"/>
           <w:szCs w:val="24"/>
         </w:rPr>
-        <w:t xml:space="preserve">Croix de la preuve par 9 : H 2 × B 5 + reste 30 → 4, comme 1 246 → 4 ✓</w:t>
+        <w:t xml:space="preserve">Contrôle visuel par 9 : H 2 × B 5 + reste 30 → 4, comme 1 246 → 4 ✓</w:t>
       </w:r>
     </w:p>
     <w:p>
@@ -9913,7 +9913,7 @@
           <w:sz w:val="24"/>
           <w:szCs w:val="24"/>
         </w:rPr>
-        <w:t xml:space="preserve">Preuve par 9 (croix) : 733 → 4 ; 90 → 9 ; 4 × 9 = 9, et 65 970 → 9 ✓</w:t>
+        <w:t xml:space="preserve">Contrôle visuel par 9 : 733 → 4 ; 90 → 9 ; 4 × 9 = 9, et 65 970 → 9 ✓</w:t>
       </w:r>
     </w:p>
     <w:p>
@@ -10038,7 +10038,7 @@
           <w:sz w:val="24"/>
           <w:szCs w:val="24"/>
         </w:rPr>
-        <w:t xml:space="preserve">Croix de la preuve par 9 : H 7 × B 2 + reste 8 → 4, comme 760 → 4 ✓</w:t>
+        <w:t xml:space="preserve">Contrôle visuel par 9 : H 7 × B 2 + reste 8 → 4, comme 760 → 4 ✓</w:t>
       </w:r>
     </w:p>
     <w:p>
@@ -10971,7 +10971,7 @@
           <w:sz w:val="24"/>
           <w:szCs w:val="24"/>
         </w:rPr>
-        <w:t xml:space="preserve">Preuve par 9 (croix) : 902 → 2 ; 54 → 9 ; 2 × 9 = 9, et 48 708 → 9 ✓</w:t>
+        <w:t xml:space="preserve">Contrôle visuel par 9 : 902 → 2 ; 54 → 9 ; 2 × 9 = 9, et 48 708 → 9 ✓</w:t>
       </w:r>
     </w:p>
     <w:p>
@@ -11096,7 +11096,7 @@
           <w:sz w:val="24"/>
           <w:szCs w:val="24"/>
         </w:rPr>
-        <w:t xml:space="preserve">Croix de la preuve par 9 : H 6 × B 7 + reste 19 → 7, comme 2 131 → 7 ✓</w:t>
+        <w:t xml:space="preserve">Contrôle visuel par 9 : H 6 × B 7 + reste 19 → 7, comme 2 131 → 7 ✓</w:t>
       </w:r>
     </w:p>
     <w:p>
@@ -11995,7 +11995,7 @@
           <w:sz w:val="24"/>
           <w:szCs w:val="24"/>
         </w:rPr>
-        <w:t xml:space="preserve">Preuve par 9 (croix) : 957 → 3 ; 87 → 6 ; 3 × 6 = 9, et 83 259 → 9 ✓</w:t>
+        <w:t xml:space="preserve">Contrôle visuel par 9 : 957 → 3 ; 87 → 6 ; 3 × 6 = 9, et 83 259 → 9 ✓</w:t>
       </w:r>
     </w:p>
     <w:p>
@@ -12120,7 +12120,7 @@
           <w:sz w:val="24"/>
           <w:szCs w:val="24"/>
         </w:rPr>
-        <w:t xml:space="preserve">Croix de la preuve par 9 : H 2 × B 2 + reste 14 → 9, comme 774 → 9 ✓</w:t>
+        <w:t xml:space="preserve">Contrôle visuel par 9 : H 2 × B 2 + reste 14 → 9, comme 774 → 9 ✓</w:t>
       </w:r>
     </w:p>
     <w:p>
@@ -13026,7 +13026,7 @@
           <w:sz w:val="24"/>
           <w:szCs w:val="24"/>
         </w:rPr>
-        <w:t xml:space="preserve">Preuve par 9 (croix) : 381 → 3 ; 96 → 6 ; 3 × 6 = 9, et 36 576 → 9 ✓</w:t>
+        <w:t xml:space="preserve">Contrôle visuel par 9 : 381 → 3 ; 96 → 6 ; 3 × 6 = 9, et 36 576 → 9 ✓</w:t>
       </w:r>
     </w:p>
     <w:p>
@@ -13151,7 +13151,7 @@
           <w:sz w:val="24"/>
           <w:szCs w:val="24"/>
         </w:rPr>
-        <w:t xml:space="preserve">Croix de la preuve par 9 : H 6 × B 6 + reste 14 → 5, comme 914 → 5 ✓</w:t>
+        <w:t xml:space="preserve">Contrôle visuel par 9 : H 6 × B 6 + reste 14 → 5, comme 914 → 5 ✓</w:t>
       </w:r>
     </w:p>
     <w:p>
@@ -14030,7 +14030,7 @@
           <w:sz w:val="24"/>
           <w:szCs w:val="24"/>
         </w:rPr>
-        <w:t xml:space="preserve">Preuve par 9 (croix) : 262 → 1 ; 80 → 8 ; 1 × 8 = 8, et 20 960 → 8 ✓</w:t>
+        <w:t xml:space="preserve">Contrôle visuel par 9 : 262 → 1 ; 80 → 8 ; 1 × 8 = 8, et 20 960 → 8 ✓</w:t>
       </w:r>
     </w:p>
     <w:p>
@@ -14155,7 +14155,7 @@
           <w:sz w:val="24"/>
           <w:szCs w:val="24"/>
         </w:rPr>
-        <w:t xml:space="preserve">Croix de la preuve par 9 : H 2 × B 4 + reste 11 → 1, comme 1 891 → 1 ✓</w:t>
+        <w:t xml:space="preserve">Contrôle visuel par 9 : H 2 × B 4 + reste 11 → 1, comme 1 891 → 1 ✓</w:t>
       </w:r>
     </w:p>
     <w:p>
@@ -15088,7 +15088,7 @@
           <w:sz w:val="24"/>
           <w:szCs w:val="24"/>
         </w:rPr>
-        <w:t xml:space="preserve">Preuve par 9 (croix) : 889 → 7 ; 94 → 4 ; 7 × 4 = 1, et 83 566 → 1 ✓</w:t>
+        <w:t xml:space="preserve">Contrôle visuel par 9 : 889 → 7 ; 94 → 4 ; 7 × 4 = 1, et 83 566 → 1 ✓</w:t>
       </w:r>
     </w:p>
     <w:p>
@@ -15213,7 +15213,7 @@
           <w:sz w:val="24"/>
           <w:szCs w:val="24"/>
         </w:rPr>
-        <w:t xml:space="preserve">Croix de la preuve par 9 : H 9 × B 3 + reste 7 → 7, comme 1 357 → 7 ✓</w:t>
+        <w:t xml:space="preserve">Contrôle visuel par 9 : H 9 × B 3 + reste 7 → 7, comme 1 357 → 7 ✓</w:t>
       </w:r>
     </w:p>
     <w:p>
@@ -16112,7 +16112,7 @@
           <w:sz w:val="24"/>
           <w:szCs w:val="24"/>
         </w:rPr>
-        <w:t xml:space="preserve">Preuve par 9 (croix) : 448 → 7 ; 89 → 8 ; 7 × 8 = 2, et 39 872 → 2 ✓</w:t>
+        <w:t xml:space="preserve">Contrôle visuel par 9 : 448 → 7 ; 89 → 8 ; 7 × 8 = 2, et 39 872 → 2 ✓</w:t>
       </w:r>
     </w:p>
     <w:p>
@@ -16237,7 +16237,7 @@
           <w:sz w:val="24"/>
           <w:szCs w:val="24"/>
         </w:rPr>
-        <w:t xml:space="preserve">Croix de la preuve par 9 : H 6 × B 1 + reste 11 → 8, comme 566 → 8 ✓</w:t>
+        <w:t xml:space="preserve">Contrôle visuel par 9 : H 6 × B 1 + reste 11 → 8, comme 566 → 8 ✓</w:t>
       </w:r>
     </w:p>
     <w:p>
@@ -17069,7 +17069,7 @@
           <w:sz w:val="24"/>
           <w:szCs w:val="24"/>
         </w:rPr>
-        <w:t xml:space="preserve">Preuve par 9 (croix) : 334 → 1 ; 65 → 2 ; 1 × 2 = 2, et 21 710 → 2 ✓</w:t>
+        <w:t xml:space="preserve">Contrôle visuel par 9 : 334 → 1 ; 65 → 2 ; 1 × 2 = 2, et 21 710 → 2 ✓</w:t>
       </w:r>
     </w:p>
     <w:p>
@@ -17194,7 +17194,7 @@
           <w:sz w:val="24"/>
           <w:szCs w:val="24"/>
         </w:rPr>
-        <w:t xml:space="preserve">Croix de la preuve par 9 : H 9 × B 5 + reste 18 → 9, comme 1 053 → 9 ✓</w:t>
+        <w:t xml:space="preserve">Contrôle visuel par 9 : H 9 × B 5 + reste 18 → 9, comme 1 053 → 9 ✓</w:t>
       </w:r>
     </w:p>
     <w:p>
@@ -18073,7 +18073,7 @@
           <w:sz w:val="24"/>
           <w:szCs w:val="24"/>
         </w:rPr>
-        <w:t xml:space="preserve">Preuve par 9 (croix) : 628 → 7 ; 79 → 7 ; 7 × 7 = 4, et 49 612 → 4 ✓</w:t>
+        <w:t xml:space="preserve">Contrôle visuel par 9 : 628 → 7 ; 79 → 7 ; 7 × 7 = 4, et 49 612 → 4 ✓</w:t>
       </w:r>
     </w:p>
     <w:p>
@@ -18198,7 +18198,7 @@
           <w:sz w:val="24"/>
           <w:szCs w:val="24"/>
         </w:rPr>
-        <w:t xml:space="preserve">Croix de la preuve par 9 : H 8 × B 5 + reste 7 → 2, comme 1 442 → 2 ✓</w:t>
+        <w:t xml:space="preserve">Contrôle visuel par 9 : H 8 × B 5 + reste 7 → 2, comme 1 442 → 2 ✓</w:t>
       </w:r>
     </w:p>
     <w:p>
@@ -19131,7 +19131,7 @@
           <w:sz w:val="24"/>
           <w:szCs w:val="24"/>
         </w:rPr>
-        <w:t xml:space="preserve">Preuve par 9 (croix) : 544 → 4 ; 81 → 9 ; 4 × 9 = 9, et 44 064 → 9 ✓</w:t>
+        <w:t xml:space="preserve">Contrôle visuel par 9 : 544 → 4 ; 81 → 9 ; 4 × 9 = 9, et 44 064 → 9 ✓</w:t>
       </w:r>
     </w:p>
     <w:p>
@@ -19256,7 +19256,7 @@
           <w:sz w:val="24"/>
           <w:szCs w:val="24"/>
         </w:rPr>
-        <w:t xml:space="preserve">Croix de la preuve par 9 : H 4 × B 7 + reste 8 → 9, comme 2 088 → 9 ✓</w:t>
+        <w:t xml:space="preserve">Contrôle visuel par 9 : H 4 × B 7 + reste 8 → 9, comme 2 088 → 9 ✓</w:t>
       </w:r>
     </w:p>
     <w:p>
@@ -20155,7 +20155,7 @@
           <w:sz w:val="24"/>
           <w:szCs w:val="24"/>
         </w:rPr>
-        <w:t xml:space="preserve">Preuve par 9 (croix) : 936 → 9 ; 73 → 1 ; 9 × 1 = 9, et 68 328 → 9 ✓</w:t>
+        <w:t xml:space="preserve">Contrôle visuel par 9 : 936 → 9 ; 73 → 1 ; 9 × 1 = 9, et 68 328 → 9 ✓</w:t>
       </w:r>
     </w:p>
     <w:p>
@@ -20280,7 +20280,7 @@
           <w:sz w:val="24"/>
           <w:szCs w:val="24"/>
         </w:rPr>
-        <w:t xml:space="preserve">Croix de la preuve par 9 : H 6 × B 8 + reste 8 → 2, comme 1 073 → 2 ✓</w:t>
+        <w:t xml:space="preserve">Contrôle visuel par 9 : H 6 × B 8 + reste 8 → 2, comme 1 073 → 2 ✓</w:t>
       </w:r>
     </w:p>
     <w:p>

</xml_diff>

<commit_message>
Math T5 : retirer les cadres Mon cahier et intégrer les formats d'examens
- Analyse des sept sujets d'examen et des formats réels malgaches\n- Ajout des questions en lettres/chiffres, comparaisons, rangement, conversions, aires et perpendicularité\n- Suppression des pages graphiques génériques MON CAHIER\n- Conservation d'explications courtes dans le fil de la leçon\n- Audit des sources ajouté dans AUDIT_SOURCES_EXAMENS_MALGACHES.md

Co-authored-by: arena-agent <297053741+arena-agent@users.noreply.github.com>
</commit_message>
<xml_diff>
--- a/manuel-math-t5/Manuel_Mathematiques_T5_EXAMENS.docx
+++ b/manuel-math-t5/Manuel_Mathematiques_T5_EXAMENS.docx
@@ -13932,7 +13932,7 @@
           <w:sz w:val="24"/>
           <w:szCs w:val="24"/>
         </w:rPr>
-        <w:t xml:space="preserve">1.  … − 3 785 = 8 420</w:t>
+        <w:t xml:space="preserve">1.  Écris en lettres : 12 078</w:t>
       </w:r>
     </w:p>
     <w:p>
@@ -13952,7 +13952,7 @@
           <w:sz w:val="24"/>
           <w:szCs w:val="24"/>
         </w:rPr>
-        <w:t xml:space="preserve">2.  … × 24 = 7 200</w:t>
+        <w:t xml:space="preserve">2.  Écris en chiffres : quatre-vingt-quatorze</w:t>
       </w:r>
     </w:p>
     <w:p>
@@ -13972,7 +13972,7 @@
           <w:sz w:val="24"/>
           <w:szCs w:val="24"/>
         </w:rPr>
-        <w:t xml:space="preserve">3.  8 400 ÷ … = 120</w:t>
+        <w:t xml:space="preserve">3.  Range dans l’ordre croissant : 87 ; 93 ; 78 ; 39</w:t>
       </w:r>
     </w:p>
     <w:p>
@@ -13992,7 +13992,7 @@
           <w:sz w:val="24"/>
           <w:szCs w:val="24"/>
         </w:rPr>
-        <w:t xml:space="preserve">4.  3 600 g = … kg</w:t>
+        <w:t xml:space="preserve">4.  Compare : 10,1 … 10,099 ; 37,2 … 37,200</w:t>
       </w:r>
     </w:p>
     <w:p>
@@ -14012,7 +14012,7 @@
           <w:sz w:val="24"/>
           <w:szCs w:val="24"/>
         </w:rPr>
-        <w:t xml:space="preserve">5.  99 999 + 1 = …</w:t>
+        <w:t xml:space="preserve">5.  Calcule : 25 + 57 et 19 × 3</w:t>
       </w:r>
     </w:p>
     <w:p>
@@ -14055,13 +14055,190 @@
     </w:p>
     <w:p>
       <w:pPr>
+        <w:spacing w:after="60" w:line="300"/>
+        <w:ind w:left="360"/>
+        <w:jc w:val="left"/>
+      </w:pPr>
+      <w:r>
+        <w:rPr>
+          <w:rFonts w:ascii="Times New Roman" w:cs="Times New Roman" w:eastAsia="Times New Roman" w:hAnsi="Times New Roman"/>
+          <w:b w:val="false"/>
+          <w:bCs w:val="false"/>
+          <w:i w:val="false"/>
+          <w:iCs w:val="false"/>
+          <w:color w:val="000000"/>
+          <w:sz w:val="24"/>
+          <w:szCs w:val="24"/>
+        </w:rPr>
+        <w:t xml:space="preserve">12 078 se lit : douze mille soixante-dix-huit.</w:t>
+      </w:r>
+    </w:p>
+    <w:p>
+      <w:pPr>
+        <w:spacing w:after="60" w:line="300"/>
+        <w:ind w:left="360"/>
+        <w:jc w:val="left"/>
+      </w:pPr>
+      <w:r>
+        <w:rPr>
+          <w:rFonts w:ascii="Times New Roman" w:cs="Times New Roman" w:eastAsia="Times New Roman" w:hAnsi="Times New Roman"/>
+          <w:b w:val="false"/>
+          <w:bCs w:val="false"/>
+          <w:i w:val="false"/>
+          <w:iCs w:val="false"/>
+          <w:color w:val="000000"/>
+          <w:sz w:val="24"/>
+          <w:szCs w:val="24"/>
+        </w:rPr>
+        <w:t xml:space="preserve">Réponse : douze mille soixante-dix-huit.</w:t>
+      </w:r>
+    </w:p>
+    <w:p>
+      <w:pPr>
+        <w:spacing w:after="40" w:line="300"/>
+        <w:jc w:val="left"/>
+      </w:pPr>
+      <w:r>
+        <w:rPr>
+          <w:rFonts w:ascii="Times New Roman" w:cs="Times New Roman" w:eastAsia="Times New Roman" w:hAnsi="Times New Roman"/>
+          <w:b w:val="false"/>
+          <w:bCs w:val="false"/>
+          <w:i w:val="false"/>
+          <w:iCs w:val="false"/>
+          <w:color w:val="000000"/>
+          <w:sz w:val="24"/>
+          <w:szCs w:val="24"/>
+        </w:rPr>
+        <w:t xml:space="preserve">2.</w:t>
+      </w:r>
+    </w:p>
+    <w:p>
+      <w:pPr>
+        <w:spacing w:after="60" w:line="300"/>
+        <w:ind w:left="360"/>
+        <w:jc w:val="left"/>
+      </w:pPr>
+      <w:r>
+        <w:rPr>
+          <w:rFonts w:ascii="Times New Roman" w:cs="Times New Roman" w:eastAsia="Times New Roman" w:hAnsi="Times New Roman"/>
+          <w:b w:val="false"/>
+          <w:bCs w:val="false"/>
+          <w:i w:val="false"/>
+          <w:iCs w:val="false"/>
+          <w:color w:val="000000"/>
+          <w:sz w:val="24"/>
+          <w:szCs w:val="24"/>
+        </w:rPr>
+        <w:t xml:space="preserve">« quatre-vingt-quatorze » correspond à 94.</w:t>
+      </w:r>
+    </w:p>
+    <w:p>
+      <w:pPr>
+        <w:spacing w:after="60" w:line="300"/>
+        <w:ind w:left="360"/>
+        <w:jc w:val="left"/>
+      </w:pPr>
+      <w:r>
+        <w:rPr>
+          <w:rFonts w:ascii="Times New Roman" w:cs="Times New Roman" w:eastAsia="Times New Roman" w:hAnsi="Times New Roman"/>
+          <w:b w:val="false"/>
+          <w:bCs w:val="false"/>
+          <w:i w:val="false"/>
+          <w:iCs w:val="false"/>
+          <w:color w:val="000000"/>
+          <w:sz w:val="24"/>
+          <w:szCs w:val="24"/>
+        </w:rPr>
+        <w:t xml:space="preserve">Réponse : 94.</w:t>
+      </w:r>
+    </w:p>
+    <w:p>
+      <w:pPr>
+        <w:spacing w:after="40" w:line="300"/>
+        <w:jc w:val="left"/>
+      </w:pPr>
+      <w:r>
+        <w:rPr>
+          <w:rFonts w:ascii="Times New Roman" w:cs="Times New Roman" w:eastAsia="Times New Roman" w:hAnsi="Times New Roman"/>
+          <w:b w:val="false"/>
+          <w:bCs w:val="false"/>
+          <w:i w:val="false"/>
+          <w:iCs w:val="false"/>
+          <w:color w:val="000000"/>
+          <w:sz w:val="24"/>
+          <w:szCs w:val="24"/>
+        </w:rPr>
+        <w:t xml:space="preserve">3.</w:t>
+      </w:r>
+    </w:p>
+    <w:p>
+      <w:pPr>
+        <w:spacing w:after="60" w:line="300"/>
+        <w:ind w:left="360"/>
+        <w:jc w:val="left"/>
+      </w:pPr>
+      <w:r>
+        <w:rPr>
+          <w:rFonts w:ascii="Times New Roman" w:cs="Times New Roman" w:eastAsia="Times New Roman" w:hAnsi="Times New Roman"/>
+          <w:b w:val="false"/>
+          <w:bCs w:val="false"/>
+          <w:i w:val="false"/>
+          <w:iCs w:val="false"/>
+          <w:color w:val="000000"/>
+          <w:sz w:val="24"/>
+          <w:szCs w:val="24"/>
+        </w:rPr>
+        <w:t xml:space="preserve">Je compare les nombres puis je les place du plus petit au plus grand.</w:t>
+      </w:r>
+    </w:p>
+    <w:p>
+      <w:pPr>
+        <w:spacing w:after="60" w:line="300"/>
+        <w:ind w:left="360"/>
+        <w:jc w:val="left"/>
+      </w:pPr>
+      <w:r>
+        <w:rPr>
+          <w:rFonts w:ascii="Times New Roman" w:cs="Times New Roman" w:eastAsia="Times New Roman" w:hAnsi="Times New Roman"/>
+          <w:b w:val="false"/>
+          <w:bCs w:val="false"/>
+          <w:i w:val="false"/>
+          <w:iCs w:val="false"/>
+          <w:color w:val="000000"/>
+          <w:sz w:val="24"/>
+          <w:szCs w:val="24"/>
+        </w:rPr>
+        <w:t xml:space="preserve">39 &lt; 78 &lt; 87 &lt; 93.</w:t>
+      </w:r>
+    </w:p>
+    <w:p>
+      <w:pPr>
+        <w:spacing w:after="40" w:line="300"/>
+        <w:jc w:val="left"/>
+      </w:pPr>
+      <w:r>
+        <w:rPr>
+          <w:rFonts w:ascii="Times New Roman" w:cs="Times New Roman" w:eastAsia="Times New Roman" w:hAnsi="Times New Roman"/>
+          <w:b w:val="false"/>
+          <w:bCs w:val="false"/>
+          <w:i w:val="false"/>
+          <w:iCs w:val="false"/>
+          <w:color w:val="000000"/>
+          <w:sz w:val="24"/>
+          <w:szCs w:val="24"/>
+        </w:rPr>
+        <w:t xml:space="preserve">4.</w:t>
+      </w:r>
+    </w:p>
+    <w:p>
+      <w:pPr>
         <w:spacing w:after="100" w:before="80"/>
         <w:jc w:val="center"/>
       </w:pPr>
       <w:r>
         <w:drawing>
           <wp:inline distT="0" distB="0" distL="0" distR="0">
-            <wp:extent cx="4476750" cy="2038350"/>
+            <wp:extent cx="4476750" cy="1638300"/>
             <wp:effectExtent t="0" r="0" b="0" l="0"/>
             <wp:docPr id="91" name=""/>
             <wp:cNvGraphicFramePr>
@@ -14086,7 +14263,7 @@
                   <pic:spPr bwMode="auto">
                     <a:xfrm>
                       <a:off x="0" y="0"/>
-                      <a:ext cx="4476750" cy="2038350"/>
+                      <a:ext cx="4476750" cy="1638300"/>
                     </a:xfrm>
                     <a:prstGeom prst="rect">
                       <a:avLst/>
@@ -14116,7 +14293,7 @@
           <w:sz w:val="24"/>
           <w:szCs w:val="24"/>
         </w:rPr>
-        <w:t xml:space="preserve">Le nombre manquant = 8 420 + 3 785.</w:t>
+        <w:t xml:space="preserve">10,1 = 10,100 &gt; 10,099 ; 37,2 = 37,200.</w:t>
       </w:r>
     </w:p>
     <w:p>
@@ -14136,7 +14313,7 @@
           <w:sz w:val="24"/>
           <w:szCs w:val="24"/>
         </w:rPr>
-        <w:t xml:space="preserve">… = 12 205.</w:t>
+        <w:t xml:space="preserve">Réponse : &gt; ; =.</w:t>
       </w:r>
     </w:p>
     <w:p>
@@ -14155,7 +14332,7 @@
           <w:sz w:val="24"/>
           <w:szCs w:val="24"/>
         </w:rPr>
-        <w:t xml:space="preserve">2.</w:t>
+        <w:t xml:space="preserve">5.</w:t>
       </w:r>
     </w:p>
     <w:p>
@@ -14166,7 +14343,7 @@
       <w:r>
         <w:drawing>
           <wp:inline distT="0" distB="0" distL="0" distR="0">
-            <wp:extent cx="4476750" cy="2533650"/>
+            <wp:extent cx="4476750" cy="1638300"/>
             <wp:effectExtent t="0" r="0" b="0" l="0"/>
             <wp:docPr id="92" name=""/>
             <wp:cNvGraphicFramePr>
@@ -14191,7 +14368,7 @@
                   <pic:spPr bwMode="auto">
                     <a:xfrm>
                       <a:off x="0" y="0"/>
-                      <a:ext cx="4476750" cy="2533650"/>
+                      <a:ext cx="4476750" cy="1638300"/>
                     </a:xfrm>
                     <a:prstGeom prst="rect">
                       <a:avLst/>
@@ -14221,7 +14398,7 @@
           <w:sz w:val="24"/>
           <w:szCs w:val="24"/>
         </w:rPr>
-        <w:t xml:space="preserve">Le facteur manquant = 7 200 ÷ 24.</w:t>
+        <w:t xml:space="preserve">25 + 57 = 82 ; 19 × 3 = 57.</w:t>
       </w:r>
     </w:p>
     <w:p>
@@ -14241,7 +14418,172 @@
           <w:sz w:val="24"/>
           <w:szCs w:val="24"/>
         </w:rPr>
-        <w:t xml:space="preserve">… = 300.</w:t>
+        <w:t xml:space="preserve">Réponses : 82 et 57.</w:t>
+      </w:r>
+    </w:p>
+    <w:p>
+      <w:r>
+        <w:br w:type="page"/>
+      </w:r>
+    </w:p>
+    <w:p>
+      <w:pPr>
+        <w:spacing w:after="150" w:before="200"/>
+        <w:jc w:val="center"/>
+      </w:pPr>
+      <w:bookmarkStart w:name="exop20" w:id="21"/>
+      <w:r>
+        <w:rPr>
+          <w:rFonts w:ascii="Times New Roman" w:cs="Times New Roman" w:eastAsia="Times New Roman" w:hAnsi="Times New Roman"/>
+          <w:b/>
+          <w:bCs/>
+          <w:i w:val="false"/>
+          <w:iCs w:val="false"/>
+          <w:color w:val="C00000"/>
+          <w:sz w:val="32"/>
+          <w:szCs w:val="32"/>
+        </w:rPr>
+        <w:t xml:space="preserve">SUJET N° 20 — OPÉRATIONS</w:t>
+      </w:r>
+      <w:bookmarkEnd w:id="21"/>
+    </w:p>
+    <w:p>
+      <w:pPr>
+        <w:shd w:fill="FFF8E1" w:val="clear"/>
+        <w:spacing w:after="100" w:line="300"/>
+        <w:jc w:val="left"/>
+      </w:pPr>
+      <w:r>
+        <w:rPr>
+          <w:rFonts w:ascii="Times New Roman" w:cs="Times New Roman" w:eastAsia="Times New Roman" w:hAnsi="Times New Roman"/>
+          <w:b w:val="false"/>
+          <w:bCs w:val="false"/>
+          <w:i w:val="false"/>
+          <w:iCs w:val="false"/>
+          <w:color w:val="000000"/>
+          <w:sz w:val="24"/>
+          <w:szCs w:val="24"/>
+        </w:rPr>
+        <w:t xml:space="preserve">Effectue les opérations suivantes en posant tes calculs. Durée conseillée : 30 minutes.</w:t>
+      </w:r>
+    </w:p>
+    <w:p>
+      <w:pPr>
+        <w:spacing w:after="100" w:line="300"/>
+        <w:ind w:left="240"/>
+        <w:jc w:val="left"/>
+      </w:pPr>
+      <w:r>
+        <w:rPr>
+          <w:rFonts w:ascii="Times New Roman" w:cs="Times New Roman" w:eastAsia="Times New Roman" w:hAnsi="Times New Roman"/>
+          <w:b w:val="false"/>
+          <w:bCs w:val="false"/>
+          <w:i w:val="false"/>
+          <w:iCs w:val="false"/>
+          <w:color w:val="000000"/>
+          <w:sz w:val="24"/>
+          <w:szCs w:val="24"/>
+        </w:rPr>
+        <w:t xml:space="preserve">1.  Compare : 39 L … 900 mL ; 7 hm … 700 m</w:t>
+      </w:r>
+    </w:p>
+    <w:p>
+      <w:pPr>
+        <w:spacing w:after="100" w:line="300"/>
+        <w:ind w:left="240"/>
+        <w:jc w:val="left"/>
+      </w:pPr>
+      <w:r>
+        <w:rPr>
+          <w:rFonts w:ascii="Times New Roman" w:cs="Times New Roman" w:eastAsia="Times New Roman" w:hAnsi="Times New Roman"/>
+          <w:b w:val="false"/>
+          <w:bCs w:val="false"/>
+          <w:i w:val="false"/>
+          <w:iCs w:val="false"/>
+          <w:color w:val="000000"/>
+          <w:sz w:val="24"/>
+          <w:szCs w:val="24"/>
+        </w:rPr>
+        <w:t xml:space="preserve">2.  300 kg = … t</w:t>
+      </w:r>
+    </w:p>
+    <w:p>
+      <w:pPr>
+        <w:spacing w:after="100" w:line="300"/>
+        <w:ind w:left="240"/>
+        <w:jc w:val="left"/>
+      </w:pPr>
+      <w:r>
+        <w:rPr>
+          <w:rFonts w:ascii="Times New Roman" w:cs="Times New Roman" w:eastAsia="Times New Roman" w:hAnsi="Times New Roman"/>
+          <w:b w:val="false"/>
+          <w:bCs w:val="false"/>
+          <w:i w:val="false"/>
+          <w:iCs w:val="false"/>
+          <w:color w:val="000000"/>
+          <w:sz w:val="24"/>
+          <w:szCs w:val="24"/>
+        </w:rPr>
+        <w:t xml:space="preserve">3.  9,2 q = … hg</w:t>
+      </w:r>
+    </w:p>
+    <w:p>
+      <w:pPr>
+        <w:spacing w:after="100" w:line="300"/>
+        <w:ind w:left="240"/>
+        <w:jc w:val="left"/>
+      </w:pPr>
+      <w:r>
+        <w:rPr>
+          <w:rFonts w:ascii="Times New Roman" w:cs="Times New Roman" w:eastAsia="Times New Roman" w:hAnsi="Times New Roman"/>
+          <w:b w:val="false"/>
+          <w:bCs w:val="false"/>
+          <w:i w:val="false"/>
+          <w:iCs w:val="false"/>
+          <w:color w:val="000000"/>
+          <w:sz w:val="24"/>
+          <w:szCs w:val="24"/>
+        </w:rPr>
+        <w:t xml:space="preserve">4.  Un losange a D = 16 cm et d = 9 cm. Calculez son aire.</w:t>
+      </w:r>
+    </w:p>
+    <w:p>
+      <w:pPr>
+        <w:spacing w:after="100" w:line="300"/>
+        <w:ind w:left="240"/>
+        <w:jc w:val="left"/>
+      </w:pPr>
+      <w:r>
+        <w:rPr>
+          <w:rFonts w:ascii="Times New Roman" w:cs="Times New Roman" w:eastAsia="Times New Roman" w:hAnsi="Times New Roman"/>
+          <w:b w:val="false"/>
+          <w:bCs w:val="false"/>
+          <w:i w:val="false"/>
+          <w:iCs w:val="false"/>
+          <w:color w:val="000000"/>
+          <w:sz w:val="24"/>
+          <w:szCs w:val="24"/>
+        </w:rPr>
+        <w:t xml:space="preserve">5.  Trace deux droites perpendiculaires.</w:t>
+      </w:r>
+    </w:p>
+    <w:p>
+      <w:pPr>
+        <w:shd w:fill="2E7D32" w:val="clear"/>
+        <w:spacing w:after="110" w:before="180"/>
+      </w:pPr>
+      <w:r>
+        <w:rPr>
+          <w:rFonts w:ascii="Times New Roman" w:cs="Times New Roman" w:eastAsia="Times New Roman" w:hAnsi="Times New Roman"/>
+          <w:b/>
+          <w:bCs/>
+          <w:i w:val="false"/>
+          <w:iCs w:val="false"/>
+          <w:color w:val="FFFFFF"/>
+          <w:sz w:val="26"/>
+          <w:szCs w:val="26"/>
+        </w:rPr>
+        <w:t xml:space="preserve">  CORRIGÉ DU SUJET N° 20</w:t>
       </w:r>
     </w:p>
     <w:p>
@@ -14260,7 +14602,7 @@
           <w:sz w:val="24"/>
           <w:szCs w:val="24"/>
         </w:rPr>
-        <w:t xml:space="preserve">3.</w:t>
+        <w:t xml:space="preserve">1.</w:t>
       </w:r>
     </w:p>
     <w:p>
@@ -14271,7 +14613,7 @@
       <w:r>
         <w:drawing>
           <wp:inline distT="0" distB="0" distL="0" distR="0">
-            <wp:extent cx="4476750" cy="3048000"/>
+            <wp:extent cx="4476750" cy="1638300"/>
             <wp:effectExtent t="0" r="0" b="0" l="0"/>
             <wp:docPr id="93" name=""/>
             <wp:cNvGraphicFramePr>
@@ -14296,7 +14638,7 @@
                   <pic:spPr bwMode="auto">
                     <a:xfrm>
                       <a:off x="0" y="0"/>
-                      <a:ext cx="4476750" cy="3048000"/>
+                      <a:ext cx="4476750" cy="1638300"/>
                     </a:xfrm>
                     <a:prstGeom prst="rect">
                       <a:avLst/>
@@ -14326,7 +14668,7 @@
           <w:sz w:val="24"/>
           <w:szCs w:val="24"/>
         </w:rPr>
-        <w:t xml:space="preserve">Le diviseur manquant = 8 400 ÷ 120.</w:t>
+        <w:t xml:space="preserve">39 L = 39 000 mL, donc 39 L &gt; 900 mL.</w:t>
       </w:r>
     </w:p>
     <w:p>
@@ -14346,7 +14688,7 @@
           <w:sz w:val="24"/>
           <w:szCs w:val="24"/>
         </w:rPr>
-        <w:t xml:space="preserve">… = 70.</w:t>
+        <w:t xml:space="preserve">7 hm = 700 m, donc 7 hm = 700 m.</w:t>
       </w:r>
     </w:p>
     <w:p>
@@ -14365,7 +14707,7 @@
           <w:sz w:val="24"/>
           <w:szCs w:val="24"/>
         </w:rPr>
-        <w:t xml:space="preserve">4.</w:t>
+        <w:t xml:space="preserve">2.</w:t>
       </w:r>
     </w:p>
     <w:p>
@@ -14451,7 +14793,7 @@
           <w:sz w:val="24"/>
           <w:szCs w:val="24"/>
         </w:rPr>
-        <w:t xml:space="preserve">3 600 g ÷ 1 000 = 3,6 kg.</w:t>
+        <w:t xml:space="preserve">300 kg ÷ 1 000 = 0,3 t.</w:t>
       </w:r>
     </w:p>
     <w:p>
@@ -14470,7 +14812,7 @@
           <w:sz w:val="24"/>
           <w:szCs w:val="24"/>
         </w:rPr>
-        <w:t xml:space="preserve">5.</w:t>
+        <w:t xml:space="preserve">3.</w:t>
       </w:r>
     </w:p>
     <w:p>
@@ -14481,7 +14823,7 @@
       <w:r>
         <w:drawing>
           <wp:inline distT="0" distB="0" distL="0" distR="0">
-            <wp:extent cx="4476750" cy="2038350"/>
+            <wp:extent cx="4476750" cy="1876425"/>
             <wp:effectExtent t="0" r="0" b="0" l="0"/>
             <wp:docPr id="95" name=""/>
             <wp:cNvGraphicFramePr>
@@ -14506,7 +14848,7 @@
                   <pic:spPr bwMode="auto">
                     <a:xfrm>
                       <a:off x="0" y="0"/>
-                      <a:ext cx="4476750" cy="2038350"/>
+                      <a:ext cx="4476750" cy="1876425"/>
                     </a:xfrm>
                     <a:prstGeom prst="rect">
                       <a:avLst/>
@@ -14536,7 +14878,7 @@
           <w:sz w:val="24"/>
           <w:szCs w:val="24"/>
         </w:rPr>
-        <w:t xml:space="preserve">J’aligne unités, dizaines et centaines.</w:t>
+        <w:t xml:space="preserve">Je convertis avant de calculer.</w:t>
       </w:r>
     </w:p>
     <w:p>
@@ -14556,172 +14898,7 @@
           <w:sz w:val="24"/>
           <w:szCs w:val="24"/>
         </w:rPr>
-        <w:t xml:space="preserve">99 999 + 1 = 100 000.</w:t>
-      </w:r>
-    </w:p>
-    <w:p>
-      <w:r>
-        <w:br w:type="page"/>
-      </w:r>
-    </w:p>
-    <w:p>
-      <w:pPr>
-        <w:spacing w:after="150" w:before="200"/>
-        <w:jc w:val="center"/>
-      </w:pPr>
-      <w:bookmarkStart w:name="exop20" w:id="21"/>
-      <w:r>
-        <w:rPr>
-          <w:rFonts w:ascii="Times New Roman" w:cs="Times New Roman" w:eastAsia="Times New Roman" w:hAnsi="Times New Roman"/>
-          <w:b/>
-          <w:bCs/>
-          <w:i w:val="false"/>
-          <w:iCs w:val="false"/>
-          <w:color w:val="C00000"/>
-          <w:sz w:val="32"/>
-          <w:szCs w:val="32"/>
-        </w:rPr>
-        <w:t xml:space="preserve">SUJET N° 20 — OPÉRATIONS</w:t>
-      </w:r>
-      <w:bookmarkEnd w:id="21"/>
-    </w:p>
-    <w:p>
-      <w:pPr>
-        <w:shd w:fill="FFF8E1" w:val="clear"/>
-        <w:spacing w:after="100" w:line="300"/>
-        <w:jc w:val="left"/>
-      </w:pPr>
-      <w:r>
-        <w:rPr>
-          <w:rFonts w:ascii="Times New Roman" w:cs="Times New Roman" w:eastAsia="Times New Roman" w:hAnsi="Times New Roman"/>
-          <w:b w:val="false"/>
-          <w:bCs w:val="false"/>
-          <w:i w:val="false"/>
-          <w:iCs w:val="false"/>
-          <w:color w:val="000000"/>
-          <w:sz w:val="24"/>
-          <w:szCs w:val="24"/>
-        </w:rPr>
-        <w:t xml:space="preserve">Effectue les opérations suivantes en posant tes calculs. Durée conseillée : 30 minutes.</w:t>
-      </w:r>
-    </w:p>
-    <w:p>
-      <w:pPr>
-        <w:spacing w:after="100" w:line="300"/>
-        <w:ind w:left="240"/>
-        <w:jc w:val="left"/>
-      </w:pPr>
-      <w:r>
-        <w:rPr>
-          <w:rFonts w:ascii="Times New Roman" w:cs="Times New Roman" w:eastAsia="Times New Roman" w:hAnsi="Times New Roman"/>
-          <w:b w:val="false"/>
-          <w:bCs w:val="false"/>
-          <w:i w:val="false"/>
-          <w:iCs w:val="false"/>
-          <w:color w:val="000000"/>
-          <w:sz w:val="24"/>
-          <w:szCs w:val="24"/>
-        </w:rPr>
-        <w:t xml:space="preserve">1.  587 406 + 91 295 = …</w:t>
-      </w:r>
-    </w:p>
-    <w:p>
-      <w:pPr>
-        <w:spacing w:after="100" w:line="300"/>
-        <w:ind w:left="240"/>
-        <w:jc w:val="left"/>
-      </w:pPr>
-      <w:r>
-        <w:rPr>
-          <w:rFonts w:ascii="Times New Roman" w:cs="Times New Roman" w:eastAsia="Times New Roman" w:hAnsi="Times New Roman"/>
-          <w:b w:val="false"/>
-          <w:bCs w:val="false"/>
-          <w:i w:val="false"/>
-          <w:iCs w:val="false"/>
-          <w:color w:val="000000"/>
-          <w:sz w:val="24"/>
-          <w:szCs w:val="24"/>
-        </w:rPr>
-        <w:t xml:space="preserve">2.  700 000 − 286 754 = …</w:t>
-      </w:r>
-    </w:p>
-    <w:p>
-      <w:pPr>
-        <w:spacing w:after="100" w:line="300"/>
-        <w:ind w:left="240"/>
-        <w:jc w:val="left"/>
-      </w:pPr>
-      <w:r>
-        <w:rPr>
-          <w:rFonts w:ascii="Times New Roman" w:cs="Times New Roman" w:eastAsia="Times New Roman" w:hAnsi="Times New Roman"/>
-          <w:b w:val="false"/>
-          <w:bCs w:val="false"/>
-          <w:i w:val="false"/>
-          <w:iCs w:val="false"/>
-          <w:color w:val="000000"/>
-          <w:sz w:val="24"/>
-          <w:szCs w:val="24"/>
-        </w:rPr>
-        <w:t xml:space="preserve">3.  725 × 48 = …</w:t>
-      </w:r>
-    </w:p>
-    <w:p>
-      <w:pPr>
-        <w:spacing w:after="100" w:line="300"/>
-        <w:ind w:left="240"/>
-        <w:jc w:val="left"/>
-      </w:pPr>
-      <w:r>
-        <w:rPr>
-          <w:rFonts w:ascii="Times New Roman" w:cs="Times New Roman" w:eastAsia="Times New Roman" w:hAnsi="Times New Roman"/>
-          <w:b w:val="false"/>
-          <w:bCs w:val="false"/>
-          <w:i w:val="false"/>
-          <w:iCs w:val="false"/>
-          <w:color w:val="000000"/>
-          <w:sz w:val="24"/>
-          <w:szCs w:val="24"/>
-        </w:rPr>
-        <w:t xml:space="preserve">4.  9 876 ÷ 37 = …</w:t>
-      </w:r>
-    </w:p>
-    <w:p>
-      <w:pPr>
-        <w:spacing w:after="100" w:line="300"/>
-        <w:ind w:left="240"/>
-        <w:jc w:val="left"/>
-      </w:pPr>
-      <w:r>
-        <w:rPr>
-          <w:rFonts w:ascii="Times New Roman" w:cs="Times New Roman" w:eastAsia="Times New Roman" w:hAnsi="Times New Roman"/>
-          <w:b w:val="false"/>
-          <w:bCs w:val="false"/>
-          <w:i w:val="false"/>
-          <w:iCs w:val="false"/>
-          <w:color w:val="000000"/>
-          <w:sz w:val="24"/>
-          <w:szCs w:val="24"/>
-        </w:rPr>
-        <w:t xml:space="preserve">5.  Un sac de riz de 50 kg est partagé en sacs de 2,5 kg. Combien de sacs ?</w:t>
-      </w:r>
-    </w:p>
-    <w:p>
-      <w:pPr>
-        <w:shd w:fill="2E7D32" w:val="clear"/>
-        <w:spacing w:after="110" w:before="180"/>
-      </w:pPr>
-      <w:r>
-        <w:rPr>
-          <w:rFonts w:ascii="Times New Roman" w:cs="Times New Roman" w:eastAsia="Times New Roman" w:hAnsi="Times New Roman"/>
-          <w:b/>
-          <w:bCs/>
-          <w:i w:val="false"/>
-          <w:iCs w:val="false"/>
-          <w:color w:val="FFFFFF"/>
-          <w:sz w:val="26"/>
-          <w:szCs w:val="26"/>
-        </w:rPr>
-        <w:t xml:space="preserve">  CORRIGÉ DU SUJET N° 20</w:t>
+        <w:t xml:space="preserve">9,2 q = 920 kg = 9 200 hg = 9 200 hg.</w:t>
       </w:r>
     </w:p>
     <w:p>
@@ -14740,7 +14917,7 @@
           <w:sz w:val="24"/>
           <w:szCs w:val="24"/>
         </w:rPr>
-        <w:t xml:space="preserve">1.</w:t>
+        <w:t xml:space="preserve">4.</w:t>
       </w:r>
     </w:p>
     <w:p>
@@ -14751,7 +14928,7 @@
       <w:r>
         <w:drawing>
           <wp:inline distT="0" distB="0" distL="0" distR="0">
-            <wp:extent cx="4476750" cy="2038350"/>
+            <wp:extent cx="4476750" cy="1638300"/>
             <wp:effectExtent t="0" r="0" b="0" l="0"/>
             <wp:docPr id="96" name=""/>
             <wp:cNvGraphicFramePr>
@@ -14776,7 +14953,7 @@
                   <pic:spPr bwMode="auto">
                     <a:xfrm>
                       <a:off x="0" y="0"/>
-                      <a:ext cx="4476750" cy="2038350"/>
+                      <a:ext cx="4476750" cy="1638300"/>
                     </a:xfrm>
                     <a:prstGeom prst="rect">
                       <a:avLst/>
@@ -14806,7 +14983,7 @@
           <w:sz w:val="24"/>
           <w:szCs w:val="24"/>
         </w:rPr>
-        <w:t xml:space="preserve">J’aligne unités, dizaines et centaines.</w:t>
+        <w:t xml:space="preserve">A = 16 × 9 ÷ 2 = 72.</w:t>
       </w:r>
     </w:p>
     <w:p>
@@ -14826,7 +15003,7 @@
           <w:sz w:val="24"/>
           <w:szCs w:val="24"/>
         </w:rPr>
-        <w:t xml:space="preserve">587 406 + 91 295 = 678 701.</w:t>
+        <w:t xml:space="preserve">L’aire est 72 cm².</w:t>
       </w:r>
     </w:p>
     <w:p>
@@ -14845,7 +15022,7 @@
           <w:sz w:val="24"/>
           <w:szCs w:val="24"/>
         </w:rPr>
-        <w:t xml:space="preserve">2.</w:t>
+        <w:t xml:space="preserve">5.</w:t>
       </w:r>
     </w:p>
     <w:p>
@@ -14856,7 +15033,7 @@
       <w:r>
         <w:drawing>
           <wp:inline distT="0" distB="0" distL="0" distR="0">
-            <wp:extent cx="4476750" cy="2038350"/>
+            <wp:extent cx="4476750" cy="1638300"/>
             <wp:effectExtent t="0" r="0" b="0" l="0"/>
             <wp:docPr id="97" name=""/>
             <wp:cNvGraphicFramePr>
@@ -14881,321 +15058,6 @@
                   <pic:spPr bwMode="auto">
                     <a:xfrm>
                       <a:off x="0" y="0"/>
-                      <a:ext cx="4476750" cy="2038350"/>
-                    </a:xfrm>
-                    <a:prstGeom prst="rect">
-                      <a:avLst/>
-                    </a:prstGeom>
-                  </pic:spPr>
-                </pic:pic>
-              </a:graphicData>
-            </a:graphic>
-          </wp:inline>
-        </w:drawing>
-      </w:r>
-    </w:p>
-    <w:p>
-      <w:pPr>
-        <w:spacing w:after="60" w:line="300"/>
-        <w:ind w:left="360"/>
-        <w:jc w:val="left"/>
-      </w:pPr>
-      <w:r>
-        <w:rPr>
-          <w:rFonts w:ascii="Times New Roman" w:cs="Times New Roman" w:eastAsia="Times New Roman" w:hAnsi="Times New Roman"/>
-          <w:b w:val="false"/>
-          <w:bCs w:val="false"/>
-          <w:i w:val="false"/>
-          <w:iCs w:val="false"/>
-          <w:color w:val="000000"/>
-          <w:sz w:val="24"/>
-          <w:szCs w:val="24"/>
-        </w:rPr>
-        <w:t xml:space="preserve">Je pose le plus grand nombre en haut et j’emprunte si nécessaire.</w:t>
-      </w:r>
-    </w:p>
-    <w:p>
-      <w:pPr>
-        <w:spacing w:after="60" w:line="300"/>
-        <w:ind w:left="360"/>
-        <w:jc w:val="left"/>
-      </w:pPr>
-      <w:r>
-        <w:rPr>
-          <w:rFonts w:ascii="Times New Roman" w:cs="Times New Roman" w:eastAsia="Times New Roman" w:hAnsi="Times New Roman"/>
-          <w:b w:val="false"/>
-          <w:bCs w:val="false"/>
-          <w:i w:val="false"/>
-          <w:iCs w:val="false"/>
-          <w:color w:val="000000"/>
-          <w:sz w:val="24"/>
-          <w:szCs w:val="24"/>
-        </w:rPr>
-        <w:t xml:space="preserve">700 000 − 286 754 = 413 246.</w:t>
-      </w:r>
-    </w:p>
-    <w:p>
-      <w:pPr>
-        <w:spacing w:after="40" w:line="300"/>
-        <w:jc w:val="left"/>
-      </w:pPr>
-      <w:r>
-        <w:rPr>
-          <w:rFonts w:ascii="Times New Roman" w:cs="Times New Roman" w:eastAsia="Times New Roman" w:hAnsi="Times New Roman"/>
-          <w:b w:val="false"/>
-          <w:bCs w:val="false"/>
-          <w:i w:val="false"/>
-          <w:iCs w:val="false"/>
-          <w:color w:val="000000"/>
-          <w:sz w:val="24"/>
-          <w:szCs w:val="24"/>
-        </w:rPr>
-        <w:t xml:space="preserve">3.</w:t>
-      </w:r>
-    </w:p>
-    <w:p>
-      <w:pPr>
-        <w:spacing w:after="100" w:before="80"/>
-        <w:jc w:val="center"/>
-      </w:pPr>
-      <w:r>
-        <w:drawing>
-          <wp:inline distT="0" distB="0" distL="0" distR="0">
-            <wp:extent cx="4476750" cy="2533650"/>
-            <wp:effectExtent t="0" r="0" b="0" l="0"/>
-            <wp:docPr id="98" name=""/>
-            <wp:cNvGraphicFramePr>
-              <a:graphicFrameLocks xmlns:a="http://schemas.openxmlformats.org/drawingml/2006/main" noChangeAspect="1"/>
-            </wp:cNvGraphicFramePr>
-            <a:graphic xmlns:a="http://schemas.openxmlformats.org/drawingml/2006/main">
-              <a:graphicData uri="http://schemas.openxmlformats.org/drawingml/2006/picture">
-                <pic:pic xmlns:pic="http://schemas.openxmlformats.org/drawingml/2006/picture">
-                  <pic:nvPicPr>
-                    <pic:cNvPr id="0" name="" descr=""/>
-                    <pic:cNvPicPr>
-                      <a:picLocks noChangeAspect="1" noChangeArrowheads="1"/>
-                    </pic:cNvPicPr>
-                  </pic:nvPicPr>
-                  <pic:blipFill>
-                    <a:blip r:embed="rId102" cstate="none"/>
-                    <a:srcRect/>
-                    <a:stretch>
-                      <a:fillRect/>
-                    </a:stretch>
-                  </pic:blipFill>
-                  <pic:spPr bwMode="auto">
-                    <a:xfrm>
-                      <a:off x="0" y="0"/>
-                      <a:ext cx="4476750" cy="2533650"/>
-                    </a:xfrm>
-                    <a:prstGeom prst="rect">
-                      <a:avLst/>
-                    </a:prstGeom>
-                  </pic:spPr>
-                </pic:pic>
-              </a:graphicData>
-            </a:graphic>
-          </wp:inline>
-        </w:drawing>
-      </w:r>
-    </w:p>
-    <w:p>
-      <w:pPr>
-        <w:spacing w:after="60" w:line="300"/>
-        <w:ind w:left="360"/>
-        <w:jc w:val="left"/>
-      </w:pPr>
-      <w:r>
-        <w:rPr>
-          <w:rFonts w:ascii="Times New Roman" w:cs="Times New Roman" w:eastAsia="Times New Roman" w:hAnsi="Times New Roman"/>
-          <w:b w:val="false"/>
-          <w:bCs w:val="false"/>
-          <w:i w:val="false"/>
-          <w:iCs w:val="false"/>
-          <w:color w:val="000000"/>
-          <w:sz w:val="24"/>
-          <w:szCs w:val="24"/>
-        </w:rPr>
-        <w:t xml:space="preserve">Je calcule le produit des unités, puis celui des dizaines décalées.</w:t>
-      </w:r>
-    </w:p>
-    <w:p>
-      <w:pPr>
-        <w:spacing w:after="60" w:line="300"/>
-        <w:ind w:left="360"/>
-        <w:jc w:val="left"/>
-      </w:pPr>
-      <w:r>
-        <w:rPr>
-          <w:rFonts w:ascii="Times New Roman" w:cs="Times New Roman" w:eastAsia="Times New Roman" w:hAnsi="Times New Roman"/>
-          <w:b w:val="false"/>
-          <w:bCs w:val="false"/>
-          <w:i w:val="false"/>
-          <w:iCs w:val="false"/>
-          <w:color w:val="000000"/>
-          <w:sz w:val="24"/>
-          <w:szCs w:val="24"/>
-        </w:rPr>
-        <w:t xml:space="preserve">725 × 48 = 34 800.</w:t>
-      </w:r>
-    </w:p>
-    <w:p>
-      <w:pPr>
-        <w:spacing w:after="40" w:line="300"/>
-        <w:jc w:val="left"/>
-      </w:pPr>
-      <w:r>
-        <w:rPr>
-          <w:rFonts w:ascii="Times New Roman" w:cs="Times New Roman" w:eastAsia="Times New Roman" w:hAnsi="Times New Roman"/>
-          <w:b w:val="false"/>
-          <w:bCs w:val="false"/>
-          <w:i w:val="false"/>
-          <w:iCs w:val="false"/>
-          <w:color w:val="000000"/>
-          <w:sz w:val="24"/>
-          <w:szCs w:val="24"/>
-        </w:rPr>
-        <w:t xml:space="preserve">4.</w:t>
-      </w:r>
-    </w:p>
-    <w:p>
-      <w:pPr>
-        <w:spacing w:after="100" w:before="80"/>
-        <w:jc w:val="center"/>
-      </w:pPr>
-      <w:r>
-        <w:drawing>
-          <wp:inline distT="0" distB="0" distL="0" distR="0">
-            <wp:extent cx="4476750" cy="3048000"/>
-            <wp:effectExtent t="0" r="0" b="0" l="0"/>
-            <wp:docPr id="99" name=""/>
-            <wp:cNvGraphicFramePr>
-              <a:graphicFrameLocks xmlns:a="http://schemas.openxmlformats.org/drawingml/2006/main" noChangeAspect="1"/>
-            </wp:cNvGraphicFramePr>
-            <a:graphic xmlns:a="http://schemas.openxmlformats.org/drawingml/2006/main">
-              <a:graphicData uri="http://schemas.openxmlformats.org/drawingml/2006/picture">
-                <pic:pic xmlns:pic="http://schemas.openxmlformats.org/drawingml/2006/picture">
-                  <pic:nvPicPr>
-                    <pic:cNvPr id="0" name="" descr=""/>
-                    <pic:cNvPicPr>
-                      <a:picLocks noChangeAspect="1" noChangeArrowheads="1"/>
-                    </pic:cNvPicPr>
-                  </pic:nvPicPr>
-                  <pic:blipFill>
-                    <a:blip r:embed="rId103" cstate="none"/>
-                    <a:srcRect/>
-                    <a:stretch>
-                      <a:fillRect/>
-                    </a:stretch>
-                  </pic:blipFill>
-                  <pic:spPr bwMode="auto">
-                    <a:xfrm>
-                      <a:off x="0" y="0"/>
-                      <a:ext cx="4476750" cy="3048000"/>
-                    </a:xfrm>
-                    <a:prstGeom prst="rect">
-                      <a:avLst/>
-                    </a:prstGeom>
-                  </pic:spPr>
-                </pic:pic>
-              </a:graphicData>
-            </a:graphic>
-          </wp:inline>
-        </w:drawing>
-      </w:r>
-    </w:p>
-    <w:p>
-      <w:pPr>
-        <w:spacing w:after="60" w:line="300"/>
-        <w:ind w:left="360"/>
-        <w:jc w:val="left"/>
-      </w:pPr>
-      <w:r>
-        <w:rPr>
-          <w:rFonts w:ascii="Times New Roman" w:cs="Times New Roman" w:eastAsia="Times New Roman" w:hAnsi="Times New Roman"/>
-          <w:b w:val="false"/>
-          <w:bCs w:val="false"/>
-          <w:i w:val="false"/>
-          <w:iCs w:val="false"/>
-          <w:color w:val="000000"/>
-          <w:sz w:val="24"/>
-          <w:szCs w:val="24"/>
-        </w:rPr>
-        <w:t xml:space="preserve">Je pose la division : quotient 266, reste 21.</w:t>
-      </w:r>
-    </w:p>
-    <w:p>
-      <w:pPr>
-        <w:spacing w:after="60" w:line="300"/>
-        <w:ind w:left="360"/>
-        <w:jc w:val="left"/>
-      </w:pPr>
-      <w:r>
-        <w:rPr>
-          <w:rFonts w:ascii="Times New Roman" w:cs="Times New Roman" w:eastAsia="Times New Roman" w:hAnsi="Times New Roman"/>
-          <w:b w:val="false"/>
-          <w:bCs w:val="false"/>
-          <w:i w:val="false"/>
-          <w:iCs w:val="false"/>
-          <w:color w:val="000000"/>
-          <w:sz w:val="24"/>
-          <w:szCs w:val="24"/>
-        </w:rPr>
-        <w:t xml:space="preserve">9 876 = (37 × 266) + 21.</w:t>
-      </w:r>
-    </w:p>
-    <w:p>
-      <w:pPr>
-        <w:spacing w:after="40" w:line="300"/>
-        <w:jc w:val="left"/>
-      </w:pPr>
-      <w:r>
-        <w:rPr>
-          <w:rFonts w:ascii="Times New Roman" w:cs="Times New Roman" w:eastAsia="Times New Roman" w:hAnsi="Times New Roman"/>
-          <w:b w:val="false"/>
-          <w:bCs w:val="false"/>
-          <w:i w:val="false"/>
-          <w:iCs w:val="false"/>
-          <w:color w:val="000000"/>
-          <w:sz w:val="24"/>
-          <w:szCs w:val="24"/>
-        </w:rPr>
-        <w:t xml:space="preserve">5.</w:t>
-      </w:r>
-    </w:p>
-    <w:p>
-      <w:pPr>
-        <w:spacing w:after="100" w:before="80"/>
-        <w:jc w:val="center"/>
-      </w:pPr>
-      <w:r>
-        <w:drawing>
-          <wp:inline distT="0" distB="0" distL="0" distR="0">
-            <wp:extent cx="4476750" cy="1638300"/>
-            <wp:effectExtent t="0" r="0" b="0" l="0"/>
-            <wp:docPr id="100" name=""/>
-            <wp:cNvGraphicFramePr>
-              <a:graphicFrameLocks xmlns:a="http://schemas.openxmlformats.org/drawingml/2006/main" noChangeAspect="1"/>
-            </wp:cNvGraphicFramePr>
-            <a:graphic xmlns:a="http://schemas.openxmlformats.org/drawingml/2006/main">
-              <a:graphicData uri="http://schemas.openxmlformats.org/drawingml/2006/picture">
-                <pic:pic xmlns:pic="http://schemas.openxmlformats.org/drawingml/2006/picture">
-                  <pic:nvPicPr>
-                    <pic:cNvPr id="0" name="" descr=""/>
-                    <pic:cNvPicPr>
-                      <a:picLocks noChangeAspect="1" noChangeArrowheads="1"/>
-                    </pic:cNvPicPr>
-                  </pic:nvPicPr>
-                  <pic:blipFill>
-                    <a:blip r:embed="rId104" cstate="none"/>
-                    <a:srcRect/>
-                    <a:stretch>
-                      <a:fillRect/>
-                    </a:stretch>
-                  </pic:blipFill>
-                  <pic:spPr bwMode="auto">
-                    <a:xfrm>
-                      <a:off x="0" y="0"/>
                       <a:ext cx="4476750" cy="1638300"/>
                     </a:xfrm>
                     <a:prstGeom prst="rect">
@@ -15226,7 +15088,7 @@
           <w:sz w:val="24"/>
           <w:szCs w:val="24"/>
         </w:rPr>
-        <w:t xml:space="preserve">Nombre de sacs = 50 ÷ 2,5 = 20.</w:t>
+        <w:t xml:space="preserve">Deux droites perpendiculaires forment un angle droit.</w:t>
       </w:r>
     </w:p>
     <w:p>
@@ -15246,7 +15108,7 @@
           <w:sz w:val="24"/>
           <w:szCs w:val="24"/>
         </w:rPr>
-        <w:t xml:space="preserve">On obtient 20 sacs.</w:t>
+        <w:t xml:space="preserve">Je vérifie avec l’équerre.</w:t>
       </w:r>
     </w:p>
     <w:p>

</xml_diff>